<commit_message>
Potion system létrehozása és UI scale fixálása
</commit_message>
<xml_diff>
--- a/DarkWoodPlatformer_GDD.docx
+++ b/DarkWoodPlatformer_GDD.docx
@@ -556,7 +556,23 @@
           <w:sz w:val="24"/>
           <w:szCs w:val="24"/>
         </w:rPr>
-        <w:t>Harc: Kard (közelharc, 3 ütéses kombó földön és levegőben), íj (távolsági fegyver).</w:t>
+        <w:t>Harc: Kard (közelharc, 3 ütéses kombó földön és levegőben), íj (távolsági fegyver</w:t>
+      </w:r>
+      <w:r>
+        <w:rPr>
+          <w:rFonts w:ascii="Avenir Next LT Pro Light" w:hAnsi="Avenir Next LT Pro Light"/>
+          <w:sz w:val="24"/>
+          <w:szCs w:val="24"/>
+        </w:rPr>
+        <w:t xml:space="preserve"> és később kapjuk meg és korlátozott ammo van hozzá</w:t>
+      </w:r>
+      <w:r>
+        <w:rPr>
+          <w:rFonts w:ascii="Avenir Next LT Pro Light" w:hAnsi="Avenir Next LT Pro Light"/>
+          <w:sz w:val="24"/>
+          <w:szCs w:val="24"/>
+        </w:rPr>
+        <w:t>).</w:t>
       </w:r>
     </w:p>
     <w:p>
@@ -605,7 +621,23 @@
           <w:szCs w:val="24"/>
         </w:rPr>
         <w:lastRenderedPageBreak/>
-        <w:t>Checkpoint rendszer: Mentési pontok, ellenségek újraélednek aktiváláskor.</w:t>
+        <w:t>Checkpoint rendszer: Mentési pontok</w:t>
+      </w:r>
+      <w:r>
+        <w:rPr>
+          <w:rFonts w:ascii="Avenir Next LT Pro Light" w:hAnsi="Avenir Next LT Pro Light"/>
+          <w:sz w:val="24"/>
+          <w:szCs w:val="24"/>
+        </w:rPr>
+        <w:t>, teleportálása hub-ba</w:t>
+      </w:r>
+      <w:r>
+        <w:rPr>
+          <w:rFonts w:ascii="Avenir Next LT Pro Light" w:hAnsi="Avenir Next LT Pro Light"/>
+          <w:sz w:val="24"/>
+          <w:szCs w:val="24"/>
+        </w:rPr>
+        <w:t>.</w:t>
       </w:r>
     </w:p>
     <w:p>
@@ -819,18 +851,19 @@
     <w:tbl>
       <w:tblPr>
         <w:tblStyle w:val="Rcsostblzat"/>
-        <w:tblW w:w="0" w:type="auto"/>
+        <w:tblW w:w="9684" w:type="dxa"/>
+        <w:tblInd w:w="-518" w:type="dxa"/>
         <w:tblLook w:val="04A0" w:firstRow="1" w:lastRow="0" w:firstColumn="1" w:lastColumn="0" w:noHBand="0" w:noVBand="1"/>
       </w:tblPr>
       <w:tblGrid>
+        <w:gridCol w:w="3402"/>
         <w:gridCol w:w="2880"/>
-        <w:gridCol w:w="2880"/>
-        <w:gridCol w:w="2880"/>
+        <w:gridCol w:w="3402"/>
       </w:tblGrid>
       <w:tr>
         <w:tc>
           <w:tcPr>
-            <w:tcW w:w="2880" w:type="dxa"/>
+            <w:tcW w:w="3402" w:type="dxa"/>
           </w:tcPr>
           <w:p>
             <w:pPr>
@@ -882,7 +915,7 @@
         </w:tc>
         <w:tc>
           <w:tcPr>
-            <w:tcW w:w="2880" w:type="dxa"/>
+            <w:tcW w:w="3402" w:type="dxa"/>
           </w:tcPr>
           <w:p>
             <w:pPr>
@@ -910,7 +943,7 @@
       <w:tr>
         <w:tc>
           <w:tcPr>
-            <w:tcW w:w="2880" w:type="dxa"/>
+            <w:tcW w:w="3402" w:type="dxa"/>
           </w:tcPr>
           <w:p>
             <w:pPr>
@@ -954,7 +987,7 @@
         </w:tc>
         <w:tc>
           <w:tcPr>
-            <w:tcW w:w="2880" w:type="dxa"/>
+            <w:tcW w:w="3402" w:type="dxa"/>
           </w:tcPr>
           <w:p>
             <w:pPr>
@@ -978,7 +1011,7 @@
       <w:tr>
         <w:tc>
           <w:tcPr>
-            <w:tcW w:w="2880" w:type="dxa"/>
+            <w:tcW w:w="3402" w:type="dxa"/>
           </w:tcPr>
           <w:p>
             <w:pPr>
@@ -1022,7 +1055,7 @@
         </w:tc>
         <w:tc>
           <w:tcPr>
-            <w:tcW w:w="2880" w:type="dxa"/>
+            <w:tcW w:w="3402" w:type="dxa"/>
           </w:tcPr>
           <w:p>
             <w:pPr>
@@ -1046,7 +1079,7 @@
       <w:tr>
         <w:tc>
           <w:tcPr>
-            <w:tcW w:w="2880" w:type="dxa"/>
+            <w:tcW w:w="3402" w:type="dxa"/>
           </w:tcPr>
           <w:p>
             <w:pPr>
@@ -1063,6 +1096,14 @@
                 <w:szCs w:val="24"/>
               </w:rPr>
               <w:t>Potion ikon + darabszám</w:t>
+            </w:r>
+            <w:r>
+              <w:rPr>
+                <w:rFonts w:ascii="Avenir Next LT Pro Light" w:hAnsi="Avenir Next LT Pro Light"/>
+                <w:sz w:val="24"/>
+                <w:szCs w:val="24"/>
+              </w:rPr>
+              <w:t>, nyílvessző darabszám</w:t>
             </w:r>
           </w:p>
         </w:tc>
@@ -1090,7 +1131,7 @@
         </w:tc>
         <w:tc>
           <w:tcPr>
-            <w:tcW w:w="2880" w:type="dxa"/>
+            <w:tcW w:w="3402" w:type="dxa"/>
           </w:tcPr>
           <w:p>
             <w:pPr>
@@ -1107,6 +1148,14 @@
                 <w:szCs w:val="24"/>
               </w:rPr>
               <w:t>Használható potion mennyisége</w:t>
+            </w:r>
+            <w:r>
+              <w:rPr>
+                <w:rFonts w:ascii="Avenir Next LT Pro Light" w:hAnsi="Avenir Next LT Pro Light"/>
+                <w:sz w:val="24"/>
+                <w:szCs w:val="24"/>
+              </w:rPr>
+              <w:t>, kilőhető nyílvessző mennyisége</w:t>
             </w:r>
           </w:p>
         </w:tc>
@@ -1114,7 +1163,7 @@
       <w:tr>
         <w:tc>
           <w:tcPr>
-            <w:tcW w:w="2880" w:type="dxa"/>
+            <w:tcW w:w="3402" w:type="dxa"/>
           </w:tcPr>
           <w:p>
             <w:pPr>
@@ -1158,7 +1207,7 @@
         </w:tc>
         <w:tc>
           <w:tcPr>
-            <w:tcW w:w="2880" w:type="dxa"/>
+            <w:tcW w:w="3402" w:type="dxa"/>
           </w:tcPr>
           <w:p>
             <w:pPr>
@@ -1182,7 +1231,7 @@
       <w:tr>
         <w:tc>
           <w:tcPr>
-            <w:tcW w:w="2880" w:type="dxa"/>
+            <w:tcW w:w="3402" w:type="dxa"/>
           </w:tcPr>
           <w:p>
             <w:pPr>
@@ -1226,7 +1275,7 @@
         </w:tc>
         <w:tc>
           <w:tcPr>
-            <w:tcW w:w="2880" w:type="dxa"/>
+            <w:tcW w:w="3402" w:type="dxa"/>
           </w:tcPr>
           <w:p>
             <w:pPr>
@@ -1895,28 +1944,109 @@
         <w:rPr>
           <w:rFonts w:ascii="Avenir Next LT Pro Light" w:hAnsi="Avenir Next LT Pro Light"/>
         </w:rPr>
-        <w:t>7. Mérföldkövek</w:t>
+        <w:t xml:space="preserve">7. </w:t>
+      </w:r>
+      <w:r>
+        <w:rPr>
+          <w:rFonts w:ascii="Avenir Next LT Pro Light" w:hAnsi="Avenir Next LT Pro Light"/>
+        </w:rPr>
+        <w:t xml:space="preserve"> Jelenlegi hibák</w:t>
+      </w:r>
+    </w:p>
+    <w:p>
+      <w:pPr>
+        <w:pStyle w:val="Listaszerbekezds"/>
+        <w:numPr>
+          <w:ilvl w:val="0"/>
+          <w:numId w:val="14"/>
+        </w:numPr>
+      </w:pPr>
+      <w:r>
+        <w:rPr>
+          <w:rFonts w:ascii="Avenir Next LT Pro Light" w:hAnsi="Avenir Next LT Pro Light"/>
+          <w:sz w:val="24"/>
+          <w:szCs w:val="24"/>
+        </w:rPr>
+        <w:t>nyíl nem akad el a falban, hanem átmegy rajta</w:t>
+      </w:r>
+    </w:p>
+    <w:p>
+      <w:pPr>
+        <w:pStyle w:val="Listaszerbekezds"/>
+        <w:numPr>
+          <w:ilvl w:val="0"/>
+          <w:numId w:val="14"/>
+        </w:numPr>
+      </w:pPr>
+      <w:r>
+        <w:rPr>
+          <w:rFonts w:ascii="Avenir Next LT Pro Light" w:hAnsi="Avenir Next LT Pro Light"/>
+          <w:sz w:val="24"/>
+          <w:szCs w:val="24"/>
+        </w:rPr>
+        <w:t>slide közben nem sérthetetlen a karakter</w:t>
+      </w:r>
+    </w:p>
+    <w:p>
+      <w:pPr>
+        <w:pStyle w:val="Listaszerbekezds"/>
+        <w:numPr>
+          <w:ilvl w:val="0"/>
+          <w:numId w:val="14"/>
+        </w:numPr>
+      </w:pPr>
+      <w:r>
+        <w:rPr>
+          <w:rFonts w:ascii="Avenir Next LT Pro Light" w:hAnsi="Avenir Next LT Pro Light"/>
+          <w:sz w:val="24"/>
+          <w:szCs w:val="24"/>
+        </w:rPr>
+        <w:t>ha mentésből betöltjük a játékot akkor a a meghalt enemyk is maradjanak halottak</w:t>
+      </w:r>
+    </w:p>
+    <w:p>
+      <w:pPr>
+        <w:pStyle w:val="Cmsor1"/>
+        <w:rPr>
+          <w:rFonts w:ascii="Avenir Next LT Pro Light" w:hAnsi="Avenir Next LT Pro Light"/>
+        </w:rPr>
+      </w:pPr>
+      <w:r>
+        <w:rPr>
+          <w:rFonts w:ascii="Avenir Next LT Pro Light" w:hAnsi="Avenir Next LT Pro Light"/>
+        </w:rPr>
+        <w:t>8</w:t>
+      </w:r>
+      <w:r>
+        <w:rPr>
+          <w:rFonts w:ascii="Avenir Next LT Pro Light" w:hAnsi="Avenir Next LT Pro Light"/>
+        </w:rPr>
+        <w:t>. Mérföldkövek</w:t>
       </w:r>
     </w:p>
     <w:tbl>
       <w:tblPr>
         <w:tblStyle w:val="Rcsostblzat"/>
-        <w:tblW w:w="0" w:type="auto"/>
+        <w:tblW w:w="9418" w:type="dxa"/>
         <w:tblLook w:val="04A0" w:firstRow="1" w:lastRow="0" w:firstColumn="1" w:lastColumn="0" w:noHBand="0" w:noVBand="1"/>
       </w:tblPr>
       <w:tblGrid>
-        <w:gridCol w:w="2160"/>
-        <w:gridCol w:w="2160"/>
-        <w:gridCol w:w="2160"/>
-        <w:gridCol w:w="2160"/>
+        <w:gridCol w:w="888"/>
+        <w:gridCol w:w="4980"/>
+        <w:gridCol w:w="1843"/>
+        <w:gridCol w:w="1707"/>
       </w:tblGrid>
       <w:tr>
+        <w:trPr>
+          <w:trHeight w:val="286"/>
+        </w:trPr>
         <w:tc>
           <w:tcPr>
-            <w:tcW w:w="2160" w:type="dxa"/>
+            <w:tcW w:w="888" w:type="dxa"/>
           </w:tcPr>
           <w:p>
             <w:pPr>
+              <w:ind w:left="360" w:hanging="360"/>
               <w:rPr>
                 <w:rFonts w:ascii="Avenir Next LT Pro Light" w:hAnsi="Avenir Next LT Pro Light"/>
                 <w:b/>
@@ -1939,7 +2069,7 @@
         </w:tc>
         <w:tc>
           <w:tcPr>
-            <w:tcW w:w="2160" w:type="dxa"/>
+            <w:tcW w:w="4980" w:type="dxa"/>
           </w:tcPr>
           <w:p>
             <w:pPr>
@@ -1965,7 +2095,7 @@
         </w:tc>
         <w:tc>
           <w:tcPr>
-            <w:tcW w:w="2160" w:type="dxa"/>
+            <w:tcW w:w="1843" w:type="dxa"/>
           </w:tcPr>
           <w:p>
             <w:pPr>
@@ -1985,13 +2115,13 @@
                 <w:sz w:val="24"/>
                 <w:szCs w:val="24"/>
               </w:rPr>
-              <w:t>Prioritás</w:t>
+              <w:t>Időbecslés</w:t>
             </w:r>
           </w:p>
         </w:tc>
         <w:tc>
           <w:tcPr>
-            <w:tcW w:w="2160" w:type="dxa"/>
+            <w:tcW w:w="1707" w:type="dxa"/>
           </w:tcPr>
           <w:p>
             <w:pPr>
@@ -2011,18 +2141,27 @@
                 <w:sz w:val="24"/>
                 <w:szCs w:val="24"/>
               </w:rPr>
-              <w:t>Időbecslés</w:t>
+              <w:t>Befejezett</w:t>
             </w:r>
           </w:p>
         </w:tc>
       </w:tr>
       <w:tr>
+        <w:trPr>
+          <w:trHeight w:val="286"/>
+        </w:trPr>
         <w:tc>
           <w:tcPr>
-            <w:tcW w:w="2160" w:type="dxa"/>
+            <w:tcW w:w="888" w:type="dxa"/>
           </w:tcPr>
           <w:p>
             <w:pPr>
+              <w:pStyle w:val="Listaszerbekezds"/>
+              <w:numPr>
+                <w:ilvl w:val="0"/>
+                <w:numId w:val="13"/>
+              </w:numPr>
+              <w:ind w:left="360"/>
               <w:rPr>
                 <w:rFonts w:ascii="Avenir Next LT Pro Light" w:hAnsi="Avenir Next LT Pro Light"/>
                 <w:b/>
@@ -2031,21 +2170,33 @@
                 <w:szCs w:val="24"/>
               </w:rPr>
             </w:pPr>
+          </w:p>
+        </w:tc>
+        <w:tc>
+          <w:tcPr>
+            <w:tcW w:w="4980" w:type="dxa"/>
+          </w:tcPr>
+          <w:p>
+            <w:pPr>
+              <w:rPr>
+                <w:rFonts w:ascii="Avenir Next LT Pro Light" w:hAnsi="Avenir Next LT Pro Light"/>
+                <w:sz w:val="24"/>
+                <w:szCs w:val="24"/>
+              </w:rPr>
+            </w:pPr>
             <w:r>
               <w:rPr>
                 <w:rFonts w:ascii="Avenir Next LT Pro Light" w:hAnsi="Avenir Next LT Pro Light"/>
-                <w:b/>
-                <w:bCs/>
-                <w:sz w:val="24"/>
-                <w:szCs w:val="24"/>
-              </w:rPr>
-              <w:t>1</w:t>
+                <w:sz w:val="24"/>
+                <w:szCs w:val="24"/>
+              </w:rPr>
+              <w:t>Hibajavítások</w:t>
             </w:r>
           </w:p>
         </w:tc>
         <w:tc>
           <w:tcPr>
-            <w:tcW w:w="2160" w:type="dxa"/>
+            <w:tcW w:w="1843" w:type="dxa"/>
           </w:tcPr>
           <w:p>
             <w:pPr>
@@ -2061,16 +2212,58 @@
                 <w:sz w:val="24"/>
                 <w:szCs w:val="24"/>
               </w:rPr>
-              <w:t>Hibajavítások (nyíl, slide invincible)</w:t>
+              <w:t>1-2 nap</w:t>
             </w:r>
           </w:p>
         </w:tc>
         <w:tc>
           <w:tcPr>
-            <w:tcW w:w="2160" w:type="dxa"/>
+            <w:tcW w:w="1707" w:type="dxa"/>
           </w:tcPr>
           <w:p>
             <w:pPr>
+              <w:jc w:val="center"/>
+              <w:rPr>
+                <w:rFonts w:ascii="Avenir Next LT Pro Light" w:hAnsi="Avenir Next LT Pro Light"/>
+                <w:sz w:val="24"/>
+                <w:szCs w:val="24"/>
+              </w:rPr>
+            </w:pPr>
+          </w:p>
+        </w:tc>
+      </w:tr>
+      <w:tr>
+        <w:trPr>
+          <w:trHeight w:val="316"/>
+        </w:trPr>
+        <w:tc>
+          <w:tcPr>
+            <w:tcW w:w="888" w:type="dxa"/>
+          </w:tcPr>
+          <w:p>
+            <w:pPr>
+              <w:pStyle w:val="Listaszerbekezds"/>
+              <w:numPr>
+                <w:ilvl w:val="0"/>
+                <w:numId w:val="13"/>
+              </w:numPr>
+              <w:ind w:left="360"/>
+              <w:rPr>
+                <w:rFonts w:ascii="Avenir Next LT Pro Light" w:hAnsi="Avenir Next LT Pro Light"/>
+                <w:b/>
+                <w:bCs/>
+                <w:sz w:val="24"/>
+                <w:szCs w:val="24"/>
+              </w:rPr>
+            </w:pPr>
+          </w:p>
+        </w:tc>
+        <w:tc>
+          <w:tcPr>
+            <w:tcW w:w="4980" w:type="dxa"/>
+          </w:tcPr>
+          <w:p>
+            <w:pPr>
               <w:rPr>
                 <w:rFonts w:ascii="Avenir Next LT Pro Light" w:hAnsi="Avenir Next LT Pro Light"/>
                 <w:sz w:val="24"/>
@@ -2083,13 +2276,13 @@
                 <w:sz w:val="24"/>
                 <w:szCs w:val="24"/>
               </w:rPr>
-              <w:t>Magas</w:t>
+              <w:t xml:space="preserve">Checkpoint </w:t>
             </w:r>
           </w:p>
         </w:tc>
         <w:tc>
           <w:tcPr>
-            <w:tcW w:w="2160" w:type="dxa"/>
+            <w:tcW w:w="1843" w:type="dxa"/>
           </w:tcPr>
           <w:p>
             <w:pPr>
@@ -2105,18 +2298,58 @@
                 <w:sz w:val="24"/>
                 <w:szCs w:val="24"/>
               </w:rPr>
-              <w:t>1-2 nap</w:t>
+              <w:t>1</w:t>
+            </w:r>
+            <w:r>
+              <w:rPr>
+                <w:rFonts w:ascii="Avenir Next LT Pro Light" w:hAnsi="Avenir Next LT Pro Light"/>
+                <w:sz w:val="24"/>
+                <w:szCs w:val="24"/>
+              </w:rPr>
+              <w:t xml:space="preserve"> nap</w:t>
+            </w:r>
+          </w:p>
+        </w:tc>
+        <w:tc>
+          <w:tcPr>
+            <w:tcW w:w="1707" w:type="dxa"/>
+          </w:tcPr>
+          <w:p>
+            <w:pPr>
+              <w:jc w:val="center"/>
+              <w:rPr>
+                <w:rFonts w:ascii="Avenir Next LT Pro Light" w:hAnsi="Avenir Next LT Pro Light"/>
+                <w:sz w:val="24"/>
+                <w:szCs w:val="24"/>
+              </w:rPr>
+            </w:pPr>
+            <w:r>
+              <w:rPr>
+                <w:rFonts w:ascii="Segoe UI Emoji" w:hAnsi="Segoe UI Emoji" w:cs="Segoe UI Emoji"/>
+                <w:sz w:val="24"/>
+                <w:szCs w:val="24"/>
+              </w:rPr>
+              <w:t>✅</w:t>
             </w:r>
           </w:p>
         </w:tc>
       </w:tr>
       <w:tr>
+        <w:trPr>
+          <w:trHeight w:val="316"/>
+        </w:trPr>
         <w:tc>
           <w:tcPr>
-            <w:tcW w:w="2160" w:type="dxa"/>
+            <w:tcW w:w="888" w:type="dxa"/>
           </w:tcPr>
           <w:p>
             <w:pPr>
+              <w:pStyle w:val="Listaszerbekezds"/>
+              <w:numPr>
+                <w:ilvl w:val="0"/>
+                <w:numId w:val="13"/>
+              </w:numPr>
+              <w:ind w:left="360"/>
               <w:rPr>
                 <w:rFonts w:ascii="Avenir Next LT Pro Light" w:hAnsi="Avenir Next LT Pro Light"/>
                 <w:b/>
@@ -2125,21 +2358,33 @@
                 <w:szCs w:val="24"/>
               </w:rPr>
             </w:pPr>
+          </w:p>
+        </w:tc>
+        <w:tc>
+          <w:tcPr>
+            <w:tcW w:w="4980" w:type="dxa"/>
+          </w:tcPr>
+          <w:p>
+            <w:pPr>
+              <w:rPr>
+                <w:rFonts w:ascii="Avenir Next LT Pro Light" w:hAnsi="Avenir Next LT Pro Light"/>
+                <w:sz w:val="24"/>
+                <w:szCs w:val="24"/>
+              </w:rPr>
+            </w:pPr>
             <w:r>
               <w:rPr>
                 <w:rFonts w:ascii="Avenir Next LT Pro Light" w:hAnsi="Avenir Next LT Pro Light"/>
-                <w:b/>
-                <w:bCs/>
-                <w:sz w:val="24"/>
-                <w:szCs w:val="24"/>
-              </w:rPr>
-              <w:t>2</w:t>
+                <w:sz w:val="24"/>
+                <w:szCs w:val="24"/>
+              </w:rPr>
+              <w:t>Mentés/betöltés</w:t>
             </w:r>
           </w:p>
         </w:tc>
         <w:tc>
           <w:tcPr>
-            <w:tcW w:w="2160" w:type="dxa"/>
+            <w:tcW w:w="1843" w:type="dxa"/>
           </w:tcPr>
           <w:p>
             <w:pPr>
@@ -2155,16 +2400,25 @@
                 <w:sz w:val="24"/>
                 <w:szCs w:val="24"/>
               </w:rPr>
-              <w:t>Checkpoint + enemy respawn</w:t>
+              <w:t xml:space="preserve">1 </w:t>
+            </w:r>
+            <w:r>
+              <w:rPr>
+                <w:rFonts w:ascii="Avenir Next LT Pro Light" w:hAnsi="Avenir Next LT Pro Light"/>
+                <w:sz w:val="24"/>
+                <w:szCs w:val="24"/>
+              </w:rPr>
+              <w:t>nap</w:t>
             </w:r>
           </w:p>
         </w:tc>
         <w:tc>
           <w:tcPr>
-            <w:tcW w:w="2160" w:type="dxa"/>
+            <w:tcW w:w="1707" w:type="dxa"/>
           </w:tcPr>
           <w:p>
             <w:pPr>
+              <w:jc w:val="center"/>
               <w:rPr>
                 <w:rFonts w:ascii="Avenir Next LT Pro Light" w:hAnsi="Avenir Next LT Pro Light"/>
                 <w:sz w:val="24"/>
@@ -2173,17 +2427,74 @@
             </w:pPr>
             <w:r>
               <w:rPr>
-                <w:rFonts w:ascii="Avenir Next LT Pro Light" w:hAnsi="Avenir Next LT Pro Light"/>
-                <w:sz w:val="24"/>
-                <w:szCs w:val="24"/>
-              </w:rPr>
-              <w:t>Magas</w:t>
+                <w:rFonts w:ascii="Segoe UI Emoji" w:hAnsi="Segoe UI Emoji" w:cs="Segoe UI Emoji"/>
+                <w:sz w:val="24"/>
+                <w:szCs w:val="24"/>
+              </w:rPr>
+              <w:t>✅</w:t>
+            </w:r>
+          </w:p>
+        </w:tc>
+      </w:tr>
+      <w:tr>
+        <w:trPr>
+          <w:trHeight w:val="286"/>
+        </w:trPr>
+        <w:tc>
+          <w:tcPr>
+            <w:tcW w:w="888" w:type="dxa"/>
+          </w:tcPr>
+          <w:p>
+            <w:pPr>
+              <w:pStyle w:val="Listaszerbekezds"/>
+              <w:numPr>
+                <w:ilvl w:val="0"/>
+                <w:numId w:val="13"/>
+              </w:numPr>
+              <w:ind w:left="360"/>
+              <w:rPr>
+                <w:rFonts w:ascii="Avenir Next LT Pro Light" w:hAnsi="Avenir Next LT Pro Light"/>
+                <w:b/>
+                <w:bCs/>
+                <w:sz w:val="24"/>
+                <w:szCs w:val="24"/>
+              </w:rPr>
+            </w:pPr>
+          </w:p>
+        </w:tc>
+        <w:tc>
+          <w:tcPr>
+            <w:tcW w:w="4980" w:type="dxa"/>
+          </w:tcPr>
+          <w:p>
+            <w:pPr>
+              <w:rPr>
+                <w:rFonts w:ascii="Avenir Next LT Pro Light" w:hAnsi="Avenir Next LT Pro Light"/>
+                <w:sz w:val="24"/>
+                <w:szCs w:val="24"/>
+              </w:rPr>
+            </w:pPr>
+            <w:r>
+              <w:rPr>
+                <w:rFonts w:ascii="Avenir Next LT Pro Light" w:hAnsi="Avenir Next LT Pro Light"/>
+                <w:sz w:val="24"/>
+                <w:szCs w:val="24"/>
+              </w:rPr>
+              <w:t>Potion mechanika</w:t>
+            </w:r>
+            <w:r>
+              <w:rPr>
+                <w:rFonts w:ascii="Avenir Next LT Pro Light" w:hAnsi="Avenir Next LT Pro Light"/>
+                <w:sz w:val="24"/>
+                <w:szCs w:val="24"/>
+              </w:rPr>
+              <w:t xml:space="preserve"> +UI</w:t>
             </w:r>
           </w:p>
         </w:tc>
         <w:tc>
           <w:tcPr>
-            <w:tcW w:w="2160" w:type="dxa"/>
+            <w:tcW w:w="1843" w:type="dxa"/>
           </w:tcPr>
           <w:p>
             <w:pPr>
@@ -2199,44 +2510,66 @@
                 <w:sz w:val="24"/>
                 <w:szCs w:val="24"/>
               </w:rPr>
-              <w:t>2-3 nap</w:t>
+              <w:t>1-2</w:t>
             </w:r>
-          </w:p>
-        </w:tc>
-      </w:tr>
-      <w:tr>
-        <w:tc>
-          <w:tcPr>
-            <w:tcW w:w="2160" w:type="dxa"/>
-          </w:tcPr>
-          <w:p>
-            <w:pPr>
-              <w:rPr>
-                <w:rFonts w:ascii="Avenir Next LT Pro Light" w:hAnsi="Avenir Next LT Pro Light"/>
-                <w:b/>
-                <w:bCs/>
-                <w:sz w:val="24"/>
-                <w:szCs w:val="24"/>
-              </w:rPr>
-            </w:pPr>
             <w:r>
               <w:rPr>
                 <w:rFonts w:ascii="Avenir Next LT Pro Light" w:hAnsi="Avenir Next LT Pro Light"/>
-                <w:b/>
-                <w:bCs/>
-                <w:sz w:val="24"/>
-                <w:szCs w:val="24"/>
-              </w:rPr>
-              <w:t>3</w:t>
+                <w:sz w:val="24"/>
+                <w:szCs w:val="24"/>
+              </w:rPr>
+              <w:t xml:space="preserve"> nap</w:t>
             </w:r>
           </w:p>
         </w:tc>
         <w:tc>
           <w:tcPr>
-            <w:tcW w:w="2160" w:type="dxa"/>
+            <w:tcW w:w="1707" w:type="dxa"/>
           </w:tcPr>
           <w:p>
             <w:pPr>
+              <w:jc w:val="center"/>
+              <w:rPr>
+                <w:rFonts w:ascii="Avenir Next LT Pro Light" w:hAnsi="Avenir Next LT Pro Light"/>
+                <w:sz w:val="24"/>
+                <w:szCs w:val="24"/>
+              </w:rPr>
+            </w:pPr>
+          </w:p>
+        </w:tc>
+      </w:tr>
+      <w:tr>
+        <w:trPr>
+          <w:trHeight w:val="286"/>
+        </w:trPr>
+        <w:tc>
+          <w:tcPr>
+            <w:tcW w:w="888" w:type="dxa"/>
+          </w:tcPr>
+          <w:p>
+            <w:pPr>
+              <w:pStyle w:val="Listaszerbekezds"/>
+              <w:numPr>
+                <w:ilvl w:val="0"/>
+                <w:numId w:val="13"/>
+              </w:numPr>
+              <w:ind w:left="360"/>
+              <w:rPr>
+                <w:rFonts w:ascii="Avenir Next LT Pro Light" w:hAnsi="Avenir Next LT Pro Light"/>
+                <w:b/>
+                <w:bCs/>
+                <w:sz w:val="24"/>
+                <w:szCs w:val="24"/>
+              </w:rPr>
+            </w:pPr>
+          </w:p>
+        </w:tc>
+        <w:tc>
+          <w:tcPr>
+            <w:tcW w:w="4980" w:type="dxa"/>
+          </w:tcPr>
+          <w:p>
+            <w:pPr>
               <w:rPr>
                 <w:rFonts w:ascii="Avenir Next LT Pro Light" w:hAnsi="Avenir Next LT Pro Light"/>
                 <w:sz w:val="24"/>
@@ -2249,13 +2582,13 @@
                 <w:sz w:val="24"/>
                 <w:szCs w:val="24"/>
               </w:rPr>
-              <w:t>Mentés / betöltés</w:t>
+              <w:t>Nyíl mennyiség + UI</w:t>
             </w:r>
           </w:p>
         </w:tc>
         <w:tc>
           <w:tcPr>
-            <w:tcW w:w="2160" w:type="dxa"/>
+            <w:tcW w:w="1843" w:type="dxa"/>
           </w:tcPr>
           <w:p>
             <w:pPr>
@@ -2271,40 +2604,42 @@
                 <w:sz w:val="24"/>
                 <w:szCs w:val="24"/>
               </w:rPr>
-              <w:t>Magas</w:t>
+              <w:t>1-2 nap</w:t>
             </w:r>
           </w:p>
         </w:tc>
         <w:tc>
           <w:tcPr>
-            <w:tcW w:w="2160" w:type="dxa"/>
+            <w:tcW w:w="1707" w:type="dxa"/>
           </w:tcPr>
           <w:p>
             <w:pPr>
+              <w:jc w:val="center"/>
               <w:rPr>
                 <w:rFonts w:ascii="Avenir Next LT Pro Light" w:hAnsi="Avenir Next LT Pro Light"/>
                 <w:sz w:val="24"/>
                 <w:szCs w:val="24"/>
               </w:rPr>
             </w:pPr>
-            <w:r>
-              <w:rPr>
-                <w:rFonts w:ascii="Avenir Next LT Pro Light" w:hAnsi="Avenir Next LT Pro Light"/>
-                <w:sz w:val="24"/>
-                <w:szCs w:val="24"/>
-              </w:rPr>
-              <w:t>3-4 nap</w:t>
-            </w:r>
           </w:p>
         </w:tc>
       </w:tr>
       <w:tr>
+        <w:trPr>
+          <w:trHeight w:val="286"/>
+        </w:trPr>
         <w:tc>
           <w:tcPr>
-            <w:tcW w:w="2160" w:type="dxa"/>
+            <w:tcW w:w="888" w:type="dxa"/>
           </w:tcPr>
           <w:p>
             <w:pPr>
+              <w:pStyle w:val="Listaszerbekezds"/>
+              <w:numPr>
+                <w:ilvl w:val="0"/>
+                <w:numId w:val="13"/>
+              </w:numPr>
+              <w:ind w:left="360"/>
               <w:rPr>
                 <w:rFonts w:ascii="Avenir Next LT Pro Light" w:hAnsi="Avenir Next LT Pro Light"/>
                 <w:b/>
@@ -2313,21 +2648,49 @@
                 <w:szCs w:val="24"/>
               </w:rPr>
             </w:pPr>
+          </w:p>
+        </w:tc>
+        <w:tc>
+          <w:tcPr>
+            <w:tcW w:w="4980" w:type="dxa"/>
+          </w:tcPr>
+          <w:p>
+            <w:pPr>
+              <w:rPr>
+                <w:rFonts w:ascii="Avenir Next LT Pro Light" w:hAnsi="Avenir Next LT Pro Light"/>
+                <w:sz w:val="24"/>
+                <w:szCs w:val="24"/>
+              </w:rPr>
+            </w:pPr>
             <w:r>
               <w:rPr>
                 <w:rFonts w:ascii="Avenir Next LT Pro Light" w:hAnsi="Avenir Next LT Pro Light"/>
-                <w:b/>
-                <w:bCs/>
-                <w:sz w:val="24"/>
-                <w:szCs w:val="24"/>
-              </w:rPr>
-              <w:t>4</w:t>
+                <w:sz w:val="24"/>
+                <w:szCs w:val="24"/>
+              </w:rPr>
+              <w:t>Pályaépítés (</w:t>
+            </w:r>
+            <w:r>
+              <w:rPr>
+                <w:rFonts w:ascii="Avenir Next LT Pro Light" w:hAnsi="Avenir Next LT Pro Light"/>
+                <w:sz w:val="24"/>
+                <w:szCs w:val="24"/>
+              </w:rPr>
+              <w:t>Kezdő, Börtön</w:t>
+            </w:r>
+            <w:r>
+              <w:rPr>
+                <w:rFonts w:ascii="Avenir Next LT Pro Light" w:hAnsi="Avenir Next LT Pro Light"/>
+                <w:sz w:val="24"/>
+                <w:szCs w:val="24"/>
+              </w:rPr>
+              <w:t>)</w:t>
             </w:r>
           </w:p>
         </w:tc>
         <w:tc>
           <w:tcPr>
-            <w:tcW w:w="2160" w:type="dxa"/>
+            <w:tcW w:w="1843" w:type="dxa"/>
           </w:tcPr>
           <w:p>
             <w:pPr>
@@ -2343,179 +2706,55 @@
                 <w:sz w:val="24"/>
                 <w:szCs w:val="24"/>
               </w:rPr>
-              <w:t>UI alapok</w:t>
+              <w:t>4-5 nap</w:t>
             </w:r>
           </w:p>
         </w:tc>
         <w:tc>
           <w:tcPr>
-            <w:tcW w:w="2160" w:type="dxa"/>
+            <w:tcW w:w="1707" w:type="dxa"/>
           </w:tcPr>
           <w:p>
             <w:pPr>
+              <w:jc w:val="center"/>
               <w:rPr>
                 <w:rFonts w:ascii="Avenir Next LT Pro Light" w:hAnsi="Avenir Next LT Pro Light"/>
                 <w:sz w:val="24"/>
                 <w:szCs w:val="24"/>
               </w:rPr>
             </w:pPr>
-            <w:r>
-              <w:rPr>
-                <w:rFonts w:ascii="Avenir Next LT Pro Light" w:hAnsi="Avenir Next LT Pro Light"/>
-                <w:sz w:val="24"/>
-                <w:szCs w:val="24"/>
-              </w:rPr>
-              <w:t>Magas</w:t>
-            </w:r>
+          </w:p>
+        </w:tc>
+      </w:tr>
+      <w:tr>
+        <w:trPr>
+          <w:trHeight w:val="286"/>
+        </w:trPr>
+        <w:tc>
+          <w:tcPr>
+            <w:tcW w:w="888" w:type="dxa"/>
+          </w:tcPr>
+          <w:p>
+            <w:pPr>
+              <w:pStyle w:val="Listaszerbekezds"/>
+              <w:numPr>
+                <w:ilvl w:val="0"/>
+                <w:numId w:val="13"/>
+              </w:numPr>
+              <w:ind w:left="360"/>
+              <w:rPr>
+                <w:rFonts w:ascii="Avenir Next LT Pro Light" w:hAnsi="Avenir Next LT Pro Light"/>
+                <w:b/>
+                <w:bCs/>
+                <w:sz w:val="24"/>
+                <w:szCs w:val="24"/>
+              </w:rPr>
+            </w:pPr>
           </w:p>
         </w:tc>
         <w:tc>
           <w:tcPr>
-            <w:tcW w:w="2160" w:type="dxa"/>
-          </w:tcPr>
-          <w:p>
-            <w:pPr>
-              <w:rPr>
-                <w:rFonts w:ascii="Avenir Next LT Pro Light" w:hAnsi="Avenir Next LT Pro Light"/>
-                <w:sz w:val="24"/>
-                <w:szCs w:val="24"/>
-              </w:rPr>
-            </w:pPr>
-            <w:r>
-              <w:rPr>
-                <w:rFonts w:ascii="Avenir Next LT Pro Light" w:hAnsi="Avenir Next LT Pro Light"/>
-                <w:sz w:val="24"/>
-                <w:szCs w:val="24"/>
-              </w:rPr>
-              <w:t>2 nap</w:t>
-            </w:r>
-          </w:p>
-        </w:tc>
-      </w:tr>
-      <w:tr>
-        <w:tc>
-          <w:tcPr>
-            <w:tcW w:w="2160" w:type="dxa"/>
-          </w:tcPr>
-          <w:p>
-            <w:pPr>
-              <w:rPr>
-                <w:rFonts w:ascii="Avenir Next LT Pro Light" w:hAnsi="Avenir Next LT Pro Light"/>
-                <w:b/>
-                <w:bCs/>
-                <w:sz w:val="24"/>
-                <w:szCs w:val="24"/>
-              </w:rPr>
-            </w:pPr>
-            <w:r>
-              <w:rPr>
-                <w:rFonts w:ascii="Avenir Next LT Pro Light" w:hAnsi="Avenir Next LT Pro Light"/>
-                <w:b/>
-                <w:bCs/>
-                <w:sz w:val="24"/>
-                <w:szCs w:val="24"/>
-              </w:rPr>
-              <w:t>5</w:t>
-            </w:r>
-          </w:p>
-        </w:tc>
-        <w:tc>
-          <w:tcPr>
-            <w:tcW w:w="2160" w:type="dxa"/>
-          </w:tcPr>
-          <w:p>
-            <w:pPr>
-              <w:rPr>
-                <w:rFonts w:ascii="Avenir Next LT Pro Light" w:hAnsi="Avenir Next LT Pro Light"/>
-                <w:sz w:val="24"/>
-                <w:szCs w:val="24"/>
-              </w:rPr>
-            </w:pPr>
-            <w:r>
-              <w:rPr>
-                <w:rFonts w:ascii="Avenir Next LT Pro Light" w:hAnsi="Avenir Next LT Pro Light"/>
-                <w:sz w:val="24"/>
-                <w:szCs w:val="24"/>
-              </w:rPr>
-              <w:t>Potion mechanika</w:t>
-            </w:r>
-          </w:p>
-        </w:tc>
-        <w:tc>
-          <w:tcPr>
-            <w:tcW w:w="2160" w:type="dxa"/>
-          </w:tcPr>
-          <w:p>
-            <w:pPr>
-              <w:rPr>
-                <w:rFonts w:ascii="Avenir Next LT Pro Light" w:hAnsi="Avenir Next LT Pro Light"/>
-                <w:sz w:val="24"/>
-                <w:szCs w:val="24"/>
-              </w:rPr>
-            </w:pPr>
-            <w:r>
-              <w:rPr>
-                <w:rFonts w:ascii="Avenir Next LT Pro Light" w:hAnsi="Avenir Next LT Pro Light"/>
-                <w:sz w:val="24"/>
-                <w:szCs w:val="24"/>
-              </w:rPr>
-              <w:t>Magas</w:t>
-            </w:r>
-          </w:p>
-        </w:tc>
-        <w:tc>
-          <w:tcPr>
-            <w:tcW w:w="2160" w:type="dxa"/>
-          </w:tcPr>
-          <w:p>
-            <w:pPr>
-              <w:rPr>
-                <w:rFonts w:ascii="Avenir Next LT Pro Light" w:hAnsi="Avenir Next LT Pro Light"/>
-                <w:sz w:val="24"/>
-                <w:szCs w:val="24"/>
-              </w:rPr>
-            </w:pPr>
-            <w:r>
-              <w:rPr>
-                <w:rFonts w:ascii="Avenir Next LT Pro Light" w:hAnsi="Avenir Next LT Pro Light"/>
-                <w:sz w:val="24"/>
-                <w:szCs w:val="24"/>
-              </w:rPr>
-              <w:t>2 nap</w:t>
-            </w:r>
-          </w:p>
-        </w:tc>
-      </w:tr>
-      <w:tr>
-        <w:tc>
-          <w:tcPr>
-            <w:tcW w:w="2160" w:type="dxa"/>
-          </w:tcPr>
-          <w:p>
-            <w:pPr>
-              <w:rPr>
-                <w:rFonts w:ascii="Avenir Next LT Pro Light" w:hAnsi="Avenir Next LT Pro Light"/>
-                <w:b/>
-                <w:bCs/>
-                <w:sz w:val="24"/>
-                <w:szCs w:val="24"/>
-              </w:rPr>
-            </w:pPr>
-            <w:r>
-              <w:rPr>
-                <w:rFonts w:ascii="Avenir Next LT Pro Light" w:hAnsi="Avenir Next LT Pro Light"/>
-                <w:b/>
-                <w:bCs/>
-                <w:sz w:val="24"/>
-                <w:szCs w:val="24"/>
-              </w:rPr>
-              <w:t>6</w:t>
-            </w:r>
-          </w:p>
-        </w:tc>
-        <w:tc>
-          <w:tcPr>
-            <w:tcW w:w="2160" w:type="dxa"/>
+            <w:tcW w:w="4980" w:type="dxa"/>
           </w:tcPr>
           <w:p>
             <w:pPr>
@@ -2537,7 +2776,7 @@
         </w:tc>
         <w:tc>
           <w:tcPr>
-            <w:tcW w:w="2160" w:type="dxa"/>
+            <w:tcW w:w="1843" w:type="dxa"/>
           </w:tcPr>
           <w:p>
             <w:pPr>
@@ -2553,40 +2792,58 @@
                 <w:sz w:val="24"/>
                 <w:szCs w:val="24"/>
               </w:rPr>
-              <w:t>Közepes</w:t>
+              <w:t>3</w:t>
+            </w:r>
+            <w:r>
+              <w:rPr>
+                <w:rFonts w:ascii="Avenir Next LT Pro Light" w:hAnsi="Avenir Next LT Pro Light"/>
+                <w:sz w:val="24"/>
+                <w:szCs w:val="24"/>
+              </w:rPr>
+              <w:t>-4</w:t>
+            </w:r>
+            <w:r>
+              <w:rPr>
+                <w:rFonts w:ascii="Avenir Next LT Pro Light" w:hAnsi="Avenir Next LT Pro Light"/>
+                <w:sz w:val="24"/>
+                <w:szCs w:val="24"/>
+              </w:rPr>
+              <w:t xml:space="preserve"> nap</w:t>
             </w:r>
           </w:p>
         </w:tc>
         <w:tc>
           <w:tcPr>
-            <w:tcW w:w="2160" w:type="dxa"/>
+            <w:tcW w:w="1707" w:type="dxa"/>
           </w:tcPr>
           <w:p>
             <w:pPr>
+              <w:jc w:val="center"/>
               <w:rPr>
                 <w:rFonts w:ascii="Avenir Next LT Pro Light" w:hAnsi="Avenir Next LT Pro Light"/>
                 <w:sz w:val="24"/>
                 <w:szCs w:val="24"/>
               </w:rPr>
             </w:pPr>
-            <w:r>
-              <w:rPr>
-                <w:rFonts w:ascii="Avenir Next LT Pro Light" w:hAnsi="Avenir Next LT Pro Light"/>
-                <w:sz w:val="24"/>
-                <w:szCs w:val="24"/>
-              </w:rPr>
-              <w:t>3 nap</w:t>
-            </w:r>
           </w:p>
         </w:tc>
       </w:tr>
       <w:tr>
+        <w:trPr>
+          <w:trHeight w:val="286"/>
+        </w:trPr>
         <w:tc>
           <w:tcPr>
-            <w:tcW w:w="2160" w:type="dxa"/>
+            <w:tcW w:w="888" w:type="dxa"/>
           </w:tcPr>
           <w:p>
             <w:pPr>
+              <w:pStyle w:val="Listaszerbekezds"/>
+              <w:numPr>
+                <w:ilvl w:val="0"/>
+                <w:numId w:val="13"/>
+              </w:numPr>
+              <w:ind w:left="360"/>
               <w:rPr>
                 <w:rFonts w:ascii="Avenir Next LT Pro Light" w:hAnsi="Avenir Next LT Pro Light"/>
                 <w:b/>
@@ -2595,21 +2852,11 @@
                 <w:szCs w:val="24"/>
               </w:rPr>
             </w:pPr>
-            <w:r>
-              <w:rPr>
-                <w:rFonts w:ascii="Avenir Next LT Pro Light" w:hAnsi="Avenir Next LT Pro Light"/>
-                <w:b/>
-                <w:bCs/>
-                <w:sz w:val="24"/>
-                <w:szCs w:val="24"/>
-              </w:rPr>
-              <w:t>7</w:t>
-            </w:r>
           </w:p>
         </w:tc>
         <w:tc>
           <w:tcPr>
-            <w:tcW w:w="2160" w:type="dxa"/>
+            <w:tcW w:w="4980" w:type="dxa"/>
           </w:tcPr>
           <w:p>
             <w:pPr>
@@ -2631,7 +2878,7 @@
         </w:tc>
         <w:tc>
           <w:tcPr>
-            <w:tcW w:w="2160" w:type="dxa"/>
+            <w:tcW w:w="1843" w:type="dxa"/>
           </w:tcPr>
           <w:p>
             <w:pPr>
@@ -2647,40 +2894,42 @@
                 <w:sz w:val="24"/>
                 <w:szCs w:val="24"/>
               </w:rPr>
-              <w:t>Magas</w:t>
+              <w:t>4-5 nap</w:t>
             </w:r>
           </w:p>
         </w:tc>
         <w:tc>
           <w:tcPr>
-            <w:tcW w:w="2160" w:type="dxa"/>
+            <w:tcW w:w="1707" w:type="dxa"/>
           </w:tcPr>
           <w:p>
             <w:pPr>
+              <w:jc w:val="center"/>
               <w:rPr>
                 <w:rFonts w:ascii="Avenir Next LT Pro Light" w:hAnsi="Avenir Next LT Pro Light"/>
                 <w:sz w:val="24"/>
                 <w:szCs w:val="24"/>
               </w:rPr>
             </w:pPr>
-            <w:r>
-              <w:rPr>
-                <w:rFonts w:ascii="Avenir Next LT Pro Light" w:hAnsi="Avenir Next LT Pro Light"/>
-                <w:sz w:val="24"/>
-                <w:szCs w:val="24"/>
-              </w:rPr>
-              <w:t>4-5 nap</w:t>
-            </w:r>
           </w:p>
         </w:tc>
       </w:tr>
       <w:tr>
+        <w:trPr>
+          <w:trHeight w:val="286"/>
+        </w:trPr>
         <w:tc>
           <w:tcPr>
-            <w:tcW w:w="2160" w:type="dxa"/>
+            <w:tcW w:w="888" w:type="dxa"/>
           </w:tcPr>
           <w:p>
             <w:pPr>
+              <w:pStyle w:val="Listaszerbekezds"/>
+              <w:numPr>
+                <w:ilvl w:val="0"/>
+                <w:numId w:val="13"/>
+              </w:numPr>
+              <w:ind w:left="360"/>
               <w:rPr>
                 <w:rFonts w:ascii="Avenir Next LT Pro Light" w:hAnsi="Avenir Next LT Pro Light"/>
                 <w:b/>
@@ -2689,21 +2938,11 @@
                 <w:szCs w:val="24"/>
               </w:rPr>
             </w:pPr>
-            <w:r>
-              <w:rPr>
-                <w:rFonts w:ascii="Avenir Next LT Pro Light" w:hAnsi="Avenir Next LT Pro Light"/>
-                <w:b/>
-                <w:bCs/>
-                <w:sz w:val="24"/>
-                <w:szCs w:val="24"/>
-              </w:rPr>
-              <w:t>8</w:t>
-            </w:r>
           </w:p>
         </w:tc>
         <w:tc>
           <w:tcPr>
-            <w:tcW w:w="2160" w:type="dxa"/>
+            <w:tcW w:w="4980" w:type="dxa"/>
           </w:tcPr>
           <w:p>
             <w:pPr>
@@ -2725,7 +2964,7 @@
         </w:tc>
         <w:tc>
           <w:tcPr>
-            <w:tcW w:w="2160" w:type="dxa"/>
+            <w:tcW w:w="1843" w:type="dxa"/>
           </w:tcPr>
           <w:p>
             <w:pPr>
@@ -2741,40 +2980,42 @@
                 <w:sz w:val="24"/>
                 <w:szCs w:val="24"/>
               </w:rPr>
-              <w:t>Közepes</w:t>
+              <w:t>2-3 nap</w:t>
             </w:r>
           </w:p>
         </w:tc>
         <w:tc>
           <w:tcPr>
-            <w:tcW w:w="2160" w:type="dxa"/>
+            <w:tcW w:w="1707" w:type="dxa"/>
           </w:tcPr>
           <w:p>
             <w:pPr>
+              <w:jc w:val="center"/>
               <w:rPr>
                 <w:rFonts w:ascii="Avenir Next LT Pro Light" w:hAnsi="Avenir Next LT Pro Light"/>
                 <w:sz w:val="24"/>
                 <w:szCs w:val="24"/>
               </w:rPr>
             </w:pPr>
-            <w:r>
-              <w:rPr>
-                <w:rFonts w:ascii="Avenir Next LT Pro Light" w:hAnsi="Avenir Next LT Pro Light"/>
-                <w:sz w:val="24"/>
-                <w:szCs w:val="24"/>
-              </w:rPr>
-              <w:t>2-3 nap</w:t>
-            </w:r>
           </w:p>
         </w:tc>
       </w:tr>
       <w:tr>
+        <w:trPr>
+          <w:trHeight w:val="301"/>
+        </w:trPr>
         <w:tc>
           <w:tcPr>
-            <w:tcW w:w="2160" w:type="dxa"/>
+            <w:tcW w:w="888" w:type="dxa"/>
           </w:tcPr>
           <w:p>
             <w:pPr>
+              <w:pStyle w:val="Listaszerbekezds"/>
+              <w:numPr>
+                <w:ilvl w:val="0"/>
+                <w:numId w:val="13"/>
+              </w:numPr>
+              <w:ind w:left="360"/>
               <w:rPr>
                 <w:rFonts w:ascii="Avenir Next LT Pro Light" w:hAnsi="Avenir Next LT Pro Light"/>
                 <w:b/>
@@ -2783,21 +3024,49 @@
                 <w:szCs w:val="24"/>
               </w:rPr>
             </w:pPr>
+          </w:p>
+        </w:tc>
+        <w:tc>
+          <w:tcPr>
+            <w:tcW w:w="4980" w:type="dxa"/>
+          </w:tcPr>
+          <w:p>
+            <w:pPr>
+              <w:rPr>
+                <w:rFonts w:ascii="Avenir Next LT Pro Light" w:hAnsi="Avenir Next LT Pro Light"/>
+                <w:sz w:val="24"/>
+                <w:szCs w:val="24"/>
+              </w:rPr>
+            </w:pPr>
             <w:r>
               <w:rPr>
                 <w:rFonts w:ascii="Avenir Next LT Pro Light" w:hAnsi="Avenir Next LT Pro Light"/>
-                <w:b/>
-                <w:bCs/>
-                <w:sz w:val="24"/>
-                <w:szCs w:val="24"/>
-              </w:rPr>
-              <w:t>9</w:t>
+                <w:sz w:val="24"/>
+                <w:szCs w:val="24"/>
+              </w:rPr>
+              <w:t xml:space="preserve">Pályaépítés </w:t>
+            </w:r>
+            <w:r>
+              <w:rPr>
+                <w:rFonts w:ascii="Avenir Next LT Pro Light" w:hAnsi="Avenir Next LT Pro Light"/>
+                <w:sz w:val="24"/>
+                <w:szCs w:val="24"/>
+              </w:rPr>
+              <w:t>(Bánya, Kastély</w:t>
+            </w:r>
+            <w:r>
+              <w:rPr>
+                <w:rFonts w:ascii="Avenir Next LT Pro Light" w:hAnsi="Avenir Next LT Pro Light"/>
+                <w:sz w:val="24"/>
+                <w:szCs w:val="24"/>
+              </w:rPr>
+              <w:t>)</w:t>
             </w:r>
           </w:p>
         </w:tc>
         <w:tc>
           <w:tcPr>
-            <w:tcW w:w="2160" w:type="dxa"/>
+            <w:tcW w:w="1843" w:type="dxa"/>
           </w:tcPr>
           <w:p>
             <w:pPr>
@@ -2813,95 +3082,63 @@
                 <w:sz w:val="24"/>
                 <w:szCs w:val="24"/>
               </w:rPr>
-              <w:t>Pályaépítés (1–5)</w:t>
+              <w:t>6</w:t>
+            </w:r>
+            <w:r>
+              <w:rPr>
+                <w:rFonts w:ascii="Avenir Next LT Pro Light" w:hAnsi="Avenir Next LT Pro Light"/>
+                <w:sz w:val="24"/>
+                <w:szCs w:val="24"/>
+              </w:rPr>
+              <w:t xml:space="preserve"> nap</w:t>
             </w:r>
           </w:p>
         </w:tc>
         <w:tc>
           <w:tcPr>
-            <w:tcW w:w="2160" w:type="dxa"/>
+            <w:tcW w:w="1707" w:type="dxa"/>
           </w:tcPr>
           <w:p>
             <w:pPr>
+              <w:jc w:val="center"/>
               <w:rPr>
                 <w:rFonts w:ascii="Avenir Next LT Pro Light" w:hAnsi="Avenir Next LT Pro Light"/>
                 <w:sz w:val="24"/>
                 <w:szCs w:val="24"/>
               </w:rPr>
             </w:pPr>
-            <w:r>
-              <w:rPr>
-                <w:rFonts w:ascii="Avenir Next LT Pro Light" w:hAnsi="Avenir Next LT Pro Light"/>
-                <w:sz w:val="24"/>
-                <w:szCs w:val="24"/>
-              </w:rPr>
-              <w:t>Magas</w:t>
-            </w:r>
+          </w:p>
+        </w:tc>
+      </w:tr>
+      <w:tr>
+        <w:trPr>
+          <w:trHeight w:val="286"/>
+        </w:trPr>
+        <w:tc>
+          <w:tcPr>
+            <w:tcW w:w="888" w:type="dxa"/>
+          </w:tcPr>
+          <w:p>
+            <w:pPr>
+              <w:pStyle w:val="Listaszerbekezds"/>
+              <w:numPr>
+                <w:ilvl w:val="0"/>
+                <w:numId w:val="13"/>
+              </w:numPr>
+              <w:ind w:left="360"/>
+              <w:rPr>
+                <w:rFonts w:ascii="Avenir Next LT Pro Light" w:hAnsi="Avenir Next LT Pro Light"/>
+                <w:b/>
+                <w:bCs/>
+                <w:sz w:val="24"/>
+                <w:szCs w:val="24"/>
+              </w:rPr>
+            </w:pPr>
           </w:p>
         </w:tc>
         <w:tc>
           <w:tcPr>
-            <w:tcW w:w="2160" w:type="dxa"/>
-          </w:tcPr>
-          <w:p>
-            <w:pPr>
-              <w:rPr>
-                <w:rFonts w:ascii="Avenir Next LT Pro Light" w:hAnsi="Avenir Next LT Pro Light"/>
-                <w:sz w:val="24"/>
-                <w:szCs w:val="24"/>
-              </w:rPr>
-            </w:pPr>
-            <w:r>
-              <w:rPr>
-                <w:rFonts w:ascii="Avenir Next LT Pro Light" w:hAnsi="Avenir Next LT Pro Light"/>
-                <w:sz w:val="24"/>
-                <w:szCs w:val="24"/>
-              </w:rPr>
-              <w:t>8-12 nap</w:t>
-            </w:r>
-          </w:p>
-        </w:tc>
-      </w:tr>
-      <w:tr>
-        <w:tc>
-          <w:tcPr>
-            <w:tcW w:w="2160" w:type="dxa"/>
-          </w:tcPr>
-          <w:p>
-            <w:pPr>
-              <w:rPr>
-                <w:rFonts w:ascii="Avenir Next LT Pro Light" w:hAnsi="Avenir Next LT Pro Light"/>
-                <w:b/>
-                <w:bCs/>
-                <w:sz w:val="24"/>
-                <w:szCs w:val="24"/>
-              </w:rPr>
-            </w:pPr>
-            <w:r>
-              <w:rPr>
-                <w:rFonts w:ascii="Avenir Next LT Pro Light" w:hAnsi="Avenir Next LT Pro Light"/>
-                <w:b/>
-                <w:bCs/>
-                <w:sz w:val="24"/>
-                <w:szCs w:val="24"/>
-              </w:rPr>
-              <w:t>1</w:t>
-            </w:r>
-            <w:r>
-              <w:rPr>
-                <w:rFonts w:ascii="Avenir Next LT Pro Light" w:hAnsi="Avenir Next LT Pro Light"/>
-                <w:b/>
-                <w:bCs/>
-                <w:sz w:val="24"/>
-                <w:szCs w:val="24"/>
-              </w:rPr>
-              <w:t>0</w:t>
-            </w:r>
-          </w:p>
-        </w:tc>
-        <w:tc>
-          <w:tcPr>
-            <w:tcW w:w="2160" w:type="dxa"/>
+            <w:tcW w:w="4980" w:type="dxa"/>
           </w:tcPr>
           <w:p>
             <w:pPr>
@@ -2923,7 +3160,7 @@
         </w:tc>
         <w:tc>
           <w:tcPr>
-            <w:tcW w:w="2160" w:type="dxa"/>
+            <w:tcW w:w="1843" w:type="dxa"/>
           </w:tcPr>
           <w:p>
             <w:pPr>
@@ -2939,40 +3176,42 @@
                 <w:sz w:val="24"/>
                 <w:szCs w:val="24"/>
               </w:rPr>
-              <w:t>Magas</w:t>
+              <w:t>5-7 nap</w:t>
             </w:r>
           </w:p>
         </w:tc>
         <w:tc>
           <w:tcPr>
-            <w:tcW w:w="2160" w:type="dxa"/>
+            <w:tcW w:w="1707" w:type="dxa"/>
           </w:tcPr>
           <w:p>
             <w:pPr>
+              <w:jc w:val="center"/>
               <w:rPr>
                 <w:rFonts w:ascii="Avenir Next LT Pro Light" w:hAnsi="Avenir Next LT Pro Light"/>
                 <w:sz w:val="24"/>
                 <w:szCs w:val="24"/>
               </w:rPr>
             </w:pPr>
-            <w:r>
-              <w:rPr>
-                <w:rFonts w:ascii="Avenir Next LT Pro Light" w:hAnsi="Avenir Next LT Pro Light"/>
-                <w:sz w:val="24"/>
-                <w:szCs w:val="24"/>
-              </w:rPr>
-              <w:t>5-7 nap</w:t>
-            </w:r>
           </w:p>
         </w:tc>
       </w:tr>
       <w:tr>
+        <w:trPr>
+          <w:trHeight w:val="286"/>
+        </w:trPr>
         <w:tc>
           <w:tcPr>
-            <w:tcW w:w="2160" w:type="dxa"/>
+            <w:tcW w:w="888" w:type="dxa"/>
           </w:tcPr>
           <w:p>
             <w:pPr>
+              <w:pStyle w:val="Listaszerbekezds"/>
+              <w:numPr>
+                <w:ilvl w:val="0"/>
+                <w:numId w:val="13"/>
+              </w:numPr>
+              <w:ind w:left="360"/>
               <w:rPr>
                 <w:rFonts w:ascii="Avenir Next LT Pro Light" w:hAnsi="Avenir Next LT Pro Light"/>
                 <w:b/>
@@ -2981,31 +3220,41 @@
                 <w:szCs w:val="24"/>
               </w:rPr>
             </w:pPr>
+          </w:p>
+        </w:tc>
+        <w:tc>
+          <w:tcPr>
+            <w:tcW w:w="4980" w:type="dxa"/>
+          </w:tcPr>
+          <w:p>
+            <w:pPr>
+              <w:rPr>
+                <w:rFonts w:ascii="Avenir Next LT Pro Light" w:hAnsi="Avenir Next LT Pro Light"/>
+                <w:sz w:val="24"/>
+                <w:szCs w:val="24"/>
+              </w:rPr>
+            </w:pPr>
             <w:r>
               <w:rPr>
                 <w:rFonts w:ascii="Avenir Next LT Pro Light" w:hAnsi="Avenir Next LT Pro Light"/>
-                <w:b/>
-                <w:bCs/>
-                <w:sz w:val="24"/>
-                <w:szCs w:val="24"/>
-              </w:rPr>
-              <w:t>1</w:t>
+                <w:sz w:val="24"/>
+                <w:szCs w:val="24"/>
+              </w:rPr>
+              <w:t>Opening c</w:t>
             </w:r>
             <w:r>
               <w:rPr>
                 <w:rFonts w:ascii="Avenir Next LT Pro Light" w:hAnsi="Avenir Next LT Pro Light"/>
-                <w:b/>
-                <w:bCs/>
-                <w:sz w:val="24"/>
-                <w:szCs w:val="24"/>
-              </w:rPr>
-              <w:t>1</w:t>
+                <w:sz w:val="24"/>
+                <w:szCs w:val="24"/>
+              </w:rPr>
+              <w:t>utscene</w:t>
             </w:r>
           </w:p>
         </w:tc>
         <w:tc>
           <w:tcPr>
-            <w:tcW w:w="2160" w:type="dxa"/>
+            <w:tcW w:w="1843" w:type="dxa"/>
           </w:tcPr>
           <w:p>
             <w:pPr>
@@ -3021,95 +3270,55 @@
                 <w:sz w:val="24"/>
                 <w:szCs w:val="24"/>
               </w:rPr>
-              <w:t>Cutscene</w:t>
+              <w:t>2-3 nap</w:t>
             </w:r>
           </w:p>
         </w:tc>
         <w:tc>
           <w:tcPr>
-            <w:tcW w:w="2160" w:type="dxa"/>
+            <w:tcW w:w="1707" w:type="dxa"/>
           </w:tcPr>
           <w:p>
             <w:pPr>
+              <w:jc w:val="center"/>
               <w:rPr>
                 <w:rFonts w:ascii="Avenir Next LT Pro Light" w:hAnsi="Avenir Next LT Pro Light"/>
                 <w:sz w:val="24"/>
                 <w:szCs w:val="24"/>
               </w:rPr>
             </w:pPr>
-            <w:r>
-              <w:rPr>
-                <w:rFonts w:ascii="Avenir Next LT Pro Light" w:hAnsi="Avenir Next LT Pro Light"/>
-                <w:sz w:val="24"/>
-                <w:szCs w:val="24"/>
-              </w:rPr>
-              <w:t>Közepes</w:t>
-            </w:r>
+          </w:p>
+        </w:tc>
+      </w:tr>
+      <w:tr>
+        <w:trPr>
+          <w:trHeight w:val="286"/>
+        </w:trPr>
+        <w:tc>
+          <w:tcPr>
+            <w:tcW w:w="888" w:type="dxa"/>
+          </w:tcPr>
+          <w:p>
+            <w:pPr>
+              <w:pStyle w:val="Listaszerbekezds"/>
+              <w:numPr>
+                <w:ilvl w:val="0"/>
+                <w:numId w:val="13"/>
+              </w:numPr>
+              <w:ind w:left="360"/>
+              <w:rPr>
+                <w:rFonts w:ascii="Avenir Next LT Pro Light" w:hAnsi="Avenir Next LT Pro Light"/>
+                <w:b/>
+                <w:bCs/>
+                <w:sz w:val="24"/>
+                <w:szCs w:val="24"/>
+              </w:rPr>
+            </w:pPr>
           </w:p>
         </w:tc>
         <w:tc>
           <w:tcPr>
-            <w:tcW w:w="2160" w:type="dxa"/>
-          </w:tcPr>
-          <w:p>
-            <w:pPr>
-              <w:rPr>
-                <w:rFonts w:ascii="Avenir Next LT Pro Light" w:hAnsi="Avenir Next LT Pro Light"/>
-                <w:sz w:val="24"/>
-                <w:szCs w:val="24"/>
-              </w:rPr>
-            </w:pPr>
-            <w:r>
-              <w:rPr>
-                <w:rFonts w:ascii="Avenir Next LT Pro Light" w:hAnsi="Avenir Next LT Pro Light"/>
-                <w:sz w:val="24"/>
-                <w:szCs w:val="24"/>
-              </w:rPr>
-              <w:t>2-3 nap</w:t>
-            </w:r>
-          </w:p>
-        </w:tc>
-      </w:tr>
-      <w:tr>
-        <w:tc>
-          <w:tcPr>
-            <w:tcW w:w="2160" w:type="dxa"/>
-          </w:tcPr>
-          <w:p>
-            <w:pPr>
-              <w:rPr>
-                <w:rFonts w:ascii="Avenir Next LT Pro Light" w:hAnsi="Avenir Next LT Pro Light"/>
-                <w:b/>
-                <w:bCs/>
-                <w:sz w:val="24"/>
-                <w:szCs w:val="24"/>
-              </w:rPr>
-            </w:pPr>
-            <w:r>
-              <w:rPr>
-                <w:rFonts w:ascii="Avenir Next LT Pro Light" w:hAnsi="Avenir Next LT Pro Light"/>
-                <w:b/>
-                <w:bCs/>
-                <w:sz w:val="24"/>
-                <w:szCs w:val="24"/>
-              </w:rPr>
-              <w:t>1</w:t>
-            </w:r>
-            <w:r>
-              <w:rPr>
-                <w:rFonts w:ascii="Avenir Next LT Pro Light" w:hAnsi="Avenir Next LT Pro Light"/>
-                <w:b/>
-                <w:bCs/>
-                <w:sz w:val="24"/>
-                <w:szCs w:val="24"/>
-              </w:rPr>
-              <w:t>2</w:t>
-            </w:r>
-          </w:p>
-        </w:tc>
-        <w:tc>
-          <w:tcPr>
-            <w:tcW w:w="2160" w:type="dxa"/>
+            <w:tcW w:w="4980" w:type="dxa"/>
           </w:tcPr>
           <w:p>
             <w:pPr>
@@ -3131,7 +3340,7 @@
         </w:tc>
         <w:tc>
           <w:tcPr>
-            <w:tcW w:w="2160" w:type="dxa"/>
+            <w:tcW w:w="1843" w:type="dxa"/>
           </w:tcPr>
           <w:p>
             <w:pPr>
@@ -3147,40 +3356,42 @@
                 <w:sz w:val="24"/>
                 <w:szCs w:val="24"/>
               </w:rPr>
-              <w:t>Közepes</w:t>
+              <w:t>3-4 nap</w:t>
             </w:r>
           </w:p>
         </w:tc>
         <w:tc>
           <w:tcPr>
-            <w:tcW w:w="2160" w:type="dxa"/>
+            <w:tcW w:w="1707" w:type="dxa"/>
           </w:tcPr>
           <w:p>
             <w:pPr>
+              <w:jc w:val="center"/>
               <w:rPr>
                 <w:rFonts w:ascii="Avenir Next LT Pro Light" w:hAnsi="Avenir Next LT Pro Light"/>
                 <w:sz w:val="24"/>
                 <w:szCs w:val="24"/>
               </w:rPr>
             </w:pPr>
-            <w:r>
-              <w:rPr>
-                <w:rFonts w:ascii="Avenir Next LT Pro Light" w:hAnsi="Avenir Next LT Pro Light"/>
-                <w:sz w:val="24"/>
-                <w:szCs w:val="24"/>
-              </w:rPr>
-              <w:t>3-4 nap</w:t>
-            </w:r>
           </w:p>
         </w:tc>
       </w:tr>
       <w:tr>
+        <w:trPr>
+          <w:trHeight w:val="286"/>
+        </w:trPr>
         <w:tc>
           <w:tcPr>
-            <w:tcW w:w="2160" w:type="dxa"/>
+            <w:tcW w:w="888" w:type="dxa"/>
           </w:tcPr>
           <w:p>
             <w:pPr>
+              <w:pStyle w:val="Listaszerbekezds"/>
+              <w:numPr>
+                <w:ilvl w:val="0"/>
+                <w:numId w:val="13"/>
+              </w:numPr>
+              <w:ind w:left="360"/>
               <w:rPr>
                 <w:rFonts w:ascii="Avenir Next LT Pro Light" w:hAnsi="Avenir Next LT Pro Light"/>
                 <w:b/>
@@ -3189,31 +3400,11 @@
                 <w:szCs w:val="24"/>
               </w:rPr>
             </w:pPr>
-            <w:r>
-              <w:rPr>
-                <w:rFonts w:ascii="Avenir Next LT Pro Light" w:hAnsi="Avenir Next LT Pro Light"/>
-                <w:b/>
-                <w:bCs/>
-                <w:sz w:val="24"/>
-                <w:szCs w:val="24"/>
-              </w:rPr>
-              <w:t>1</w:t>
-            </w:r>
-            <w:r>
-              <w:rPr>
-                <w:rFonts w:ascii="Avenir Next LT Pro Light" w:hAnsi="Avenir Next LT Pro Light"/>
-                <w:b/>
-                <w:bCs/>
-                <w:sz w:val="24"/>
-                <w:szCs w:val="24"/>
-              </w:rPr>
-              <w:t>3</w:t>
-            </w:r>
           </w:p>
         </w:tc>
         <w:tc>
           <w:tcPr>
-            <w:tcW w:w="2160" w:type="dxa"/>
+            <w:tcW w:w="4980" w:type="dxa"/>
           </w:tcPr>
           <w:p>
             <w:pPr>
@@ -3235,7 +3426,7 @@
         </w:tc>
         <w:tc>
           <w:tcPr>
-            <w:tcW w:w="2160" w:type="dxa"/>
+            <w:tcW w:w="1843" w:type="dxa"/>
           </w:tcPr>
           <w:p>
             <w:pPr>
@@ -3251,40 +3442,42 @@
                 <w:sz w:val="24"/>
                 <w:szCs w:val="24"/>
               </w:rPr>
-              <w:t>Alacsony</w:t>
+              <w:t>2-3 nap</w:t>
             </w:r>
           </w:p>
         </w:tc>
         <w:tc>
           <w:tcPr>
-            <w:tcW w:w="2160" w:type="dxa"/>
+            <w:tcW w:w="1707" w:type="dxa"/>
           </w:tcPr>
           <w:p>
             <w:pPr>
+              <w:jc w:val="center"/>
               <w:rPr>
                 <w:rFonts w:ascii="Avenir Next LT Pro Light" w:hAnsi="Avenir Next LT Pro Light"/>
                 <w:sz w:val="24"/>
                 <w:szCs w:val="24"/>
               </w:rPr>
             </w:pPr>
-            <w:r>
-              <w:rPr>
-                <w:rFonts w:ascii="Avenir Next LT Pro Light" w:hAnsi="Avenir Next LT Pro Light"/>
-                <w:sz w:val="24"/>
-                <w:szCs w:val="24"/>
-              </w:rPr>
-              <w:t>2-3 nap</w:t>
-            </w:r>
           </w:p>
         </w:tc>
       </w:tr>
       <w:tr>
+        <w:trPr>
+          <w:trHeight w:val="286"/>
+        </w:trPr>
         <w:tc>
           <w:tcPr>
-            <w:tcW w:w="2160" w:type="dxa"/>
+            <w:tcW w:w="888" w:type="dxa"/>
           </w:tcPr>
           <w:p>
             <w:pPr>
+              <w:pStyle w:val="Listaszerbekezds"/>
+              <w:numPr>
+                <w:ilvl w:val="0"/>
+                <w:numId w:val="13"/>
+              </w:numPr>
+              <w:ind w:left="360"/>
               <w:rPr>
                 <w:rFonts w:ascii="Avenir Next LT Pro Light" w:hAnsi="Avenir Next LT Pro Light"/>
                 <w:b/>
@@ -3293,21 +3486,33 @@
                 <w:szCs w:val="24"/>
               </w:rPr>
             </w:pPr>
+          </w:p>
+        </w:tc>
+        <w:tc>
+          <w:tcPr>
+            <w:tcW w:w="4980" w:type="dxa"/>
+          </w:tcPr>
+          <w:p>
+            <w:pPr>
+              <w:rPr>
+                <w:rFonts w:ascii="Avenir Next LT Pro Light" w:hAnsi="Avenir Next LT Pro Light"/>
+                <w:sz w:val="24"/>
+                <w:szCs w:val="24"/>
+              </w:rPr>
+            </w:pPr>
             <w:r>
               <w:rPr>
                 <w:rFonts w:ascii="Avenir Next LT Pro Light" w:hAnsi="Avenir Next LT Pro Light"/>
-                <w:b/>
-                <w:bCs/>
-                <w:sz w:val="24"/>
-                <w:szCs w:val="24"/>
-              </w:rPr>
-              <w:t>14</w:t>
+                <w:sz w:val="24"/>
+                <w:szCs w:val="24"/>
+              </w:rPr>
+              <w:t>Hub pálya + teleport rendszer</w:t>
             </w:r>
           </w:p>
         </w:tc>
         <w:tc>
           <w:tcPr>
-            <w:tcW w:w="2160" w:type="dxa"/>
+            <w:tcW w:w="1843" w:type="dxa"/>
           </w:tcPr>
           <w:p>
             <w:pPr>
@@ -3323,95 +3528,55 @@
                 <w:sz w:val="24"/>
                 <w:szCs w:val="24"/>
               </w:rPr>
-              <w:t>Hub teleport rendszer</w:t>
+              <w:t>3-4 nap</w:t>
             </w:r>
           </w:p>
         </w:tc>
         <w:tc>
           <w:tcPr>
-            <w:tcW w:w="2160" w:type="dxa"/>
+            <w:tcW w:w="1707" w:type="dxa"/>
           </w:tcPr>
           <w:p>
             <w:pPr>
+              <w:jc w:val="center"/>
               <w:rPr>
                 <w:rFonts w:ascii="Avenir Next LT Pro Light" w:hAnsi="Avenir Next LT Pro Light"/>
                 <w:sz w:val="24"/>
                 <w:szCs w:val="24"/>
               </w:rPr>
             </w:pPr>
-            <w:r>
-              <w:rPr>
-                <w:rFonts w:ascii="Avenir Next LT Pro Light" w:hAnsi="Avenir Next LT Pro Light"/>
-                <w:sz w:val="24"/>
-                <w:szCs w:val="24"/>
-              </w:rPr>
-              <w:t>Magas</w:t>
-            </w:r>
+          </w:p>
+        </w:tc>
+      </w:tr>
+      <w:tr>
+        <w:trPr>
+          <w:trHeight w:val="286"/>
+        </w:trPr>
+        <w:tc>
+          <w:tcPr>
+            <w:tcW w:w="888" w:type="dxa"/>
+          </w:tcPr>
+          <w:p>
+            <w:pPr>
+              <w:pStyle w:val="Listaszerbekezds"/>
+              <w:numPr>
+                <w:ilvl w:val="0"/>
+                <w:numId w:val="13"/>
+              </w:numPr>
+              <w:ind w:left="545" w:hanging="545"/>
+              <w:rPr>
+                <w:rFonts w:ascii="Avenir Next LT Pro Light" w:hAnsi="Avenir Next LT Pro Light"/>
+                <w:b/>
+                <w:bCs/>
+                <w:sz w:val="24"/>
+                <w:szCs w:val="24"/>
+              </w:rPr>
+            </w:pPr>
           </w:p>
         </w:tc>
         <w:tc>
           <w:tcPr>
-            <w:tcW w:w="2160" w:type="dxa"/>
-          </w:tcPr>
-          <w:p>
-            <w:pPr>
-              <w:rPr>
-                <w:rFonts w:ascii="Avenir Next LT Pro Light" w:hAnsi="Avenir Next LT Pro Light"/>
-                <w:sz w:val="24"/>
-                <w:szCs w:val="24"/>
-              </w:rPr>
-            </w:pPr>
-            <w:r>
-              <w:rPr>
-                <w:rFonts w:ascii="Avenir Next LT Pro Light" w:hAnsi="Avenir Next LT Pro Light"/>
-                <w:sz w:val="24"/>
-                <w:szCs w:val="24"/>
-              </w:rPr>
-              <w:t>3-4 nap</w:t>
-            </w:r>
-          </w:p>
-        </w:tc>
-      </w:tr>
-      <w:tr>
-        <w:tc>
-          <w:tcPr>
-            <w:tcW w:w="2160" w:type="dxa"/>
-          </w:tcPr>
-          <w:p>
-            <w:pPr>
-              <w:rPr>
-                <w:rFonts w:ascii="Avenir Next LT Pro Light" w:hAnsi="Avenir Next LT Pro Light"/>
-                <w:b/>
-                <w:bCs/>
-                <w:sz w:val="24"/>
-                <w:szCs w:val="24"/>
-              </w:rPr>
-            </w:pPr>
-            <w:r>
-              <w:rPr>
-                <w:rFonts w:ascii="Avenir Next LT Pro Light" w:hAnsi="Avenir Next LT Pro Light"/>
-                <w:b/>
-                <w:bCs/>
-                <w:sz w:val="24"/>
-                <w:szCs w:val="24"/>
-              </w:rPr>
-              <w:t>1</w:t>
-            </w:r>
-            <w:r>
-              <w:rPr>
-                <w:rFonts w:ascii="Avenir Next LT Pro Light" w:hAnsi="Avenir Next LT Pro Light"/>
-                <w:b/>
-                <w:bCs/>
-                <w:sz w:val="24"/>
-                <w:szCs w:val="24"/>
-              </w:rPr>
-              <w:t>5</w:t>
-            </w:r>
-          </w:p>
-        </w:tc>
-        <w:tc>
-          <w:tcPr>
-            <w:tcW w:w="2160" w:type="dxa"/>
+            <w:tcW w:w="4980" w:type="dxa"/>
           </w:tcPr>
           <w:p>
             <w:pPr>
@@ -3433,7 +3598,7 @@
         </w:tc>
         <w:tc>
           <w:tcPr>
-            <w:tcW w:w="2160" w:type="dxa"/>
+            <w:tcW w:w="1843" w:type="dxa"/>
           </w:tcPr>
           <w:p>
             <w:pPr>
@@ -3449,30 +3614,23 @@
                 <w:sz w:val="24"/>
                 <w:szCs w:val="24"/>
               </w:rPr>
-              <w:t>Magas</w:t>
+              <w:t>4-5 nap</w:t>
             </w:r>
           </w:p>
         </w:tc>
         <w:tc>
           <w:tcPr>
-            <w:tcW w:w="2160" w:type="dxa"/>
+            <w:tcW w:w="1707" w:type="dxa"/>
           </w:tcPr>
           <w:p>
             <w:pPr>
+              <w:jc w:val="center"/>
               <w:rPr>
                 <w:rFonts w:ascii="Avenir Next LT Pro Light" w:hAnsi="Avenir Next LT Pro Light"/>
                 <w:sz w:val="24"/>
                 <w:szCs w:val="24"/>
               </w:rPr>
             </w:pPr>
-            <w:r>
-              <w:rPr>
-                <w:rFonts w:ascii="Avenir Next LT Pro Light" w:hAnsi="Avenir Next LT Pro Light"/>
-                <w:sz w:val="24"/>
-                <w:szCs w:val="24"/>
-              </w:rPr>
-              <w:t>4-5 nap</w:t>
-            </w:r>
           </w:p>
         </w:tc>
       </w:tr>
@@ -3668,6 +3826,119 @@
     </w:lvl>
   </w:abstractNum>
   <w:abstractNum w:abstractNumId="9" w15:restartNumberingAfterBreak="0">
+    <w:nsid w:val="01792B45"/>
+    <w:multiLevelType w:val="hybridMultilevel"/>
+    <w:tmpl w:val="5B2069B2"/>
+    <w:lvl w:ilvl="0" w:tplc="040E0001">
+      <w:start w:val="1"/>
+      <w:numFmt w:val="bullet"/>
+      <w:lvlText w:val=""/>
+      <w:lvlJc w:val="left"/>
+      <w:pPr>
+        <w:ind w:left="720" w:hanging="360"/>
+      </w:pPr>
+      <w:rPr>
+        <w:rFonts w:ascii="Symbol" w:hAnsi="Symbol" w:hint="default"/>
+      </w:rPr>
+    </w:lvl>
+    <w:lvl w:ilvl="1" w:tplc="040E0003" w:tentative="1">
+      <w:start w:val="1"/>
+      <w:numFmt w:val="bullet"/>
+      <w:lvlText w:val="o"/>
+      <w:lvlJc w:val="left"/>
+      <w:pPr>
+        <w:ind w:left="1440" w:hanging="360"/>
+      </w:pPr>
+      <w:rPr>
+        <w:rFonts w:ascii="Courier New" w:hAnsi="Courier New" w:cs="Courier New" w:hint="default"/>
+      </w:rPr>
+    </w:lvl>
+    <w:lvl w:ilvl="2" w:tplc="040E0005" w:tentative="1">
+      <w:start w:val="1"/>
+      <w:numFmt w:val="bullet"/>
+      <w:lvlText w:val=""/>
+      <w:lvlJc w:val="left"/>
+      <w:pPr>
+        <w:ind w:left="2160" w:hanging="360"/>
+      </w:pPr>
+      <w:rPr>
+        <w:rFonts w:ascii="Wingdings" w:hAnsi="Wingdings" w:hint="default"/>
+      </w:rPr>
+    </w:lvl>
+    <w:lvl w:ilvl="3" w:tplc="040E0001" w:tentative="1">
+      <w:start w:val="1"/>
+      <w:numFmt w:val="bullet"/>
+      <w:lvlText w:val=""/>
+      <w:lvlJc w:val="left"/>
+      <w:pPr>
+        <w:ind w:left="2880" w:hanging="360"/>
+      </w:pPr>
+      <w:rPr>
+        <w:rFonts w:ascii="Symbol" w:hAnsi="Symbol" w:hint="default"/>
+      </w:rPr>
+    </w:lvl>
+    <w:lvl w:ilvl="4" w:tplc="040E0003" w:tentative="1">
+      <w:start w:val="1"/>
+      <w:numFmt w:val="bullet"/>
+      <w:lvlText w:val="o"/>
+      <w:lvlJc w:val="left"/>
+      <w:pPr>
+        <w:ind w:left="3600" w:hanging="360"/>
+      </w:pPr>
+      <w:rPr>
+        <w:rFonts w:ascii="Courier New" w:hAnsi="Courier New" w:cs="Courier New" w:hint="default"/>
+      </w:rPr>
+    </w:lvl>
+    <w:lvl w:ilvl="5" w:tplc="040E0005" w:tentative="1">
+      <w:start w:val="1"/>
+      <w:numFmt w:val="bullet"/>
+      <w:lvlText w:val=""/>
+      <w:lvlJc w:val="left"/>
+      <w:pPr>
+        <w:ind w:left="4320" w:hanging="360"/>
+      </w:pPr>
+      <w:rPr>
+        <w:rFonts w:ascii="Wingdings" w:hAnsi="Wingdings" w:hint="default"/>
+      </w:rPr>
+    </w:lvl>
+    <w:lvl w:ilvl="6" w:tplc="040E0001" w:tentative="1">
+      <w:start w:val="1"/>
+      <w:numFmt w:val="bullet"/>
+      <w:lvlText w:val=""/>
+      <w:lvlJc w:val="left"/>
+      <w:pPr>
+        <w:ind w:left="5040" w:hanging="360"/>
+      </w:pPr>
+      <w:rPr>
+        <w:rFonts w:ascii="Symbol" w:hAnsi="Symbol" w:hint="default"/>
+      </w:rPr>
+    </w:lvl>
+    <w:lvl w:ilvl="7" w:tplc="040E0003" w:tentative="1">
+      <w:start w:val="1"/>
+      <w:numFmt w:val="bullet"/>
+      <w:lvlText w:val="o"/>
+      <w:lvlJc w:val="left"/>
+      <w:pPr>
+        <w:ind w:left="5760" w:hanging="360"/>
+      </w:pPr>
+      <w:rPr>
+        <w:rFonts w:ascii="Courier New" w:hAnsi="Courier New" w:cs="Courier New" w:hint="default"/>
+      </w:rPr>
+    </w:lvl>
+    <w:lvl w:ilvl="8" w:tplc="040E0005" w:tentative="1">
+      <w:start w:val="1"/>
+      <w:numFmt w:val="bullet"/>
+      <w:lvlText w:val=""/>
+      <w:lvlJc w:val="left"/>
+      <w:pPr>
+        <w:ind w:left="6480" w:hanging="360"/>
+      </w:pPr>
+      <w:rPr>
+        <w:rFonts w:ascii="Wingdings" w:hAnsi="Wingdings" w:hint="default"/>
+      </w:rPr>
+    </w:lvl>
+  </w:abstractNum>
+  <w:abstractNum w:abstractNumId="10" w15:restartNumberingAfterBreak="0">
     <w:nsid w:val="0C9013F0"/>
     <w:multiLevelType w:val="hybridMultilevel"/>
     <w:tmpl w:val="88441F8E"/>
@@ -3778,6 +4049,264 @@
       <w:rPr>
         <w:rFonts w:ascii="Wingdings" w:hAnsi="Wingdings" w:hint="default"/>
       </w:rPr>
+    </w:lvl>
+  </w:abstractNum>
+  <w:abstractNum w:abstractNumId="11" w15:restartNumberingAfterBreak="0">
+    <w:nsid w:val="1D9B0ADB"/>
+    <w:multiLevelType w:val="hybridMultilevel"/>
+    <w:tmpl w:val="430808DA"/>
+    <w:lvl w:ilvl="0" w:tplc="040E000F">
+      <w:start w:val="1"/>
+      <w:numFmt w:val="decimal"/>
+      <w:lvlText w:val="%1."/>
+      <w:lvlJc w:val="left"/>
+      <w:pPr>
+        <w:ind w:left="720" w:hanging="360"/>
+      </w:pPr>
+    </w:lvl>
+    <w:lvl w:ilvl="1" w:tplc="040E0019" w:tentative="1">
+      <w:start w:val="1"/>
+      <w:numFmt w:val="lowerLetter"/>
+      <w:lvlText w:val="%2."/>
+      <w:lvlJc w:val="left"/>
+      <w:pPr>
+        <w:ind w:left="1440" w:hanging="360"/>
+      </w:pPr>
+    </w:lvl>
+    <w:lvl w:ilvl="2" w:tplc="040E001B" w:tentative="1">
+      <w:start w:val="1"/>
+      <w:numFmt w:val="lowerRoman"/>
+      <w:lvlText w:val="%3."/>
+      <w:lvlJc w:val="right"/>
+      <w:pPr>
+        <w:ind w:left="2160" w:hanging="180"/>
+      </w:pPr>
+    </w:lvl>
+    <w:lvl w:ilvl="3" w:tplc="040E000F" w:tentative="1">
+      <w:start w:val="1"/>
+      <w:numFmt w:val="decimal"/>
+      <w:lvlText w:val="%4."/>
+      <w:lvlJc w:val="left"/>
+      <w:pPr>
+        <w:ind w:left="2880" w:hanging="360"/>
+      </w:pPr>
+    </w:lvl>
+    <w:lvl w:ilvl="4" w:tplc="040E0019" w:tentative="1">
+      <w:start w:val="1"/>
+      <w:numFmt w:val="lowerLetter"/>
+      <w:lvlText w:val="%5."/>
+      <w:lvlJc w:val="left"/>
+      <w:pPr>
+        <w:ind w:left="3600" w:hanging="360"/>
+      </w:pPr>
+    </w:lvl>
+    <w:lvl w:ilvl="5" w:tplc="040E001B" w:tentative="1">
+      <w:start w:val="1"/>
+      <w:numFmt w:val="lowerRoman"/>
+      <w:lvlText w:val="%6."/>
+      <w:lvlJc w:val="right"/>
+      <w:pPr>
+        <w:ind w:left="4320" w:hanging="180"/>
+      </w:pPr>
+    </w:lvl>
+    <w:lvl w:ilvl="6" w:tplc="040E000F" w:tentative="1">
+      <w:start w:val="1"/>
+      <w:numFmt w:val="decimal"/>
+      <w:lvlText w:val="%7."/>
+      <w:lvlJc w:val="left"/>
+      <w:pPr>
+        <w:ind w:left="5040" w:hanging="360"/>
+      </w:pPr>
+    </w:lvl>
+    <w:lvl w:ilvl="7" w:tplc="040E0019" w:tentative="1">
+      <w:start w:val="1"/>
+      <w:numFmt w:val="lowerLetter"/>
+      <w:lvlText w:val="%8."/>
+      <w:lvlJc w:val="left"/>
+      <w:pPr>
+        <w:ind w:left="5760" w:hanging="360"/>
+      </w:pPr>
+    </w:lvl>
+    <w:lvl w:ilvl="8" w:tplc="040E001B" w:tentative="1">
+      <w:start w:val="1"/>
+      <w:numFmt w:val="lowerRoman"/>
+      <w:lvlText w:val="%9."/>
+      <w:lvlJc w:val="right"/>
+      <w:pPr>
+        <w:ind w:left="6480" w:hanging="180"/>
+      </w:pPr>
+    </w:lvl>
+  </w:abstractNum>
+  <w:abstractNum w:abstractNumId="12" w15:restartNumberingAfterBreak="0">
+    <w:nsid w:val="21ED4584"/>
+    <w:multiLevelType w:val="hybridMultilevel"/>
+    <w:tmpl w:val="C882D0FC"/>
+    <w:lvl w:ilvl="0" w:tplc="040E000F">
+      <w:start w:val="1"/>
+      <w:numFmt w:val="decimal"/>
+      <w:lvlText w:val="%1."/>
+      <w:lvlJc w:val="left"/>
+      <w:pPr>
+        <w:ind w:left="1440" w:hanging="360"/>
+      </w:pPr>
+    </w:lvl>
+    <w:lvl w:ilvl="1" w:tplc="040E0019" w:tentative="1">
+      <w:start w:val="1"/>
+      <w:numFmt w:val="lowerLetter"/>
+      <w:lvlText w:val="%2."/>
+      <w:lvlJc w:val="left"/>
+      <w:pPr>
+        <w:ind w:left="2160" w:hanging="360"/>
+      </w:pPr>
+    </w:lvl>
+    <w:lvl w:ilvl="2" w:tplc="040E001B" w:tentative="1">
+      <w:start w:val="1"/>
+      <w:numFmt w:val="lowerRoman"/>
+      <w:lvlText w:val="%3."/>
+      <w:lvlJc w:val="right"/>
+      <w:pPr>
+        <w:ind w:left="2880" w:hanging="180"/>
+      </w:pPr>
+    </w:lvl>
+    <w:lvl w:ilvl="3" w:tplc="040E000F" w:tentative="1">
+      <w:start w:val="1"/>
+      <w:numFmt w:val="decimal"/>
+      <w:lvlText w:val="%4."/>
+      <w:lvlJc w:val="left"/>
+      <w:pPr>
+        <w:ind w:left="3600" w:hanging="360"/>
+      </w:pPr>
+    </w:lvl>
+    <w:lvl w:ilvl="4" w:tplc="040E0019" w:tentative="1">
+      <w:start w:val="1"/>
+      <w:numFmt w:val="lowerLetter"/>
+      <w:lvlText w:val="%5."/>
+      <w:lvlJc w:val="left"/>
+      <w:pPr>
+        <w:ind w:left="4320" w:hanging="360"/>
+      </w:pPr>
+    </w:lvl>
+    <w:lvl w:ilvl="5" w:tplc="040E001B" w:tentative="1">
+      <w:start w:val="1"/>
+      <w:numFmt w:val="lowerRoman"/>
+      <w:lvlText w:val="%6."/>
+      <w:lvlJc w:val="right"/>
+      <w:pPr>
+        <w:ind w:left="5040" w:hanging="180"/>
+      </w:pPr>
+    </w:lvl>
+    <w:lvl w:ilvl="6" w:tplc="040E000F" w:tentative="1">
+      <w:start w:val="1"/>
+      <w:numFmt w:val="decimal"/>
+      <w:lvlText w:val="%7."/>
+      <w:lvlJc w:val="left"/>
+      <w:pPr>
+        <w:ind w:left="5760" w:hanging="360"/>
+      </w:pPr>
+    </w:lvl>
+    <w:lvl w:ilvl="7" w:tplc="040E0019" w:tentative="1">
+      <w:start w:val="1"/>
+      <w:numFmt w:val="lowerLetter"/>
+      <w:lvlText w:val="%8."/>
+      <w:lvlJc w:val="left"/>
+      <w:pPr>
+        <w:ind w:left="6480" w:hanging="360"/>
+      </w:pPr>
+    </w:lvl>
+    <w:lvl w:ilvl="8" w:tplc="040E001B" w:tentative="1">
+      <w:start w:val="1"/>
+      <w:numFmt w:val="lowerRoman"/>
+      <w:lvlText w:val="%9."/>
+      <w:lvlJc w:val="right"/>
+      <w:pPr>
+        <w:ind w:left="7200" w:hanging="180"/>
+      </w:pPr>
+    </w:lvl>
+  </w:abstractNum>
+  <w:abstractNum w:abstractNumId="13" w15:restartNumberingAfterBreak="0">
+    <w:nsid w:val="34210ECA"/>
+    <w:multiLevelType w:val="hybridMultilevel"/>
+    <w:tmpl w:val="13C4BA3E"/>
+    <w:lvl w:ilvl="0" w:tplc="040E000F">
+      <w:start w:val="1"/>
+      <w:numFmt w:val="decimal"/>
+      <w:lvlText w:val="%1."/>
+      <w:lvlJc w:val="left"/>
+      <w:pPr>
+        <w:ind w:left="720" w:hanging="360"/>
+      </w:pPr>
+    </w:lvl>
+    <w:lvl w:ilvl="1" w:tplc="040E0019" w:tentative="1">
+      <w:start w:val="1"/>
+      <w:numFmt w:val="lowerLetter"/>
+      <w:lvlText w:val="%2."/>
+      <w:lvlJc w:val="left"/>
+      <w:pPr>
+        <w:ind w:left="1440" w:hanging="360"/>
+      </w:pPr>
+    </w:lvl>
+    <w:lvl w:ilvl="2" w:tplc="040E001B" w:tentative="1">
+      <w:start w:val="1"/>
+      <w:numFmt w:val="lowerRoman"/>
+      <w:lvlText w:val="%3."/>
+      <w:lvlJc w:val="right"/>
+      <w:pPr>
+        <w:ind w:left="2160" w:hanging="180"/>
+      </w:pPr>
+    </w:lvl>
+    <w:lvl w:ilvl="3" w:tplc="040E000F" w:tentative="1">
+      <w:start w:val="1"/>
+      <w:numFmt w:val="decimal"/>
+      <w:lvlText w:val="%4."/>
+      <w:lvlJc w:val="left"/>
+      <w:pPr>
+        <w:ind w:left="2880" w:hanging="360"/>
+      </w:pPr>
+    </w:lvl>
+    <w:lvl w:ilvl="4" w:tplc="040E0019" w:tentative="1">
+      <w:start w:val="1"/>
+      <w:numFmt w:val="lowerLetter"/>
+      <w:lvlText w:val="%5."/>
+      <w:lvlJc w:val="left"/>
+      <w:pPr>
+        <w:ind w:left="3600" w:hanging="360"/>
+      </w:pPr>
+    </w:lvl>
+    <w:lvl w:ilvl="5" w:tplc="040E001B" w:tentative="1">
+      <w:start w:val="1"/>
+      <w:numFmt w:val="lowerRoman"/>
+      <w:lvlText w:val="%6."/>
+      <w:lvlJc w:val="right"/>
+      <w:pPr>
+        <w:ind w:left="4320" w:hanging="180"/>
+      </w:pPr>
+    </w:lvl>
+    <w:lvl w:ilvl="6" w:tplc="040E000F" w:tentative="1">
+      <w:start w:val="1"/>
+      <w:numFmt w:val="decimal"/>
+      <w:lvlText w:val="%7."/>
+      <w:lvlJc w:val="left"/>
+      <w:pPr>
+        <w:ind w:left="5040" w:hanging="360"/>
+      </w:pPr>
+    </w:lvl>
+    <w:lvl w:ilvl="7" w:tplc="040E0019" w:tentative="1">
+      <w:start w:val="1"/>
+      <w:numFmt w:val="lowerLetter"/>
+      <w:lvlText w:val="%8."/>
+      <w:lvlJc w:val="left"/>
+      <w:pPr>
+        <w:ind w:left="5760" w:hanging="360"/>
+      </w:pPr>
+    </w:lvl>
+    <w:lvl w:ilvl="8" w:tplc="040E001B" w:tentative="1">
+      <w:start w:val="1"/>
+      <w:numFmt w:val="lowerRoman"/>
+      <w:lvlText w:val="%9."/>
+      <w:lvlJc w:val="right"/>
+      <w:pPr>
+        <w:ind w:left="6480" w:hanging="180"/>
+      </w:pPr>
     </w:lvl>
   </w:abstractNum>
   <w:num w:numId="1" w16cid:durableId="2006391963">
@@ -3808,6 +4337,18 @@
     <w:abstractNumId w:val="0"/>
   </w:num>
   <w:num w:numId="10" w16cid:durableId="66340611">
+    <w:abstractNumId w:val="10"/>
+  </w:num>
+  <w:num w:numId="11" w16cid:durableId="379867245">
+    <w:abstractNumId w:val="13"/>
+  </w:num>
+  <w:num w:numId="12" w16cid:durableId="593174970">
+    <w:abstractNumId w:val="12"/>
+  </w:num>
+  <w:num w:numId="13" w16cid:durableId="1073702021">
+    <w:abstractNumId w:val="11"/>
+  </w:num>
+  <w:num w:numId="14" w16cid:durableId="71974011">
     <w:abstractNumId w:val="9"/>
   </w:num>
 </w:numbering>
@@ -4416,6 +4957,7 @@
   <w:style w:type="character" w:default="1" w:styleId="Bekezdsalapbettpusa">
     <w:name w:val="Default Paragraph Font"/>
     <w:uiPriority w:val="1"/>
+    <w:semiHidden/>
     <w:unhideWhenUsed/>
   </w:style>
   <w:style w:type="table" w:default="1" w:styleId="Normltblzat">

</xml_diff>

<commit_message>
Nyíl darabszámának lekezelése és megjelenítése, usePotion animáci hozzárendelése a potion használathoz
</commit_message>
<xml_diff>
--- a/DarkWoodPlatformer_GDD.docx
+++ b/DarkWoodPlatformer_GDD.docx
@@ -7,11 +7,13 @@
         <w:pStyle w:val="Cm"/>
         <w:rPr>
           <w:rFonts w:ascii="Avenir Next LT Pro Light" w:hAnsi="Avenir Next LT Pro Light"/>
+          <w:lang w:val="hu-HU"/>
         </w:rPr>
       </w:pPr>
       <w:r>
         <w:rPr>
           <w:rFonts w:ascii="Avenir Next LT Pro Light" w:hAnsi="Avenir Next LT Pro Light"/>
+          <w:lang w:val="hu-HU"/>
         </w:rPr>
         <w:t>DarkWoodPlatformer – Game Design Document (GDD)</w:t>
       </w:r>
@@ -21,11 +23,13 @@
         <w:pStyle w:val="Cmsor1"/>
         <w:rPr>
           <w:rFonts w:ascii="Avenir Next LT Pro Light" w:hAnsi="Avenir Next LT Pro Light"/>
+          <w:lang w:val="hu-HU"/>
         </w:rPr>
       </w:pPr>
       <w:r>
         <w:rPr>
           <w:rFonts w:ascii="Avenir Next LT Pro Light" w:hAnsi="Avenir Next LT Pro Light"/>
+          <w:lang w:val="hu-HU"/>
         </w:rPr>
         <w:t>1. Alapinformációk</w:t>
       </w:r>
@@ -53,6 +57,7 @@
                 <w:bCs/>
                 <w:sz w:val="24"/>
                 <w:szCs w:val="24"/>
+                <w:lang w:val="hu-HU"/>
               </w:rPr>
             </w:pPr>
             <w:r>
@@ -62,6 +67,7 @@
                 <w:bCs/>
                 <w:sz w:val="24"/>
                 <w:szCs w:val="24"/>
+                <w:lang w:val="hu-HU"/>
               </w:rPr>
               <w:t>Műfaj</w:t>
             </w:r>
@@ -77,6 +83,7 @@
                 <w:rFonts w:ascii="Avenir Next LT Pro Light" w:hAnsi="Avenir Next LT Pro Light"/>
                 <w:sz w:val="24"/>
                 <w:szCs w:val="24"/>
+                <w:lang w:val="hu-HU"/>
               </w:rPr>
             </w:pPr>
             <w:r>
@@ -84,6 +91,7 @@
                 <w:rFonts w:ascii="Avenir Next LT Pro Light" w:hAnsi="Avenir Next LT Pro Light"/>
                 <w:sz w:val="24"/>
                 <w:szCs w:val="24"/>
+                <w:lang w:val="hu-HU"/>
               </w:rPr>
               <w:t>2D pixel art platformer, soulslike elemekkel</w:t>
             </w:r>
@@ -103,6 +111,7 @@
                 <w:bCs/>
                 <w:sz w:val="24"/>
                 <w:szCs w:val="24"/>
+                <w:lang w:val="hu-HU"/>
               </w:rPr>
             </w:pPr>
             <w:r>
@@ -112,6 +121,7 @@
                 <w:bCs/>
                 <w:sz w:val="24"/>
                 <w:szCs w:val="24"/>
+                <w:lang w:val="hu-HU"/>
               </w:rPr>
               <w:t>Engine</w:t>
             </w:r>
@@ -127,6 +137,7 @@
                 <w:rFonts w:ascii="Avenir Next LT Pro Light" w:hAnsi="Avenir Next LT Pro Light"/>
                 <w:sz w:val="24"/>
                 <w:szCs w:val="24"/>
+                <w:lang w:val="hu-HU"/>
               </w:rPr>
             </w:pPr>
             <w:r>
@@ -134,6 +145,7 @@
                 <w:rFonts w:ascii="Avenir Next LT Pro Light" w:hAnsi="Avenir Next LT Pro Light"/>
                 <w:sz w:val="24"/>
                 <w:szCs w:val="24"/>
+                <w:lang w:val="hu-HU"/>
               </w:rPr>
               <w:t>Unity</w:t>
             </w:r>
@@ -153,6 +165,7 @@
                 <w:bCs/>
                 <w:sz w:val="24"/>
                 <w:szCs w:val="24"/>
+                <w:lang w:val="hu-HU"/>
               </w:rPr>
             </w:pPr>
             <w:r>
@@ -162,6 +175,7 @@
                 <w:bCs/>
                 <w:sz w:val="24"/>
                 <w:szCs w:val="24"/>
+                <w:lang w:val="hu-HU"/>
               </w:rPr>
               <w:t>Grafikai stílus</w:t>
             </w:r>
@@ -177,6 +191,7 @@
                 <w:rFonts w:ascii="Avenir Next LT Pro Light" w:hAnsi="Avenir Next LT Pro Light"/>
                 <w:sz w:val="24"/>
                 <w:szCs w:val="24"/>
+                <w:lang w:val="hu-HU"/>
               </w:rPr>
             </w:pPr>
             <w:r>
@@ -184,6 +199,7 @@
                 <w:rFonts w:ascii="Avenir Next LT Pro Light" w:hAnsi="Avenir Next LT Pro Light"/>
                 <w:sz w:val="24"/>
                 <w:szCs w:val="24"/>
+                <w:lang w:val="hu-HU"/>
               </w:rPr>
               <w:t>Dark fantasy, dark wood és középkori hangulat, pixel art</w:t>
             </w:r>
@@ -203,6 +219,7 @@
                 <w:bCs/>
                 <w:sz w:val="24"/>
                 <w:szCs w:val="24"/>
+                <w:lang w:val="hu-HU"/>
               </w:rPr>
             </w:pPr>
             <w:r>
@@ -212,6 +229,7 @@
                 <w:bCs/>
                 <w:sz w:val="24"/>
                 <w:szCs w:val="24"/>
+                <w:lang w:val="hu-HU"/>
               </w:rPr>
               <w:t>Célplatform</w:t>
             </w:r>
@@ -227,6 +245,7 @@
                 <w:rFonts w:ascii="Avenir Next LT Pro Light" w:hAnsi="Avenir Next LT Pro Light"/>
                 <w:sz w:val="24"/>
                 <w:szCs w:val="24"/>
+                <w:lang w:val="hu-HU"/>
               </w:rPr>
             </w:pPr>
             <w:r>
@@ -234,6 +253,7 @@
                 <w:rFonts w:ascii="Avenir Next LT Pro Light" w:hAnsi="Avenir Next LT Pro Light"/>
                 <w:sz w:val="24"/>
                 <w:szCs w:val="24"/>
+                <w:lang w:val="hu-HU"/>
               </w:rPr>
               <w:t>PC (Windows)</w:t>
             </w:r>
@@ -253,6 +273,7 @@
                 <w:bCs/>
                 <w:sz w:val="24"/>
                 <w:szCs w:val="24"/>
+                <w:lang w:val="hu-HU"/>
               </w:rPr>
             </w:pPr>
             <w:r>
@@ -262,6 +283,7 @@
                 <w:bCs/>
                 <w:sz w:val="24"/>
                 <w:szCs w:val="24"/>
+                <w:lang w:val="hu-HU"/>
               </w:rPr>
               <w:t>Célközönség</w:t>
             </w:r>
@@ -277,6 +299,7 @@
                 <w:rFonts w:ascii="Avenir Next LT Pro Light" w:hAnsi="Avenir Next LT Pro Light"/>
                 <w:sz w:val="24"/>
                 <w:szCs w:val="24"/>
+                <w:lang w:val="hu-HU"/>
               </w:rPr>
             </w:pPr>
             <w:r>
@@ -284,6 +307,7 @@
                 <w:rFonts w:ascii="Avenir Next LT Pro Light" w:hAnsi="Avenir Next LT Pro Light"/>
                 <w:sz w:val="24"/>
                 <w:szCs w:val="24"/>
+                <w:lang w:val="hu-HU"/>
               </w:rPr>
               <w:t>Soulslike / nehéz platformer rajongók</w:t>
             </w:r>
@@ -303,6 +327,7 @@
                 <w:bCs/>
                 <w:sz w:val="24"/>
                 <w:szCs w:val="24"/>
+                <w:lang w:val="hu-HU"/>
               </w:rPr>
             </w:pPr>
             <w:r>
@@ -312,6 +337,7 @@
                 <w:bCs/>
                 <w:sz w:val="24"/>
                 <w:szCs w:val="24"/>
+                <w:lang w:val="hu-HU"/>
               </w:rPr>
               <w:t>Fejlesztési cél</w:t>
             </w:r>
@@ -327,6 +353,7 @@
                 <w:rFonts w:ascii="Avenir Next LT Pro Light" w:hAnsi="Avenir Next LT Pro Light"/>
                 <w:sz w:val="24"/>
                 <w:szCs w:val="24"/>
+                <w:lang w:val="hu-HU"/>
               </w:rPr>
             </w:pPr>
             <w:r>
@@ -334,6 +361,7 @@
                 <w:rFonts w:ascii="Avenir Next LT Pro Light" w:hAnsi="Avenir Next LT Pro Light"/>
                 <w:sz w:val="24"/>
                 <w:szCs w:val="24"/>
+                <w:lang w:val="hu-HU"/>
               </w:rPr>
               <w:t>Egy 4–5 pályás, kihívásokkal teli, boss fight-tal záruló történeti játék</w:t>
             </w:r>
@@ -353,6 +381,7 @@
                 <w:bCs/>
                 <w:sz w:val="24"/>
                 <w:szCs w:val="24"/>
+                <w:lang w:val="hu-HU"/>
               </w:rPr>
             </w:pPr>
             <w:r>
@@ -362,6 +391,7 @@
                 <w:bCs/>
                 <w:sz w:val="24"/>
                 <w:szCs w:val="24"/>
+                <w:lang w:val="hu-HU"/>
               </w:rPr>
               <w:t>Kameranézet</w:t>
             </w:r>
@@ -377,6 +407,7 @@
                 <w:rFonts w:ascii="Avenir Next LT Pro Light" w:hAnsi="Avenir Next LT Pro Light"/>
                 <w:sz w:val="24"/>
                 <w:szCs w:val="24"/>
+                <w:lang w:val="hu-HU"/>
               </w:rPr>
             </w:pPr>
             <w:r>
@@ -384,6 +415,7 @@
                 <w:rFonts w:ascii="Avenir Next LT Pro Light" w:hAnsi="Avenir Next LT Pro Light"/>
                 <w:sz w:val="24"/>
                 <w:szCs w:val="24"/>
+                <w:lang w:val="hu-HU"/>
               </w:rPr>
               <w:t>Oldalnézet (Side-scroller)</w:t>
             </w:r>
@@ -396,11 +428,13 @@
         <w:pStyle w:val="Cmsor1"/>
         <w:rPr>
           <w:rFonts w:ascii="Avenir Next LT Pro Light" w:hAnsi="Avenir Next LT Pro Light"/>
+          <w:lang w:val="hu-HU"/>
         </w:rPr>
       </w:pPr>
       <w:r>
         <w:rPr>
           <w:rFonts w:ascii="Avenir Next LT Pro Light" w:hAnsi="Avenir Next LT Pro Light"/>
+          <w:lang w:val="hu-HU"/>
         </w:rPr>
         <w:t>2. Történet és világ</w:t>
       </w:r>
@@ -412,6 +446,7 @@
           <w:rFonts w:ascii="Avenir Next LT Pro Light" w:hAnsi="Avenir Next LT Pro Light"/>
           <w:sz w:val="24"/>
           <w:szCs w:val="24"/>
+          <w:lang w:val="hu-HU"/>
         </w:rPr>
       </w:pPr>
       <w:r>
@@ -420,6 +455,7 @@
           <w:b/>
           <w:sz w:val="24"/>
           <w:szCs w:val="24"/>
+          <w:lang w:val="hu-HU"/>
         </w:rPr>
         <w:t>Rövid előzmény</w:t>
       </w:r>
@@ -431,6 +467,7 @@
           <w:rFonts w:ascii="Avenir Next LT Pro Light" w:hAnsi="Avenir Next LT Pro Light"/>
           <w:sz w:val="24"/>
           <w:szCs w:val="24"/>
+          <w:lang w:val="hu-HU"/>
         </w:rPr>
       </w:pPr>
       <w:r>
@@ -438,6 +475,7 @@
           <w:rFonts w:ascii="Avenir Next LT Pro Light" w:hAnsi="Avenir Next LT Pro Light"/>
           <w:sz w:val="24"/>
           <w:szCs w:val="24"/>
+          <w:lang w:val="hu-HU"/>
         </w:rPr>
         <w:t>A játékos egy elátkozott erdő mélyén ébred, ahol egy sötét varázsló (főboss) tartja fogva a királylányt. A kastélyba vezető út veszélyes – elhagyatott börtönökön, lávával teli bányákon és az erdőn keresztül vezet. Minden checkpoint felébreszti a környék szörnyeit, a túlélés kulcsa pedig a harc és a fejlődés.</w:t>
       </w:r>
@@ -449,6 +487,7 @@
           <w:rFonts w:ascii="Avenir Next LT Pro Light" w:hAnsi="Avenir Next LT Pro Light"/>
           <w:sz w:val="24"/>
           <w:szCs w:val="24"/>
+          <w:lang w:val="hu-HU"/>
         </w:rPr>
       </w:pPr>
       <w:r>
@@ -457,6 +496,7 @@
           <w:b/>
           <w:sz w:val="24"/>
           <w:szCs w:val="24"/>
+          <w:lang w:val="hu-HU"/>
         </w:rPr>
         <w:t>Hangulat</w:t>
       </w:r>
@@ -468,6 +508,7 @@
           <w:rFonts w:ascii="Avenir Next LT Pro Light" w:hAnsi="Avenir Next LT Pro Light"/>
           <w:sz w:val="24"/>
           <w:szCs w:val="24"/>
+          <w:lang w:val="hu-HU"/>
         </w:rPr>
       </w:pPr>
       <w:r>
@@ -475,6 +516,7 @@
           <w:rFonts w:ascii="Avenir Next LT Pro Light" w:hAnsi="Avenir Next LT Pro Light"/>
           <w:sz w:val="24"/>
           <w:szCs w:val="24"/>
+          <w:lang w:val="hu-HU"/>
         </w:rPr>
         <w:t>- Komor, sötét tónusú világítás</w:t>
       </w:r>
@@ -483,6 +525,7 @@
           <w:rFonts w:ascii="Avenir Next LT Pro Light" w:hAnsi="Avenir Next LT Pro Light"/>
           <w:sz w:val="24"/>
           <w:szCs w:val="24"/>
+          <w:lang w:val="hu-HU"/>
         </w:rPr>
         <w:br/>
         <w:t>- Zord, veszélyes környezet</w:t>
@@ -492,6 +535,7 @@
           <w:rFonts w:ascii="Avenir Next LT Pro Light" w:hAnsi="Avenir Next LT Pro Light"/>
           <w:sz w:val="24"/>
           <w:szCs w:val="24"/>
+          <w:lang w:val="hu-HU"/>
         </w:rPr>
         <w:br/>
         <w:t>- Lassú, nyomasztó zenei aláfestés az erdőben; intenzív, gyors zene a boss harcokhoz</w:t>
@@ -502,11 +546,13 @@
         <w:pStyle w:val="Cmsor1"/>
         <w:rPr>
           <w:rFonts w:ascii="Avenir Next LT Pro Light" w:hAnsi="Avenir Next LT Pro Light"/>
+          <w:lang w:val="hu-HU"/>
         </w:rPr>
       </w:pPr>
       <w:r>
         <w:rPr>
           <w:rFonts w:ascii="Avenir Next LT Pro Light" w:hAnsi="Avenir Next LT Pro Light"/>
+          <w:lang w:val="hu-HU"/>
         </w:rPr>
         <w:t>3. Játékmenet</w:t>
       </w:r>
@@ -524,6 +570,7 @@
           <w:rFonts w:ascii="Avenir Next LT Pro Light" w:hAnsi="Avenir Next LT Pro Light"/>
           <w:sz w:val="24"/>
           <w:szCs w:val="24"/>
+          <w:lang w:val="hu-HU"/>
         </w:rPr>
       </w:pPr>
       <w:r>
@@ -531,6 +578,7 @@
           <w:rFonts w:ascii="Avenir Next LT Pro Light" w:hAnsi="Avenir Next LT Pro Light"/>
           <w:sz w:val="24"/>
           <w:szCs w:val="24"/>
+          <w:lang w:val="hu-HU"/>
         </w:rPr>
         <w:t>Mozgás: Balra/jobbra mozgás, ugrás, csúszás (slide), falmászás, felkapaszkodás.</w:t>
       </w:r>
@@ -548,6 +596,7 @@
           <w:rFonts w:ascii="Avenir Next LT Pro Light" w:hAnsi="Avenir Next LT Pro Light"/>
           <w:sz w:val="24"/>
           <w:szCs w:val="24"/>
+          <w:lang w:val="hu-HU"/>
         </w:rPr>
       </w:pPr>
       <w:r>
@@ -555,6 +604,7 @@
           <w:rFonts w:ascii="Avenir Next LT Pro Light" w:hAnsi="Avenir Next LT Pro Light"/>
           <w:sz w:val="24"/>
           <w:szCs w:val="24"/>
+          <w:lang w:val="hu-HU"/>
         </w:rPr>
         <w:t>Harc: Kard (közelharc, 3 ütéses kombó földön és levegőben), íj (távolsági fegyver</w:t>
       </w:r>
@@ -563,6 +613,7 @@
           <w:rFonts w:ascii="Avenir Next LT Pro Light" w:hAnsi="Avenir Next LT Pro Light"/>
           <w:sz w:val="24"/>
           <w:szCs w:val="24"/>
+          <w:lang w:val="hu-HU"/>
         </w:rPr>
         <w:t xml:space="preserve"> és később kapjuk meg és korlátozott ammo van hozzá</w:t>
       </w:r>
@@ -571,6 +622,7 @@
           <w:rFonts w:ascii="Avenir Next LT Pro Light" w:hAnsi="Avenir Next LT Pro Light"/>
           <w:sz w:val="24"/>
           <w:szCs w:val="24"/>
+          <w:lang w:val="hu-HU"/>
         </w:rPr>
         <w:t>).</w:t>
       </w:r>
@@ -588,6 +640,7 @@
           <w:rFonts w:ascii="Avenir Next LT Pro Light" w:hAnsi="Avenir Next LT Pro Light"/>
           <w:sz w:val="24"/>
           <w:szCs w:val="24"/>
+          <w:lang w:val="hu-HU"/>
         </w:rPr>
       </w:pPr>
       <w:r>
@@ -595,6 +648,7 @@
           <w:rFonts w:ascii="Avenir Next LT Pro Light" w:hAnsi="Avenir Next LT Pro Light"/>
           <w:sz w:val="24"/>
           <w:szCs w:val="24"/>
+          <w:lang w:val="hu-HU"/>
         </w:rPr>
         <w:t>Fejlődés: XP gyűjtése enemy-k legyőzésével, skill tree.</w:t>
       </w:r>
@@ -612,6 +666,7 @@
           <w:rFonts w:ascii="Avenir Next LT Pro Light" w:hAnsi="Avenir Next LT Pro Light"/>
           <w:sz w:val="24"/>
           <w:szCs w:val="24"/>
+          <w:lang w:val="hu-HU"/>
         </w:rPr>
       </w:pPr>
       <w:r>
@@ -619,6 +674,7 @@
           <w:rFonts w:ascii="Avenir Next LT Pro Light" w:hAnsi="Avenir Next LT Pro Light"/>
           <w:sz w:val="24"/>
           <w:szCs w:val="24"/>
+          <w:lang w:val="hu-HU"/>
         </w:rPr>
         <w:lastRenderedPageBreak/>
         <w:t>Checkpoint rendszer: Mentési pontok</w:t>
@@ -628,6 +684,7 @@
           <w:rFonts w:ascii="Avenir Next LT Pro Light" w:hAnsi="Avenir Next LT Pro Light"/>
           <w:sz w:val="24"/>
           <w:szCs w:val="24"/>
+          <w:lang w:val="hu-HU"/>
         </w:rPr>
         <w:t>, teleportálása hub-ba</w:t>
       </w:r>
@@ -636,6 +693,7 @@
           <w:rFonts w:ascii="Avenir Next LT Pro Light" w:hAnsi="Avenir Next LT Pro Light"/>
           <w:sz w:val="24"/>
           <w:szCs w:val="24"/>
+          <w:lang w:val="hu-HU"/>
         </w:rPr>
         <w:t>.</w:t>
       </w:r>
@@ -653,6 +711,7 @@
           <w:rFonts w:ascii="Avenir Next LT Pro Light" w:hAnsi="Avenir Next LT Pro Light"/>
           <w:sz w:val="24"/>
           <w:szCs w:val="24"/>
+          <w:lang w:val="hu-HU"/>
         </w:rPr>
       </w:pPr>
       <w:r>
@@ -660,6 +719,7 @@
           <w:rFonts w:ascii="Avenir Next LT Pro Light" w:hAnsi="Avenir Next LT Pro Light"/>
           <w:sz w:val="24"/>
           <w:szCs w:val="24"/>
+          <w:lang w:val="hu-HU"/>
         </w:rPr>
         <w:t xml:space="preserve">Gyógyítás: </w:t>
       </w:r>
@@ -668,6 +728,7 @@
           <w:rFonts w:ascii="Avenir Next LT Pro Light" w:hAnsi="Avenir Next LT Pro Light"/>
           <w:sz w:val="24"/>
           <w:szCs w:val="24"/>
+          <w:lang w:val="hu-HU"/>
         </w:rPr>
         <w:t xml:space="preserve">Health potion az </w:t>
       </w:r>
@@ -676,6 +737,7 @@
           <w:rFonts w:ascii="Avenir Next LT Pro Light" w:hAnsi="Avenir Next LT Pro Light"/>
           <w:sz w:val="24"/>
           <w:szCs w:val="24"/>
+          <w:lang w:val="hu-HU"/>
         </w:rPr>
         <w:t>inventory</w:t>
       </w:r>
@@ -684,6 +746,7 @@
           <w:rFonts w:ascii="Avenir Next LT Pro Light" w:hAnsi="Avenir Next LT Pro Light"/>
           <w:sz w:val="24"/>
           <w:szCs w:val="24"/>
+          <w:lang w:val="hu-HU"/>
         </w:rPr>
         <w:t>-ban</w:t>
       </w:r>
@@ -692,6 +755,7 @@
           <w:rFonts w:ascii="Avenir Next LT Pro Light" w:hAnsi="Avenir Next LT Pro Light"/>
           <w:sz w:val="24"/>
           <w:szCs w:val="24"/>
+          <w:lang w:val="hu-HU"/>
         </w:rPr>
         <w:t>.</w:t>
       </w:r>
@@ -709,6 +773,7 @@
           <w:rFonts w:ascii="Avenir Next LT Pro Light" w:hAnsi="Avenir Next LT Pro Light"/>
           <w:sz w:val="24"/>
           <w:szCs w:val="24"/>
+          <w:lang w:val="hu-HU"/>
         </w:rPr>
       </w:pPr>
       <w:r>
@@ -716,6 +781,7 @@
           <w:rFonts w:ascii="Avenir Next LT Pro Light" w:hAnsi="Avenir Next LT Pro Light"/>
           <w:sz w:val="24"/>
           <w:szCs w:val="24"/>
+          <w:lang w:val="hu-HU"/>
         </w:rPr>
         <w:t>NPC-k: Idle animáció, játékosra fordulás, párbeszéd UI.</w:t>
       </w:r>
@@ -733,6 +799,7 @@
           <w:rFonts w:ascii="Avenir Next LT Pro Light" w:hAnsi="Avenir Next LT Pro Light"/>
           <w:sz w:val="24"/>
           <w:szCs w:val="24"/>
+          <w:lang w:val="hu-HU"/>
         </w:rPr>
       </w:pPr>
       <w:r>
@@ -740,6 +807,7 @@
           <w:rFonts w:ascii="Avenir Next LT Pro Light" w:hAnsi="Avenir Next LT Pro Light"/>
           <w:sz w:val="24"/>
           <w:szCs w:val="24"/>
+          <w:lang w:val="hu-HU"/>
         </w:rPr>
         <w:t>Boss fight: Több fázisú főboss, HP bar felül.</w:t>
       </w:r>
@@ -757,6 +825,7 @@
           <w:rFonts w:ascii="Avenir Next LT Pro Light" w:hAnsi="Avenir Next LT Pro Light"/>
           <w:sz w:val="24"/>
           <w:szCs w:val="24"/>
+          <w:lang w:val="hu-HU"/>
         </w:rPr>
       </w:pPr>
       <w:r>
@@ -764,6 +833,7 @@
           <w:rFonts w:ascii="Avenir Next LT Pro Light" w:hAnsi="Avenir Next LT Pro Light"/>
           <w:sz w:val="24"/>
           <w:szCs w:val="24"/>
+          <w:lang w:val="hu-HU"/>
         </w:rPr>
         <w:t>Küldetések: Opcionális quest log UI.</w:t>
       </w:r>
@@ -781,6 +851,7 @@
           <w:rFonts w:ascii="Avenir Next LT Pro Light" w:hAnsi="Avenir Next LT Pro Light"/>
           <w:sz w:val="24"/>
           <w:szCs w:val="24"/>
+          <w:lang w:val="hu-HU"/>
         </w:rPr>
       </w:pPr>
       <w:r>
@@ -788,6 +859,7 @@
           <w:rFonts w:ascii="Avenir Next LT Pro Light" w:hAnsi="Avenir Next LT Pro Light"/>
           <w:sz w:val="24"/>
           <w:szCs w:val="24"/>
+          <w:lang w:val="hu-HU"/>
         </w:rPr>
         <w:t>Térkép: Egyszerű minimap player markerrel.</w:t>
       </w:r>
@@ -805,6 +877,7 @@
           <w:rFonts w:ascii="Avenir Next LT Pro Light" w:hAnsi="Avenir Next LT Pro Light"/>
           <w:sz w:val="24"/>
           <w:szCs w:val="24"/>
+          <w:lang w:val="hu-HU"/>
         </w:rPr>
       </w:pPr>
       <w:r>
@@ -812,6 +885,7 @@
           <w:rFonts w:ascii="Avenir Next LT Pro Light" w:hAnsi="Avenir Next LT Pro Light"/>
           <w:sz w:val="24"/>
           <w:szCs w:val="24"/>
+          <w:lang w:val="hu-HU"/>
         </w:rPr>
         <w:t>Hub rendszer</w:t>
       </w:r>
@@ -822,6 +896,7 @@
           <w:bCs/>
           <w:sz w:val="24"/>
           <w:szCs w:val="24"/>
+          <w:lang w:val="hu-HU"/>
         </w:rPr>
         <w:t>:</w:t>
       </w:r>
@@ -830,8 +905,27 @@
           <w:rFonts w:ascii="Avenir Next LT Pro Light" w:hAnsi="Avenir Next LT Pro Light"/>
           <w:sz w:val="24"/>
           <w:szCs w:val="24"/>
+          <w:lang w:val="hu-HU"/>
         </w:rPr>
-        <w:t xml:space="preserve"> Minden checkpointból visszateleportálhatunk egy központi hub területre, ahol biztonságban vagyunk. Itt találhatóak a fejlesztési lehetőségek (skill tree, potion fejlesztés, fegyver upgrade). A hub a játék fő bázisa, ahonnan visszatérhetünk a kalandhoz.</w:t>
+        <w:t xml:space="preserve"> Minden checkpointból vissza</w:t>
+      </w:r>
+      <w:r>
+        <w:rPr>
+          <w:rFonts w:ascii="Avenir Next LT Pro Light" w:hAnsi="Avenir Next LT Pro Light"/>
+          <w:sz w:val="24"/>
+          <w:szCs w:val="24"/>
+          <w:lang w:val="hu-HU"/>
+        </w:rPr>
+        <w:t xml:space="preserve"> </w:t>
+      </w:r>
+      <w:r>
+        <w:rPr>
+          <w:rFonts w:ascii="Avenir Next LT Pro Light" w:hAnsi="Avenir Next LT Pro Light"/>
+          <w:sz w:val="24"/>
+          <w:szCs w:val="24"/>
+          <w:lang w:val="hu-HU"/>
+        </w:rPr>
+        <w:t>teleportálhatunk egy központi hub területre, ahol biztonságban vagyunk. Itt találhatóak a fejlesztési lehetőségek (skill tree, potion fejlesztés, fegyver upgrade). A hub a játék fő bázisa, ahonnan visszatérhetünk a kalandhoz.</w:t>
       </w:r>
     </w:p>
     <w:p>
@@ -839,11 +933,13 @@
         <w:pStyle w:val="Cmsor1"/>
         <w:rPr>
           <w:rFonts w:ascii="Avenir Next LT Pro Light" w:hAnsi="Avenir Next LT Pro Light"/>
+          <w:lang w:val="hu-HU"/>
         </w:rPr>
       </w:pPr>
       <w:r>
         <w:rPr>
           <w:rFonts w:ascii="Avenir Next LT Pro Light" w:hAnsi="Avenir Next LT Pro Light"/>
+          <w:lang w:val="hu-HU"/>
         </w:rPr>
         <w:t>4. UI / HUD</w:t>
       </w:r>
@@ -873,6 +969,7 @@
                 <w:bCs/>
                 <w:sz w:val="24"/>
                 <w:szCs w:val="24"/>
+                <w:lang w:val="hu-HU"/>
               </w:rPr>
             </w:pPr>
             <w:r>
@@ -882,6 +979,7 @@
                 <w:bCs/>
                 <w:sz w:val="24"/>
                 <w:szCs w:val="24"/>
+                <w:lang w:val="hu-HU"/>
               </w:rPr>
               <w:t>Elem</w:t>
             </w:r>
@@ -899,6 +997,7 @@
                 <w:bCs/>
                 <w:sz w:val="24"/>
                 <w:szCs w:val="24"/>
+                <w:lang w:val="hu-HU"/>
               </w:rPr>
             </w:pPr>
             <w:r>
@@ -908,6 +1007,7 @@
                 <w:bCs/>
                 <w:sz w:val="24"/>
                 <w:szCs w:val="24"/>
+                <w:lang w:val="hu-HU"/>
               </w:rPr>
               <w:t>Pozíció</w:t>
             </w:r>
@@ -925,6 +1025,7 @@
                 <w:bCs/>
                 <w:sz w:val="24"/>
                 <w:szCs w:val="24"/>
+                <w:lang w:val="hu-HU"/>
               </w:rPr>
             </w:pPr>
             <w:r>
@@ -934,6 +1035,7 @@
                 <w:bCs/>
                 <w:sz w:val="24"/>
                 <w:szCs w:val="24"/>
+                <w:lang w:val="hu-HU"/>
               </w:rPr>
               <w:t>Funkció</w:t>
             </w:r>
@@ -951,6 +1053,7 @@
                 <w:rFonts w:ascii="Avenir Next LT Pro Light" w:hAnsi="Avenir Next LT Pro Light"/>
                 <w:sz w:val="24"/>
                 <w:szCs w:val="24"/>
+                <w:lang w:val="hu-HU"/>
               </w:rPr>
             </w:pPr>
             <w:r>
@@ -958,6 +1061,7 @@
                 <w:rFonts w:ascii="Avenir Next LT Pro Light" w:hAnsi="Avenir Next LT Pro Light"/>
                 <w:sz w:val="24"/>
                 <w:szCs w:val="24"/>
+                <w:lang w:val="hu-HU"/>
               </w:rPr>
               <w:t>HP bar</w:t>
             </w:r>
@@ -973,6 +1077,7 @@
                 <w:rFonts w:ascii="Avenir Next LT Pro Light" w:hAnsi="Avenir Next LT Pro Light"/>
                 <w:sz w:val="24"/>
                 <w:szCs w:val="24"/>
+                <w:lang w:val="hu-HU"/>
               </w:rPr>
             </w:pPr>
             <w:r>
@@ -980,6 +1085,7 @@
                 <w:rFonts w:ascii="Avenir Next LT Pro Light" w:hAnsi="Avenir Next LT Pro Light"/>
                 <w:sz w:val="24"/>
                 <w:szCs w:val="24"/>
+                <w:lang w:val="hu-HU"/>
               </w:rPr>
               <w:t>Bal felső</w:t>
             </w:r>
@@ -995,6 +1101,7 @@
                 <w:rFonts w:ascii="Avenir Next LT Pro Light" w:hAnsi="Avenir Next LT Pro Light"/>
                 <w:sz w:val="24"/>
                 <w:szCs w:val="24"/>
+                <w:lang w:val="hu-HU"/>
               </w:rPr>
             </w:pPr>
             <w:r>
@@ -1002,6 +1109,7 @@
                 <w:rFonts w:ascii="Avenir Next LT Pro Light" w:hAnsi="Avenir Next LT Pro Light"/>
                 <w:sz w:val="24"/>
                 <w:szCs w:val="24"/>
+                <w:lang w:val="hu-HU"/>
               </w:rPr>
               <w:t>Játékos életereje</w:t>
             </w:r>
@@ -1019,6 +1127,7 @@
                 <w:rFonts w:ascii="Avenir Next LT Pro Light" w:hAnsi="Avenir Next LT Pro Light"/>
                 <w:sz w:val="24"/>
                 <w:szCs w:val="24"/>
+                <w:lang w:val="hu-HU"/>
               </w:rPr>
             </w:pPr>
             <w:r>
@@ -1026,6 +1135,7 @@
                 <w:rFonts w:ascii="Avenir Next LT Pro Light" w:hAnsi="Avenir Next LT Pro Light"/>
                 <w:sz w:val="24"/>
                 <w:szCs w:val="24"/>
+                <w:lang w:val="hu-HU"/>
               </w:rPr>
               <w:t>XP bar</w:t>
             </w:r>
@@ -1041,6 +1151,7 @@
                 <w:rFonts w:ascii="Avenir Next LT Pro Light" w:hAnsi="Avenir Next LT Pro Light"/>
                 <w:sz w:val="24"/>
                 <w:szCs w:val="24"/>
+                <w:lang w:val="hu-HU"/>
               </w:rPr>
             </w:pPr>
             <w:r>
@@ -1048,6 +1159,7 @@
                 <w:rFonts w:ascii="Avenir Next LT Pro Light" w:hAnsi="Avenir Next LT Pro Light"/>
                 <w:sz w:val="24"/>
                 <w:szCs w:val="24"/>
+                <w:lang w:val="hu-HU"/>
               </w:rPr>
               <w:t>Jobb felső / HP alatt</w:t>
             </w:r>
@@ -1063,6 +1175,7 @@
                 <w:rFonts w:ascii="Avenir Next LT Pro Light" w:hAnsi="Avenir Next LT Pro Light"/>
                 <w:sz w:val="24"/>
                 <w:szCs w:val="24"/>
+                <w:lang w:val="hu-HU"/>
               </w:rPr>
             </w:pPr>
             <w:r>
@@ -1070,6 +1183,7 @@
                 <w:rFonts w:ascii="Avenir Next LT Pro Light" w:hAnsi="Avenir Next LT Pro Light"/>
                 <w:sz w:val="24"/>
                 <w:szCs w:val="24"/>
+                <w:lang w:val="hu-HU"/>
               </w:rPr>
               <w:t>Játékos tapasztalata</w:t>
             </w:r>
@@ -1087,6 +1201,7 @@
                 <w:rFonts w:ascii="Avenir Next LT Pro Light" w:hAnsi="Avenir Next LT Pro Light"/>
                 <w:sz w:val="24"/>
                 <w:szCs w:val="24"/>
+                <w:lang w:val="hu-HU"/>
               </w:rPr>
             </w:pPr>
             <w:r>
@@ -1094,6 +1209,7 @@
                 <w:rFonts w:ascii="Avenir Next LT Pro Light" w:hAnsi="Avenir Next LT Pro Light"/>
                 <w:sz w:val="24"/>
                 <w:szCs w:val="24"/>
+                <w:lang w:val="hu-HU"/>
               </w:rPr>
               <w:t>Potion ikon + darabszám</w:t>
             </w:r>
@@ -1102,6 +1218,7 @@
                 <w:rFonts w:ascii="Avenir Next LT Pro Light" w:hAnsi="Avenir Next LT Pro Light"/>
                 <w:sz w:val="24"/>
                 <w:szCs w:val="24"/>
+                <w:lang w:val="hu-HU"/>
               </w:rPr>
               <w:t>, nyílvessző darabszám</w:t>
             </w:r>
@@ -1117,6 +1234,7 @@
                 <w:rFonts w:ascii="Avenir Next LT Pro Light" w:hAnsi="Avenir Next LT Pro Light"/>
                 <w:sz w:val="24"/>
                 <w:szCs w:val="24"/>
+                <w:lang w:val="hu-HU"/>
               </w:rPr>
             </w:pPr>
             <w:r>
@@ -1124,6 +1242,7 @@
                 <w:rFonts w:ascii="Avenir Next LT Pro Light" w:hAnsi="Avenir Next LT Pro Light"/>
                 <w:sz w:val="24"/>
                 <w:szCs w:val="24"/>
+                <w:lang w:val="hu-HU"/>
               </w:rPr>
               <w:t>Bal alsó</w:t>
             </w:r>
@@ -1139,6 +1258,7 @@
                 <w:rFonts w:ascii="Avenir Next LT Pro Light" w:hAnsi="Avenir Next LT Pro Light"/>
                 <w:sz w:val="24"/>
                 <w:szCs w:val="24"/>
+                <w:lang w:val="hu-HU"/>
               </w:rPr>
             </w:pPr>
             <w:r>
@@ -1146,6 +1266,7 @@
                 <w:rFonts w:ascii="Avenir Next LT Pro Light" w:hAnsi="Avenir Next LT Pro Light"/>
                 <w:sz w:val="24"/>
                 <w:szCs w:val="24"/>
+                <w:lang w:val="hu-HU"/>
               </w:rPr>
               <w:t>Használható potion mennyisége</w:t>
             </w:r>
@@ -1154,6 +1275,7 @@
                 <w:rFonts w:ascii="Avenir Next LT Pro Light" w:hAnsi="Avenir Next LT Pro Light"/>
                 <w:sz w:val="24"/>
                 <w:szCs w:val="24"/>
+                <w:lang w:val="hu-HU"/>
               </w:rPr>
               <w:t>, kilőhető nyílvessző mennyisége</w:t>
             </w:r>
@@ -1171,6 +1293,7 @@
                 <w:rFonts w:ascii="Avenir Next LT Pro Light" w:hAnsi="Avenir Next LT Pro Light"/>
                 <w:sz w:val="24"/>
                 <w:szCs w:val="24"/>
+                <w:lang w:val="hu-HU"/>
               </w:rPr>
             </w:pPr>
             <w:r>
@@ -1178,6 +1301,7 @@
                 <w:rFonts w:ascii="Avenir Next LT Pro Light" w:hAnsi="Avenir Next LT Pro Light"/>
                 <w:sz w:val="24"/>
                 <w:szCs w:val="24"/>
+                <w:lang w:val="hu-HU"/>
               </w:rPr>
               <w:t>Quest log</w:t>
             </w:r>
@@ -1193,6 +1317,7 @@
                 <w:rFonts w:ascii="Avenir Next LT Pro Light" w:hAnsi="Avenir Next LT Pro Light"/>
                 <w:sz w:val="24"/>
                 <w:szCs w:val="24"/>
+                <w:lang w:val="hu-HU"/>
               </w:rPr>
             </w:pPr>
             <w:r>
@@ -1200,6 +1325,7 @@
                 <w:rFonts w:ascii="Avenir Next LT Pro Light" w:hAnsi="Avenir Next LT Pro Light"/>
                 <w:sz w:val="24"/>
                 <w:szCs w:val="24"/>
+                <w:lang w:val="hu-HU"/>
               </w:rPr>
               <w:t>Jobb felső</w:t>
             </w:r>
@@ -1215,6 +1341,7 @@
                 <w:rFonts w:ascii="Avenir Next LT Pro Light" w:hAnsi="Avenir Next LT Pro Light"/>
                 <w:sz w:val="24"/>
                 <w:szCs w:val="24"/>
+                <w:lang w:val="hu-HU"/>
               </w:rPr>
             </w:pPr>
             <w:r>
@@ -1222,6 +1349,7 @@
                 <w:rFonts w:ascii="Avenir Next LT Pro Light" w:hAnsi="Avenir Next LT Pro Light"/>
                 <w:sz w:val="24"/>
                 <w:szCs w:val="24"/>
+                <w:lang w:val="hu-HU"/>
               </w:rPr>
               <w:t>Aktív küldetés leírás</w:t>
             </w:r>
@@ -1239,6 +1367,7 @@
                 <w:rFonts w:ascii="Avenir Next LT Pro Light" w:hAnsi="Avenir Next LT Pro Light"/>
                 <w:sz w:val="24"/>
                 <w:szCs w:val="24"/>
+                <w:lang w:val="hu-HU"/>
               </w:rPr>
             </w:pPr>
             <w:r>
@@ -1246,6 +1375,7 @@
                 <w:rFonts w:ascii="Avenir Next LT Pro Light" w:hAnsi="Avenir Next LT Pro Light"/>
                 <w:sz w:val="24"/>
                 <w:szCs w:val="24"/>
+                <w:lang w:val="hu-HU"/>
               </w:rPr>
               <w:t>Boss HP bar</w:t>
             </w:r>
@@ -1261,6 +1391,7 @@
                 <w:rFonts w:ascii="Avenir Next LT Pro Light" w:hAnsi="Avenir Next LT Pro Light"/>
                 <w:sz w:val="24"/>
                 <w:szCs w:val="24"/>
+                <w:lang w:val="hu-HU"/>
               </w:rPr>
             </w:pPr>
             <w:r>
@@ -1268,6 +1399,7 @@
                 <w:rFonts w:ascii="Avenir Next LT Pro Light" w:hAnsi="Avenir Next LT Pro Light"/>
                 <w:sz w:val="24"/>
                 <w:szCs w:val="24"/>
+                <w:lang w:val="hu-HU"/>
               </w:rPr>
               <w:t>Képernyő teteje</w:t>
             </w:r>
@@ -1283,6 +1415,7 @@
                 <w:rFonts w:ascii="Avenir Next LT Pro Light" w:hAnsi="Avenir Next LT Pro Light"/>
                 <w:sz w:val="24"/>
                 <w:szCs w:val="24"/>
+                <w:lang w:val="hu-HU"/>
               </w:rPr>
             </w:pPr>
             <w:r>
@@ -1290,6 +1423,7 @@
                 <w:rFonts w:ascii="Avenir Next LT Pro Light" w:hAnsi="Avenir Next LT Pro Light"/>
                 <w:sz w:val="24"/>
                 <w:szCs w:val="24"/>
+                <w:lang w:val="hu-HU"/>
               </w:rPr>
               <w:t>Boss életereje harc közben</w:t>
             </w:r>
@@ -1302,11 +1436,13 @@
         <w:pStyle w:val="Cmsor1"/>
         <w:rPr>
           <w:rFonts w:ascii="Avenir Next LT Pro Light" w:hAnsi="Avenir Next LT Pro Light"/>
+          <w:lang w:val="hu-HU"/>
         </w:rPr>
       </w:pPr>
       <w:r>
         <w:rPr>
           <w:rFonts w:ascii="Avenir Next LT Pro Light" w:hAnsi="Avenir Next LT Pro Light"/>
+          <w:lang w:val="hu-HU"/>
         </w:rPr>
         <w:t>5. Mechanikák részletesen</w:t>
       </w:r>
@@ -1318,6 +1454,7 @@
           <w:rFonts w:ascii="Avenir Next LT Pro Light" w:hAnsi="Avenir Next LT Pro Light"/>
           <w:sz w:val="24"/>
           <w:szCs w:val="24"/>
+          <w:lang w:val="hu-HU"/>
         </w:rPr>
       </w:pPr>
       <w:r>
@@ -1325,6 +1462,7 @@
           <w:rFonts w:ascii="Avenir Next LT Pro Light" w:hAnsi="Avenir Next LT Pro Light"/>
           <w:sz w:val="24"/>
           <w:szCs w:val="24"/>
+          <w:lang w:val="hu-HU"/>
         </w:rPr>
         <w:t>• Slide invincibility: Slide közben a játékos sérthetetlen.</w:t>
       </w:r>
@@ -1336,6 +1474,7 @@
           <w:rFonts w:ascii="Avenir Next LT Pro Light" w:hAnsi="Avenir Next LT Pro Light"/>
           <w:sz w:val="24"/>
           <w:szCs w:val="24"/>
+          <w:lang w:val="hu-HU"/>
         </w:rPr>
       </w:pPr>
       <w:r>
@@ -1343,6 +1482,7 @@
           <w:rFonts w:ascii="Avenir Next LT Pro Light" w:hAnsi="Avenir Next LT Pro Light"/>
           <w:sz w:val="24"/>
           <w:szCs w:val="24"/>
+          <w:lang w:val="hu-HU"/>
         </w:rPr>
         <w:t>• Kard kombó animációk + sebzés logika.</w:t>
       </w:r>
@@ -1354,6 +1494,7 @@
           <w:rFonts w:ascii="Avenir Next LT Pro Light" w:hAnsi="Avenir Next LT Pro Light"/>
           <w:sz w:val="24"/>
           <w:szCs w:val="24"/>
+          <w:lang w:val="hu-HU"/>
         </w:rPr>
       </w:pPr>
       <w:r>
@@ -1361,6 +1502,7 @@
           <w:rFonts w:ascii="Avenir Next LT Pro Light" w:hAnsi="Avenir Next LT Pro Light"/>
           <w:sz w:val="24"/>
           <w:szCs w:val="24"/>
+          <w:lang w:val="hu-HU"/>
         </w:rPr>
         <w:t>• Íj lövés + projectile collision.</w:t>
       </w:r>
@@ -1372,6 +1514,7 @@
           <w:rFonts w:ascii="Avenir Next LT Pro Light" w:hAnsi="Avenir Next LT Pro Light"/>
           <w:sz w:val="24"/>
           <w:szCs w:val="24"/>
+          <w:lang w:val="hu-HU"/>
         </w:rPr>
       </w:pPr>
       <w:r>
@@ -1379,6 +1522,7 @@
           <w:rFonts w:ascii="Avenir Next LT Pro Light" w:hAnsi="Avenir Next LT Pro Light"/>
           <w:sz w:val="24"/>
           <w:szCs w:val="24"/>
+          <w:lang w:val="hu-HU"/>
         </w:rPr>
         <w:t>• Skill tree: potion mennyiség/heal növelés, sebzés növelés, HP növelés.</w:t>
       </w:r>
@@ -1390,6 +1534,7 @@
           <w:rFonts w:ascii="Avenir Next LT Pro Light" w:hAnsi="Avenir Next LT Pro Light"/>
           <w:sz w:val="24"/>
           <w:szCs w:val="24"/>
+          <w:lang w:val="hu-HU"/>
         </w:rPr>
       </w:pPr>
       <w:r>
@@ -1397,6 +1542,7 @@
           <w:rFonts w:ascii="Avenir Next LT Pro Light" w:hAnsi="Avenir Next LT Pro Light"/>
           <w:sz w:val="24"/>
           <w:szCs w:val="24"/>
+          <w:lang w:val="hu-HU"/>
         </w:rPr>
         <w:t>• Checkpoint/mentés: pozíció, HP, XP, skill adatok.</w:t>
       </w:r>
@@ -1407,6 +1553,7 @@
           <w:rFonts w:ascii="Avenir Next LT Pro Light" w:hAnsi="Avenir Next LT Pro Light"/>
           <w:sz w:val="24"/>
           <w:szCs w:val="24"/>
+          <w:lang w:val="hu-HU"/>
         </w:rPr>
       </w:pPr>
       <w:r>
@@ -1414,6 +1561,7 @@
           <w:rFonts w:ascii="Avenir Next LT Pro Light" w:hAnsi="Avenir Next LT Pro Light"/>
           <w:sz w:val="24"/>
           <w:szCs w:val="24"/>
+          <w:lang w:val="hu-HU"/>
         </w:rPr>
         <w:br w:type="page"/>
       </w:r>
@@ -1423,11 +1571,13 @@
         <w:pStyle w:val="Cmsor1"/>
         <w:rPr>
           <w:rFonts w:ascii="Avenir Next LT Pro Light" w:hAnsi="Avenir Next LT Pro Light"/>
+          <w:lang w:val="hu-HU"/>
         </w:rPr>
       </w:pPr>
       <w:r>
         <w:rPr>
           <w:rFonts w:ascii="Avenir Next LT Pro Light" w:hAnsi="Avenir Next LT Pro Light"/>
+          <w:lang w:val="hu-HU"/>
         </w:rPr>
         <w:lastRenderedPageBreak/>
         <w:t>6. Pályák</w:t>
@@ -1457,6 +1607,7 @@
                 <w:bCs/>
                 <w:sz w:val="24"/>
                 <w:szCs w:val="24"/>
+                <w:lang w:val="hu-HU"/>
               </w:rPr>
             </w:pPr>
             <w:r>
@@ -1466,6 +1617,7 @@
                 <w:bCs/>
                 <w:sz w:val="24"/>
                 <w:szCs w:val="24"/>
+                <w:lang w:val="hu-HU"/>
               </w:rPr>
               <w:t>Pálya</w:t>
             </w:r>
@@ -1483,6 +1635,7 @@
                 <w:bCs/>
                 <w:sz w:val="24"/>
                 <w:szCs w:val="24"/>
+                <w:lang w:val="hu-HU"/>
               </w:rPr>
             </w:pPr>
             <w:r>
@@ -1492,6 +1645,7 @@
                 <w:bCs/>
                 <w:sz w:val="24"/>
                 <w:szCs w:val="24"/>
+                <w:lang w:val="hu-HU"/>
               </w:rPr>
               <w:t>Leírás</w:t>
             </w:r>
@@ -1509,6 +1663,7 @@
                 <w:bCs/>
                 <w:sz w:val="24"/>
                 <w:szCs w:val="24"/>
+                <w:lang w:val="hu-HU"/>
               </w:rPr>
             </w:pPr>
             <w:r>
@@ -1518,6 +1673,7 @@
                 <w:bCs/>
                 <w:sz w:val="24"/>
                 <w:szCs w:val="24"/>
+                <w:lang w:val="hu-HU"/>
               </w:rPr>
               <w:t>Egyedi elemek</w:t>
             </w:r>
@@ -1535,6 +1691,7 @@
                 <w:rFonts w:ascii="Avenir Next LT Pro Light" w:hAnsi="Avenir Next LT Pro Light"/>
                 <w:sz w:val="24"/>
                 <w:szCs w:val="24"/>
+                <w:lang w:val="hu-HU"/>
               </w:rPr>
             </w:pPr>
             <w:r>
@@ -1542,6 +1699,7 @@
                 <w:rFonts w:ascii="Avenir Next LT Pro Light" w:hAnsi="Avenir Next LT Pro Light"/>
                 <w:sz w:val="24"/>
                 <w:szCs w:val="24"/>
+                <w:lang w:val="hu-HU"/>
               </w:rPr>
               <w:t>Dark Wood</w:t>
             </w:r>
@@ -1557,6 +1715,7 @@
                 <w:rFonts w:ascii="Avenir Next LT Pro Light" w:hAnsi="Avenir Next LT Pro Light"/>
                 <w:sz w:val="24"/>
                 <w:szCs w:val="24"/>
+                <w:lang w:val="hu-HU"/>
               </w:rPr>
             </w:pPr>
             <w:r>
@@ -1564,6 +1723,7 @@
                 <w:rFonts w:ascii="Avenir Next LT Pro Light" w:hAnsi="Avenir Next LT Pro Light"/>
                 <w:sz w:val="24"/>
                 <w:szCs w:val="24"/>
+                <w:lang w:val="hu-HU"/>
               </w:rPr>
               <w:t>Kezdőterület</w:t>
             </w:r>
@@ -1579,6 +1739,7 @@
                 <w:rFonts w:ascii="Avenir Next LT Pro Light" w:hAnsi="Avenir Next LT Pro Light"/>
                 <w:sz w:val="24"/>
                 <w:szCs w:val="24"/>
+                <w:lang w:val="hu-HU"/>
               </w:rPr>
             </w:pPr>
             <w:r>
@@ -1586,6 +1747,7 @@
                 <w:rFonts w:ascii="Avenir Next LT Pro Light" w:hAnsi="Avenir Next LT Pro Light"/>
                 <w:sz w:val="24"/>
                 <w:szCs w:val="24"/>
+                <w:lang w:val="hu-HU"/>
               </w:rPr>
               <w:t>Gyenge enemy-k, kevés platform kihívás</w:t>
             </w:r>
@@ -1603,6 +1765,7 @@
                 <w:rFonts w:ascii="Avenir Next LT Pro Light" w:hAnsi="Avenir Next LT Pro Light"/>
                 <w:sz w:val="24"/>
                 <w:szCs w:val="24"/>
+                <w:lang w:val="hu-HU"/>
               </w:rPr>
             </w:pPr>
             <w:r>
@@ -1610,6 +1773,7 @@
                 <w:rFonts w:ascii="Avenir Next LT Pro Light" w:hAnsi="Avenir Next LT Pro Light"/>
                 <w:sz w:val="24"/>
                 <w:szCs w:val="24"/>
+                <w:lang w:val="hu-HU"/>
               </w:rPr>
               <w:t>Börtön</w:t>
             </w:r>
@@ -1625,6 +1789,7 @@
                 <w:rFonts w:ascii="Avenir Next LT Pro Light" w:hAnsi="Avenir Next LT Pro Light"/>
                 <w:sz w:val="24"/>
                 <w:szCs w:val="24"/>
+                <w:lang w:val="hu-HU"/>
               </w:rPr>
             </w:pPr>
             <w:r>
@@ -1632,6 +1797,7 @@
                 <w:rFonts w:ascii="Avenir Next LT Pro Light" w:hAnsi="Avenir Next LT Pro Light"/>
                 <w:sz w:val="24"/>
                 <w:szCs w:val="24"/>
+                <w:lang w:val="hu-HU"/>
               </w:rPr>
               <w:t>Szűk folyosók, csapdák</w:t>
             </w:r>
@@ -1647,6 +1813,7 @@
                 <w:rFonts w:ascii="Avenir Next LT Pro Light" w:hAnsi="Avenir Next LT Pro Light"/>
                 <w:sz w:val="24"/>
                 <w:szCs w:val="24"/>
+                <w:lang w:val="hu-HU"/>
               </w:rPr>
             </w:pPr>
             <w:r>
@@ -1654,6 +1821,7 @@
                 <w:rFonts w:ascii="Avenir Next LT Pro Light" w:hAnsi="Avenir Next LT Pro Light"/>
                 <w:sz w:val="24"/>
                 <w:szCs w:val="24"/>
+                <w:lang w:val="hu-HU"/>
               </w:rPr>
               <w:t>Láncos enemy-k, kulcsos ajtók</w:t>
             </w:r>
@@ -1671,6 +1839,7 @@
                 <w:rFonts w:ascii="Avenir Next LT Pro Light" w:hAnsi="Avenir Next LT Pro Light"/>
                 <w:sz w:val="24"/>
                 <w:szCs w:val="24"/>
+                <w:lang w:val="hu-HU"/>
               </w:rPr>
             </w:pPr>
             <w:r>
@@ -1678,6 +1847,7 @@
                 <w:rFonts w:ascii="Avenir Next LT Pro Light" w:hAnsi="Avenir Next LT Pro Light"/>
                 <w:sz w:val="24"/>
                 <w:szCs w:val="24"/>
+                <w:lang w:val="hu-HU"/>
               </w:rPr>
               <w:t>Lávás bánya</w:t>
             </w:r>
@@ -1693,6 +1863,7 @@
                 <w:rFonts w:ascii="Avenir Next LT Pro Light" w:hAnsi="Avenir Next LT Pro Light"/>
                 <w:sz w:val="24"/>
                 <w:szCs w:val="24"/>
+                <w:lang w:val="hu-HU"/>
               </w:rPr>
             </w:pPr>
             <w:r>
@@ -1700,6 +1871,7 @@
                 <w:rFonts w:ascii="Avenir Next LT Pro Light" w:hAnsi="Avenir Next LT Pro Light"/>
                 <w:sz w:val="24"/>
                 <w:szCs w:val="24"/>
+                <w:lang w:val="hu-HU"/>
               </w:rPr>
               <w:t>Magas veszély, platforming</w:t>
             </w:r>
@@ -1715,6 +1887,7 @@
                 <w:rFonts w:ascii="Avenir Next LT Pro Light" w:hAnsi="Avenir Next LT Pro Light"/>
                 <w:sz w:val="24"/>
                 <w:szCs w:val="24"/>
+                <w:lang w:val="hu-HU"/>
               </w:rPr>
             </w:pPr>
             <w:r>
@@ -1722,6 +1895,7 @@
                 <w:rFonts w:ascii="Avenir Next LT Pro Light" w:hAnsi="Avenir Next LT Pro Light"/>
                 <w:sz w:val="24"/>
                 <w:szCs w:val="24"/>
+                <w:lang w:val="hu-HU"/>
               </w:rPr>
               <w:t>Láva, mozgó platformok</w:t>
             </w:r>
@@ -1739,6 +1913,7 @@
                 <w:rFonts w:ascii="Avenir Next LT Pro Light" w:hAnsi="Avenir Next LT Pro Light"/>
                 <w:sz w:val="24"/>
                 <w:szCs w:val="24"/>
+                <w:lang w:val="hu-HU"/>
               </w:rPr>
             </w:pPr>
             <w:r>
@@ -1746,6 +1921,7 @@
                 <w:rFonts w:ascii="Avenir Next LT Pro Light" w:hAnsi="Avenir Next LT Pro Light"/>
                 <w:sz w:val="24"/>
                 <w:szCs w:val="24"/>
+                <w:lang w:val="hu-HU"/>
               </w:rPr>
               <w:t>Kastély előterek</w:t>
             </w:r>
@@ -1761,6 +1937,7 @@
                 <w:rFonts w:ascii="Avenir Next LT Pro Light" w:hAnsi="Avenir Next LT Pro Light"/>
                 <w:sz w:val="24"/>
                 <w:szCs w:val="24"/>
+                <w:lang w:val="hu-HU"/>
               </w:rPr>
             </w:pPr>
             <w:r>
@@ -1768,6 +1945,7 @@
                 <w:rFonts w:ascii="Avenir Next LT Pro Light" w:hAnsi="Avenir Next LT Pro Light"/>
                 <w:sz w:val="24"/>
                 <w:szCs w:val="24"/>
+                <w:lang w:val="hu-HU"/>
               </w:rPr>
               <w:t>Erősebb enemy-k</w:t>
             </w:r>
@@ -1783,6 +1961,7 @@
                 <w:rFonts w:ascii="Avenir Next LT Pro Light" w:hAnsi="Avenir Next LT Pro Light"/>
                 <w:sz w:val="24"/>
                 <w:szCs w:val="24"/>
+                <w:lang w:val="hu-HU"/>
               </w:rPr>
             </w:pPr>
             <w:r>
@@ -1790,6 +1969,7 @@
                 <w:rFonts w:ascii="Avenir Next LT Pro Light" w:hAnsi="Avenir Next LT Pro Light"/>
                 <w:sz w:val="24"/>
                 <w:szCs w:val="24"/>
+                <w:lang w:val="hu-HU"/>
               </w:rPr>
               <w:t>Íjász és páncélos ellenfelek</w:t>
             </w:r>
@@ -1807,6 +1987,7 @@
                 <w:rFonts w:ascii="Avenir Next LT Pro Light" w:hAnsi="Avenir Next LT Pro Light"/>
                 <w:sz w:val="24"/>
                 <w:szCs w:val="24"/>
+                <w:lang w:val="hu-HU"/>
               </w:rPr>
             </w:pPr>
             <w:r>
@@ -1814,6 +1995,7 @@
                 <w:rFonts w:ascii="Avenir Next LT Pro Light" w:hAnsi="Avenir Next LT Pro Light"/>
                 <w:sz w:val="24"/>
                 <w:szCs w:val="24"/>
+                <w:lang w:val="hu-HU"/>
               </w:rPr>
               <w:t>Kastély belső</w:t>
             </w:r>
@@ -1829,6 +2011,7 @@
                 <w:rFonts w:ascii="Avenir Next LT Pro Light" w:hAnsi="Avenir Next LT Pro Light"/>
                 <w:sz w:val="24"/>
                 <w:szCs w:val="24"/>
+                <w:lang w:val="hu-HU"/>
               </w:rPr>
             </w:pPr>
             <w:r>
@@ -1836,6 +2019,7 @@
                 <w:rFonts w:ascii="Avenir Next LT Pro Light" w:hAnsi="Avenir Next LT Pro Light"/>
                 <w:sz w:val="24"/>
                 <w:szCs w:val="24"/>
+                <w:lang w:val="hu-HU"/>
               </w:rPr>
               <w:t>Főboss helyszín</w:t>
             </w:r>
@@ -1851,6 +2035,7 @@
                 <w:rFonts w:ascii="Avenir Next LT Pro Light" w:hAnsi="Avenir Next LT Pro Light"/>
                 <w:sz w:val="24"/>
                 <w:szCs w:val="24"/>
+                <w:lang w:val="hu-HU"/>
               </w:rPr>
             </w:pPr>
             <w:r>
@@ -1858,6 +2043,7 @@
                 <w:rFonts w:ascii="Avenir Next LT Pro Light" w:hAnsi="Avenir Next LT Pro Light"/>
                 <w:sz w:val="24"/>
                 <w:szCs w:val="24"/>
+                <w:lang w:val="hu-HU"/>
               </w:rPr>
               <w:t>Boss arena, cutscene</w:t>
             </w:r>
@@ -1875,6 +2061,7 @@
                 <w:rFonts w:ascii="Avenir Next LT Pro Light" w:hAnsi="Avenir Next LT Pro Light"/>
                 <w:sz w:val="24"/>
                 <w:szCs w:val="24"/>
+                <w:lang w:val="hu-HU"/>
               </w:rPr>
             </w:pPr>
             <w:r>
@@ -1882,6 +2069,7 @@
                 <w:rFonts w:ascii="Avenir Next LT Pro Light" w:hAnsi="Avenir Next LT Pro Light"/>
                 <w:sz w:val="24"/>
                 <w:szCs w:val="24"/>
+                <w:lang w:val="hu-HU"/>
               </w:rPr>
               <w:t>Hub terület</w:t>
             </w:r>
@@ -1897,6 +2085,7 @@
                 <w:rFonts w:ascii="Avenir Next LT Pro Light" w:hAnsi="Avenir Next LT Pro Light"/>
                 <w:sz w:val="24"/>
                 <w:szCs w:val="24"/>
+                <w:lang w:val="hu-HU"/>
               </w:rPr>
             </w:pPr>
             <w:r>
@@ -1904,6 +2093,7 @@
                 <w:rFonts w:ascii="Avenir Next LT Pro Light" w:hAnsi="Avenir Next LT Pro Light"/>
                 <w:sz w:val="24"/>
                 <w:szCs w:val="24"/>
+                <w:lang w:val="hu-HU"/>
               </w:rPr>
               <w:t>Biztonságos központ</w:t>
             </w:r>
@@ -1919,6 +2109,7 @@
                 <w:rFonts w:ascii="Avenir Next LT Pro Light" w:hAnsi="Avenir Next LT Pro Light"/>
                 <w:sz w:val="24"/>
                 <w:szCs w:val="24"/>
+                <w:lang w:val="hu-HU"/>
               </w:rPr>
             </w:pPr>
             <w:r>
@@ -1926,6 +2117,7 @@
                 <w:rFonts w:ascii="Avenir Next LT Pro Light" w:hAnsi="Avenir Next LT Pro Light"/>
                 <w:sz w:val="24"/>
                 <w:szCs w:val="24"/>
+                <w:lang w:val="hu-HU"/>
               </w:rPr>
               <w:t>NPC-k, fejlesztés, kereskedés</w:t>
             </w:r>
@@ -1938,19 +2130,15 @@
         <w:pStyle w:val="Cmsor1"/>
         <w:rPr>
           <w:rFonts w:ascii="Avenir Next LT Pro Light" w:hAnsi="Avenir Next LT Pro Light"/>
+          <w:lang w:val="hu-HU"/>
         </w:rPr>
       </w:pPr>
       <w:r>
         <w:rPr>
           <w:rFonts w:ascii="Avenir Next LT Pro Light" w:hAnsi="Avenir Next LT Pro Light"/>
+          <w:lang w:val="hu-HU"/>
         </w:rPr>
-        <w:t xml:space="preserve">7. </w:t>
-      </w:r>
-      <w:r>
-        <w:rPr>
-          <w:rFonts w:ascii="Avenir Next LT Pro Light" w:hAnsi="Avenir Next LT Pro Light"/>
-        </w:rPr>
-        <w:t xml:space="preserve"> Jelenlegi hibák</w:t>
+        <w:t>7.  Jelenlegi hibák</w:t>
       </w:r>
     </w:p>
     <w:p>
@@ -1960,12 +2148,16 @@
           <w:ilvl w:val="0"/>
           <w:numId w:val="14"/>
         </w:numPr>
+        <w:rPr>
+          <w:lang w:val="hu-HU"/>
+        </w:rPr>
       </w:pPr>
       <w:r>
         <w:rPr>
           <w:rFonts w:ascii="Avenir Next LT Pro Light" w:hAnsi="Avenir Next LT Pro Light"/>
           <w:sz w:val="24"/>
           <w:szCs w:val="24"/>
+          <w:lang w:val="hu-HU"/>
         </w:rPr>
         <w:t>nyíl nem akad el a falban, hanem átmegy rajta</w:t>
       </w:r>
@@ -1977,12 +2169,16 @@
           <w:ilvl w:val="0"/>
           <w:numId w:val="14"/>
         </w:numPr>
+        <w:rPr>
+          <w:lang w:val="hu-HU"/>
+        </w:rPr>
       </w:pPr>
       <w:r>
         <w:rPr>
           <w:rFonts w:ascii="Avenir Next LT Pro Light" w:hAnsi="Avenir Next LT Pro Light"/>
           <w:sz w:val="24"/>
           <w:szCs w:val="24"/>
+          <w:lang w:val="hu-HU"/>
         </w:rPr>
         <w:t>slide közben nem sérthetetlen a karakter</w:t>
       </w:r>
@@ -1994,14 +2190,18 @@
           <w:ilvl w:val="0"/>
           <w:numId w:val="14"/>
         </w:numPr>
+        <w:rPr>
+          <w:lang w:val="hu-HU"/>
+        </w:rPr>
       </w:pPr>
       <w:r>
         <w:rPr>
           <w:rFonts w:ascii="Avenir Next LT Pro Light" w:hAnsi="Avenir Next LT Pro Light"/>
           <w:sz w:val="24"/>
           <w:szCs w:val="24"/>
+          <w:lang w:val="hu-HU"/>
         </w:rPr>
-        <w:t>ha mentésből betöltjük a játékot akkor a a meghalt enemyk is maradjanak halottak</w:t>
+        <w:t>ha mentésből betöltjük a játékot akkor a meghalt enemyk is maradjanak halottak</w:t>
       </w:r>
     </w:p>
     <w:p>
@@ -2009,19 +2209,15 @@
         <w:pStyle w:val="Cmsor1"/>
         <w:rPr>
           <w:rFonts w:ascii="Avenir Next LT Pro Light" w:hAnsi="Avenir Next LT Pro Light"/>
+          <w:lang w:val="hu-HU"/>
         </w:rPr>
       </w:pPr>
       <w:r>
         <w:rPr>
           <w:rFonts w:ascii="Avenir Next LT Pro Light" w:hAnsi="Avenir Next LT Pro Light"/>
+          <w:lang w:val="hu-HU"/>
         </w:rPr>
-        <w:t>8</w:t>
-      </w:r>
-      <w:r>
-        <w:rPr>
-          <w:rFonts w:ascii="Avenir Next LT Pro Light" w:hAnsi="Avenir Next LT Pro Light"/>
-        </w:rPr>
-        <w:t>. Mérföldkövek</w:t>
+        <w:t>8. Mérföldkövek</w:t>
       </w:r>
     </w:p>
     <w:tbl>
@@ -2053,6 +2249,7 @@
                 <w:bCs/>
                 <w:sz w:val="24"/>
                 <w:szCs w:val="24"/>
+                <w:lang w:val="hu-HU"/>
               </w:rPr>
             </w:pPr>
             <w:r>
@@ -2062,6 +2259,7 @@
                 <w:bCs/>
                 <w:sz w:val="24"/>
                 <w:szCs w:val="24"/>
+                <w:lang w:val="hu-HU"/>
               </w:rPr>
               <w:t>#</w:t>
             </w:r>
@@ -2079,6 +2277,7 @@
                 <w:bCs/>
                 <w:sz w:val="24"/>
                 <w:szCs w:val="24"/>
+                <w:lang w:val="hu-HU"/>
               </w:rPr>
             </w:pPr>
             <w:r>
@@ -2088,6 +2287,7 @@
                 <w:bCs/>
                 <w:sz w:val="24"/>
                 <w:szCs w:val="24"/>
+                <w:lang w:val="hu-HU"/>
               </w:rPr>
               <w:t>Feladat</w:t>
             </w:r>
@@ -2105,6 +2305,7 @@
                 <w:bCs/>
                 <w:sz w:val="24"/>
                 <w:szCs w:val="24"/>
+                <w:lang w:val="hu-HU"/>
               </w:rPr>
             </w:pPr>
             <w:r>
@@ -2114,6 +2315,7 @@
                 <w:bCs/>
                 <w:sz w:val="24"/>
                 <w:szCs w:val="24"/>
+                <w:lang w:val="hu-HU"/>
               </w:rPr>
               <w:t>Időbecslés</w:t>
             </w:r>
@@ -2131,6 +2333,7 @@
                 <w:bCs/>
                 <w:sz w:val="24"/>
                 <w:szCs w:val="24"/>
+                <w:lang w:val="hu-HU"/>
               </w:rPr>
             </w:pPr>
             <w:r>
@@ -2140,6 +2343,7 @@
                 <w:bCs/>
                 <w:sz w:val="24"/>
                 <w:szCs w:val="24"/>
+                <w:lang w:val="hu-HU"/>
               </w:rPr>
               <w:t>Befejezett</w:t>
             </w:r>
@@ -2168,6 +2372,7 @@
                 <w:bCs/>
                 <w:sz w:val="24"/>
                 <w:szCs w:val="24"/>
+                <w:lang w:val="hu-HU"/>
               </w:rPr>
             </w:pPr>
           </w:p>
@@ -2182,6 +2387,7 @@
                 <w:rFonts w:ascii="Avenir Next LT Pro Light" w:hAnsi="Avenir Next LT Pro Light"/>
                 <w:sz w:val="24"/>
                 <w:szCs w:val="24"/>
+                <w:lang w:val="hu-HU"/>
               </w:rPr>
             </w:pPr>
             <w:r>
@@ -2189,6 +2395,7 @@
                 <w:rFonts w:ascii="Avenir Next LT Pro Light" w:hAnsi="Avenir Next LT Pro Light"/>
                 <w:sz w:val="24"/>
                 <w:szCs w:val="24"/>
+                <w:lang w:val="hu-HU"/>
               </w:rPr>
               <w:t>Hibajavítások</w:t>
             </w:r>
@@ -2204,6 +2411,7 @@
                 <w:rFonts w:ascii="Avenir Next LT Pro Light" w:hAnsi="Avenir Next LT Pro Light"/>
                 <w:sz w:val="24"/>
                 <w:szCs w:val="24"/>
+                <w:lang w:val="hu-HU"/>
               </w:rPr>
             </w:pPr>
             <w:r>
@@ -2211,6 +2419,7 @@
                 <w:rFonts w:ascii="Avenir Next LT Pro Light" w:hAnsi="Avenir Next LT Pro Light"/>
                 <w:sz w:val="24"/>
                 <w:szCs w:val="24"/>
+                <w:lang w:val="hu-HU"/>
               </w:rPr>
               <w:t>1-2 nap</w:t>
             </w:r>
@@ -2227,6 +2436,7 @@
                 <w:rFonts w:ascii="Avenir Next LT Pro Light" w:hAnsi="Avenir Next LT Pro Light"/>
                 <w:sz w:val="24"/>
                 <w:szCs w:val="24"/>
+                <w:lang w:val="hu-HU"/>
               </w:rPr>
             </w:pPr>
           </w:p>
@@ -2254,6 +2464,7 @@
                 <w:bCs/>
                 <w:sz w:val="24"/>
                 <w:szCs w:val="24"/>
+                <w:lang w:val="hu-HU"/>
               </w:rPr>
             </w:pPr>
           </w:p>
@@ -2268,6 +2479,7 @@
                 <w:rFonts w:ascii="Avenir Next LT Pro Light" w:hAnsi="Avenir Next LT Pro Light"/>
                 <w:sz w:val="24"/>
                 <w:szCs w:val="24"/>
+                <w:lang w:val="hu-HU"/>
               </w:rPr>
             </w:pPr>
             <w:r>
@@ -2275,6 +2487,7 @@
                 <w:rFonts w:ascii="Avenir Next LT Pro Light" w:hAnsi="Avenir Next LT Pro Light"/>
                 <w:sz w:val="24"/>
                 <w:szCs w:val="24"/>
+                <w:lang w:val="hu-HU"/>
               </w:rPr>
               <w:t xml:space="preserve">Checkpoint </w:t>
             </w:r>
@@ -2290,6 +2503,7 @@
                 <w:rFonts w:ascii="Avenir Next LT Pro Light" w:hAnsi="Avenir Next LT Pro Light"/>
                 <w:sz w:val="24"/>
                 <w:szCs w:val="24"/>
+                <w:lang w:val="hu-HU"/>
               </w:rPr>
             </w:pPr>
             <w:r>
@@ -2297,16 +2511,9 @@
                 <w:rFonts w:ascii="Avenir Next LT Pro Light" w:hAnsi="Avenir Next LT Pro Light"/>
                 <w:sz w:val="24"/>
                 <w:szCs w:val="24"/>
-              </w:rPr>
-              <w:t>1</w:t>
-            </w:r>
-            <w:r>
-              <w:rPr>
-                <w:rFonts w:ascii="Avenir Next LT Pro Light" w:hAnsi="Avenir Next LT Pro Light"/>
-                <w:sz w:val="24"/>
-                <w:szCs w:val="24"/>
-              </w:rPr>
-              <w:t xml:space="preserve"> nap</w:t>
+                <w:lang w:val="hu-HU"/>
+              </w:rPr>
+              <w:t>1 nap</w:t>
             </w:r>
           </w:p>
         </w:tc>
@@ -2321,6 +2528,7 @@
                 <w:rFonts w:ascii="Avenir Next LT Pro Light" w:hAnsi="Avenir Next LT Pro Light"/>
                 <w:sz w:val="24"/>
                 <w:szCs w:val="24"/>
+                <w:lang w:val="hu-HU"/>
               </w:rPr>
             </w:pPr>
             <w:r>
@@ -2328,6 +2536,7 @@
                 <w:rFonts w:ascii="Segoe UI Emoji" w:hAnsi="Segoe UI Emoji" w:cs="Segoe UI Emoji"/>
                 <w:sz w:val="24"/>
                 <w:szCs w:val="24"/>
+                <w:lang w:val="hu-HU"/>
               </w:rPr>
               <w:t>✅</w:t>
             </w:r>
@@ -2356,6 +2565,7 @@
                 <w:bCs/>
                 <w:sz w:val="24"/>
                 <w:szCs w:val="24"/>
+                <w:lang w:val="hu-HU"/>
               </w:rPr>
             </w:pPr>
           </w:p>
@@ -2370,6 +2580,7 @@
                 <w:rFonts w:ascii="Avenir Next LT Pro Light" w:hAnsi="Avenir Next LT Pro Light"/>
                 <w:sz w:val="24"/>
                 <w:szCs w:val="24"/>
+                <w:lang w:val="hu-HU"/>
               </w:rPr>
             </w:pPr>
             <w:r>
@@ -2377,6 +2588,7 @@
                 <w:rFonts w:ascii="Avenir Next LT Pro Light" w:hAnsi="Avenir Next LT Pro Light"/>
                 <w:sz w:val="24"/>
                 <w:szCs w:val="24"/>
+                <w:lang w:val="hu-HU"/>
               </w:rPr>
               <w:t>Mentés/betöltés</w:t>
             </w:r>
@@ -2392,6 +2604,7 @@
                 <w:rFonts w:ascii="Avenir Next LT Pro Light" w:hAnsi="Avenir Next LT Pro Light"/>
                 <w:sz w:val="24"/>
                 <w:szCs w:val="24"/>
+                <w:lang w:val="hu-HU"/>
               </w:rPr>
             </w:pPr>
             <w:r>
@@ -2399,16 +2612,9 @@
                 <w:rFonts w:ascii="Avenir Next LT Pro Light" w:hAnsi="Avenir Next LT Pro Light"/>
                 <w:sz w:val="24"/>
                 <w:szCs w:val="24"/>
-              </w:rPr>
-              <w:t xml:space="preserve">1 </w:t>
-            </w:r>
-            <w:r>
-              <w:rPr>
-                <w:rFonts w:ascii="Avenir Next LT Pro Light" w:hAnsi="Avenir Next LT Pro Light"/>
-                <w:sz w:val="24"/>
-                <w:szCs w:val="24"/>
-              </w:rPr>
-              <w:t>nap</w:t>
+                <w:lang w:val="hu-HU"/>
+              </w:rPr>
+              <w:t>1 nap</w:t>
             </w:r>
           </w:p>
         </w:tc>
@@ -2423,6 +2629,7 @@
                 <w:rFonts w:ascii="Avenir Next LT Pro Light" w:hAnsi="Avenir Next LT Pro Light"/>
                 <w:sz w:val="24"/>
                 <w:szCs w:val="24"/>
+                <w:lang w:val="hu-HU"/>
               </w:rPr>
             </w:pPr>
             <w:r>
@@ -2430,6 +2637,7 @@
                 <w:rFonts w:ascii="Segoe UI Emoji" w:hAnsi="Segoe UI Emoji" w:cs="Segoe UI Emoji"/>
                 <w:sz w:val="24"/>
                 <w:szCs w:val="24"/>
+                <w:lang w:val="hu-HU"/>
               </w:rPr>
               <w:t>✅</w:t>
             </w:r>
@@ -2458,6 +2666,7 @@
                 <w:bCs/>
                 <w:sz w:val="24"/>
                 <w:szCs w:val="24"/>
+                <w:lang w:val="hu-HU"/>
               </w:rPr>
             </w:pPr>
           </w:p>
@@ -2472,6 +2681,7 @@
                 <w:rFonts w:ascii="Avenir Next LT Pro Light" w:hAnsi="Avenir Next LT Pro Light"/>
                 <w:sz w:val="24"/>
                 <w:szCs w:val="24"/>
+                <w:lang w:val="hu-HU"/>
               </w:rPr>
             </w:pPr>
             <w:r>
@@ -2479,16 +2689,36 @@
                 <w:rFonts w:ascii="Avenir Next LT Pro Light" w:hAnsi="Avenir Next LT Pro Light"/>
                 <w:sz w:val="24"/>
                 <w:szCs w:val="24"/>
-              </w:rPr>
-              <w:t>Potion mechanika</w:t>
+                <w:lang w:val="hu-HU"/>
+              </w:rPr>
+              <w:t>Potion mechanika +</w:t>
             </w:r>
             <w:r>
               <w:rPr>
                 <w:rFonts w:ascii="Avenir Next LT Pro Light" w:hAnsi="Avenir Next LT Pro Light"/>
                 <w:sz w:val="24"/>
                 <w:szCs w:val="24"/>
-              </w:rPr>
-              <w:t xml:space="preserve"> +UI</w:t>
+                <w:lang w:val="hu-HU"/>
+              </w:rPr>
+              <w:t xml:space="preserve"> </w:t>
+            </w:r>
+            <w:r>
+              <w:rPr>
+                <w:rFonts w:ascii="Avenir Next LT Pro Light" w:hAnsi="Avenir Next LT Pro Light"/>
+                <w:sz w:val="24"/>
+                <w:szCs w:val="24"/>
+                <w:lang w:val="hu-HU"/>
+              </w:rPr>
+              <w:t>UI</w:t>
+            </w:r>
+            <w:r>
+              <w:rPr>
+                <w:rFonts w:ascii="Avenir Next LT Pro Light" w:hAnsi="Avenir Next LT Pro Light"/>
+                <w:sz w:val="24"/>
+                <w:szCs w:val="24"/>
+                <w:lang w:val="hu-HU"/>
+              </w:rPr>
+              <w:t xml:space="preserve"> + animáció</w:t>
             </w:r>
           </w:p>
         </w:tc>
@@ -2502,6 +2732,7 @@
                 <w:rFonts w:ascii="Avenir Next LT Pro Light" w:hAnsi="Avenir Next LT Pro Light"/>
                 <w:sz w:val="24"/>
                 <w:szCs w:val="24"/>
+                <w:lang w:val="hu-HU"/>
               </w:rPr>
             </w:pPr>
             <w:r>
@@ -2509,16 +2740,9 @@
                 <w:rFonts w:ascii="Avenir Next LT Pro Light" w:hAnsi="Avenir Next LT Pro Light"/>
                 <w:sz w:val="24"/>
                 <w:szCs w:val="24"/>
-              </w:rPr>
-              <w:t>1-2</w:t>
-            </w:r>
-            <w:r>
-              <w:rPr>
-                <w:rFonts w:ascii="Avenir Next LT Pro Light" w:hAnsi="Avenir Next LT Pro Light"/>
-                <w:sz w:val="24"/>
-                <w:szCs w:val="24"/>
-              </w:rPr>
-              <w:t xml:space="preserve"> nap</w:t>
+                <w:lang w:val="hu-HU"/>
+              </w:rPr>
+              <w:t>1-2 nap</w:t>
             </w:r>
           </w:p>
         </w:tc>
@@ -2533,6 +2757,7 @@
                 <w:rFonts w:ascii="Avenir Next LT Pro Light" w:hAnsi="Avenir Next LT Pro Light"/>
                 <w:sz w:val="24"/>
                 <w:szCs w:val="24"/>
+                <w:lang w:val="hu-HU"/>
               </w:rPr>
             </w:pPr>
           </w:p>
@@ -2560,6 +2785,7 @@
                 <w:bCs/>
                 <w:sz w:val="24"/>
                 <w:szCs w:val="24"/>
+                <w:lang w:val="hu-HU"/>
               </w:rPr>
             </w:pPr>
           </w:p>
@@ -2574,6 +2800,7 @@
                 <w:rFonts w:ascii="Avenir Next LT Pro Light" w:hAnsi="Avenir Next LT Pro Light"/>
                 <w:sz w:val="24"/>
                 <w:szCs w:val="24"/>
+                <w:lang w:val="hu-HU"/>
               </w:rPr>
             </w:pPr>
             <w:r>
@@ -2581,6 +2808,7 @@
                 <w:rFonts w:ascii="Avenir Next LT Pro Light" w:hAnsi="Avenir Next LT Pro Light"/>
                 <w:sz w:val="24"/>
                 <w:szCs w:val="24"/>
+                <w:lang w:val="hu-HU"/>
               </w:rPr>
               <w:t>Nyíl mennyiség + UI</w:t>
             </w:r>
@@ -2596,6 +2824,7 @@
                 <w:rFonts w:ascii="Avenir Next LT Pro Light" w:hAnsi="Avenir Next LT Pro Light"/>
                 <w:sz w:val="24"/>
                 <w:szCs w:val="24"/>
+                <w:lang w:val="hu-HU"/>
               </w:rPr>
             </w:pPr>
             <w:r>
@@ -2603,6 +2832,7 @@
                 <w:rFonts w:ascii="Avenir Next LT Pro Light" w:hAnsi="Avenir Next LT Pro Light"/>
                 <w:sz w:val="24"/>
                 <w:szCs w:val="24"/>
+                <w:lang w:val="hu-HU"/>
               </w:rPr>
               <w:t>1-2 nap</w:t>
             </w:r>
@@ -2619,6 +2849,7 @@
                 <w:rFonts w:ascii="Avenir Next LT Pro Light" w:hAnsi="Avenir Next LT Pro Light"/>
                 <w:sz w:val="24"/>
                 <w:szCs w:val="24"/>
+                <w:lang w:val="hu-HU"/>
               </w:rPr>
             </w:pPr>
           </w:p>
@@ -2646,6 +2877,7 @@
                 <w:bCs/>
                 <w:sz w:val="24"/>
                 <w:szCs w:val="24"/>
+                <w:lang w:val="hu-HU"/>
               </w:rPr>
             </w:pPr>
           </w:p>
@@ -2660,6 +2892,7 @@
                 <w:rFonts w:ascii="Avenir Next LT Pro Light" w:hAnsi="Avenir Next LT Pro Light"/>
                 <w:sz w:val="24"/>
                 <w:szCs w:val="24"/>
+                <w:lang w:val="hu-HU"/>
               </w:rPr>
             </w:pPr>
             <w:r>
@@ -2667,24 +2900,9 @@
                 <w:rFonts w:ascii="Avenir Next LT Pro Light" w:hAnsi="Avenir Next LT Pro Light"/>
                 <w:sz w:val="24"/>
                 <w:szCs w:val="24"/>
-              </w:rPr>
-              <w:t>Pályaépítés (</w:t>
-            </w:r>
-            <w:r>
-              <w:rPr>
-                <w:rFonts w:ascii="Avenir Next LT Pro Light" w:hAnsi="Avenir Next LT Pro Light"/>
-                <w:sz w:val="24"/>
-                <w:szCs w:val="24"/>
-              </w:rPr>
-              <w:t>Kezdő, Börtön</w:t>
-            </w:r>
-            <w:r>
-              <w:rPr>
-                <w:rFonts w:ascii="Avenir Next LT Pro Light" w:hAnsi="Avenir Next LT Pro Light"/>
-                <w:sz w:val="24"/>
-                <w:szCs w:val="24"/>
-              </w:rPr>
-              <w:t>)</w:t>
+                <w:lang w:val="hu-HU"/>
+              </w:rPr>
+              <w:t>Pályaépítés (Kezdő, Börtön)</w:t>
             </w:r>
           </w:p>
         </w:tc>
@@ -2698,6 +2916,7 @@
                 <w:rFonts w:ascii="Avenir Next LT Pro Light" w:hAnsi="Avenir Next LT Pro Light"/>
                 <w:sz w:val="24"/>
                 <w:szCs w:val="24"/>
+                <w:lang w:val="hu-HU"/>
               </w:rPr>
             </w:pPr>
             <w:r>
@@ -2705,6 +2924,7 @@
                 <w:rFonts w:ascii="Avenir Next LT Pro Light" w:hAnsi="Avenir Next LT Pro Light"/>
                 <w:sz w:val="24"/>
                 <w:szCs w:val="24"/>
+                <w:lang w:val="hu-HU"/>
               </w:rPr>
               <w:t>4-5 nap</w:t>
             </w:r>
@@ -2721,6 +2941,7 @@
                 <w:rFonts w:ascii="Avenir Next LT Pro Light" w:hAnsi="Avenir Next LT Pro Light"/>
                 <w:sz w:val="24"/>
                 <w:szCs w:val="24"/>
+                <w:lang w:val="hu-HU"/>
               </w:rPr>
             </w:pPr>
           </w:p>
@@ -2748,6 +2969,7 @@
                 <w:bCs/>
                 <w:sz w:val="24"/>
                 <w:szCs w:val="24"/>
+                <w:lang w:val="hu-HU"/>
               </w:rPr>
             </w:pPr>
           </w:p>
@@ -2762,6 +2984,7 @@
                 <w:rFonts w:ascii="Avenir Next LT Pro Light" w:hAnsi="Avenir Next LT Pro Light"/>
                 <w:sz w:val="24"/>
                 <w:szCs w:val="24"/>
+                <w:lang w:val="hu-HU"/>
               </w:rPr>
             </w:pPr>
             <w:r>
@@ -2769,6 +2992,7 @@
                 <w:rFonts w:ascii="Avenir Next LT Pro Light" w:hAnsi="Avenir Next LT Pro Light"/>
                 <w:sz w:val="24"/>
                 <w:szCs w:val="24"/>
+                <w:lang w:val="hu-HU"/>
               </w:rPr>
               <w:t>NPC rendszer</w:t>
             </w:r>
@@ -2784,6 +3008,7 @@
                 <w:rFonts w:ascii="Avenir Next LT Pro Light" w:hAnsi="Avenir Next LT Pro Light"/>
                 <w:sz w:val="24"/>
                 <w:szCs w:val="24"/>
+                <w:lang w:val="hu-HU"/>
               </w:rPr>
             </w:pPr>
             <w:r>
@@ -2791,24 +3016,9 @@
                 <w:rFonts w:ascii="Avenir Next LT Pro Light" w:hAnsi="Avenir Next LT Pro Light"/>
                 <w:sz w:val="24"/>
                 <w:szCs w:val="24"/>
-              </w:rPr>
-              <w:t>3</w:t>
-            </w:r>
-            <w:r>
-              <w:rPr>
-                <w:rFonts w:ascii="Avenir Next LT Pro Light" w:hAnsi="Avenir Next LT Pro Light"/>
-                <w:sz w:val="24"/>
-                <w:szCs w:val="24"/>
-              </w:rPr>
-              <w:t>-4</w:t>
-            </w:r>
-            <w:r>
-              <w:rPr>
-                <w:rFonts w:ascii="Avenir Next LT Pro Light" w:hAnsi="Avenir Next LT Pro Light"/>
-                <w:sz w:val="24"/>
-                <w:szCs w:val="24"/>
-              </w:rPr>
-              <w:t xml:space="preserve"> nap</w:t>
+                <w:lang w:val="hu-HU"/>
+              </w:rPr>
+              <w:t>3-4 nap</w:t>
             </w:r>
           </w:p>
         </w:tc>
@@ -2823,6 +3033,7 @@
                 <w:rFonts w:ascii="Avenir Next LT Pro Light" w:hAnsi="Avenir Next LT Pro Light"/>
                 <w:sz w:val="24"/>
                 <w:szCs w:val="24"/>
+                <w:lang w:val="hu-HU"/>
               </w:rPr>
             </w:pPr>
           </w:p>
@@ -2850,6 +3061,7 @@
                 <w:bCs/>
                 <w:sz w:val="24"/>
                 <w:szCs w:val="24"/>
+                <w:lang w:val="hu-HU"/>
               </w:rPr>
             </w:pPr>
           </w:p>
@@ -2864,6 +3076,7 @@
                 <w:rFonts w:ascii="Avenir Next LT Pro Light" w:hAnsi="Avenir Next LT Pro Light"/>
                 <w:sz w:val="24"/>
                 <w:szCs w:val="24"/>
+                <w:lang w:val="hu-HU"/>
               </w:rPr>
             </w:pPr>
             <w:r>
@@ -2871,6 +3084,7 @@
                 <w:rFonts w:ascii="Avenir Next LT Pro Light" w:hAnsi="Avenir Next LT Pro Light"/>
                 <w:sz w:val="24"/>
                 <w:szCs w:val="24"/>
+                <w:lang w:val="hu-HU"/>
               </w:rPr>
               <w:t>Skill tree</w:t>
             </w:r>
@@ -2886,6 +3100,7 @@
                 <w:rFonts w:ascii="Avenir Next LT Pro Light" w:hAnsi="Avenir Next LT Pro Light"/>
                 <w:sz w:val="24"/>
                 <w:szCs w:val="24"/>
+                <w:lang w:val="hu-HU"/>
               </w:rPr>
             </w:pPr>
             <w:r>
@@ -2893,6 +3108,7 @@
                 <w:rFonts w:ascii="Avenir Next LT Pro Light" w:hAnsi="Avenir Next LT Pro Light"/>
                 <w:sz w:val="24"/>
                 <w:szCs w:val="24"/>
+                <w:lang w:val="hu-HU"/>
               </w:rPr>
               <w:t>4-5 nap</w:t>
             </w:r>
@@ -2909,6 +3125,7 @@
                 <w:rFonts w:ascii="Avenir Next LT Pro Light" w:hAnsi="Avenir Next LT Pro Light"/>
                 <w:sz w:val="24"/>
                 <w:szCs w:val="24"/>
+                <w:lang w:val="hu-HU"/>
               </w:rPr>
             </w:pPr>
           </w:p>
@@ -2936,6 +3153,7 @@
                 <w:bCs/>
                 <w:sz w:val="24"/>
                 <w:szCs w:val="24"/>
+                <w:lang w:val="hu-HU"/>
               </w:rPr>
             </w:pPr>
           </w:p>
@@ -2950,6 +3168,7 @@
                 <w:rFonts w:ascii="Avenir Next LT Pro Light" w:hAnsi="Avenir Next LT Pro Light"/>
                 <w:sz w:val="24"/>
                 <w:szCs w:val="24"/>
+                <w:lang w:val="hu-HU"/>
               </w:rPr>
             </w:pPr>
             <w:r>
@@ -2957,6 +3176,7 @@
                 <w:rFonts w:ascii="Avenir Next LT Pro Light" w:hAnsi="Avenir Next LT Pro Light"/>
                 <w:sz w:val="24"/>
                 <w:szCs w:val="24"/>
+                <w:lang w:val="hu-HU"/>
               </w:rPr>
               <w:t>Minimap</w:t>
             </w:r>
@@ -2972,6 +3192,7 @@
                 <w:rFonts w:ascii="Avenir Next LT Pro Light" w:hAnsi="Avenir Next LT Pro Light"/>
                 <w:sz w:val="24"/>
                 <w:szCs w:val="24"/>
+                <w:lang w:val="hu-HU"/>
               </w:rPr>
             </w:pPr>
             <w:r>
@@ -2979,6 +3200,7 @@
                 <w:rFonts w:ascii="Avenir Next LT Pro Light" w:hAnsi="Avenir Next LT Pro Light"/>
                 <w:sz w:val="24"/>
                 <w:szCs w:val="24"/>
+                <w:lang w:val="hu-HU"/>
               </w:rPr>
               <w:t>2-3 nap</w:t>
             </w:r>
@@ -2995,6 +3217,99 @@
                 <w:rFonts w:ascii="Avenir Next LT Pro Light" w:hAnsi="Avenir Next LT Pro Light"/>
                 <w:sz w:val="24"/>
                 <w:szCs w:val="24"/>
+                <w:lang w:val="hu-HU"/>
+              </w:rPr>
+            </w:pPr>
+          </w:p>
+        </w:tc>
+      </w:tr>
+      <w:tr>
+        <w:trPr>
+          <w:trHeight w:val="286"/>
+        </w:trPr>
+        <w:tc>
+          <w:tcPr>
+            <w:tcW w:w="888" w:type="dxa"/>
+          </w:tcPr>
+          <w:p>
+            <w:pPr>
+              <w:pStyle w:val="Listaszerbekezds"/>
+              <w:numPr>
+                <w:ilvl w:val="0"/>
+                <w:numId w:val="13"/>
+              </w:numPr>
+              <w:ind w:left="360"/>
+              <w:rPr>
+                <w:rFonts w:ascii="Avenir Next LT Pro Light" w:hAnsi="Avenir Next LT Pro Light"/>
+                <w:b/>
+                <w:bCs/>
+                <w:sz w:val="24"/>
+                <w:szCs w:val="24"/>
+                <w:lang w:val="hu-HU"/>
+              </w:rPr>
+            </w:pPr>
+          </w:p>
+        </w:tc>
+        <w:tc>
+          <w:tcPr>
+            <w:tcW w:w="4980" w:type="dxa"/>
+          </w:tcPr>
+          <w:p>
+            <w:pPr>
+              <w:rPr>
+                <w:rFonts w:ascii="Avenir Next LT Pro Light" w:hAnsi="Avenir Next LT Pro Light"/>
+                <w:sz w:val="24"/>
+                <w:szCs w:val="24"/>
+                <w:lang w:val="hu-HU"/>
+              </w:rPr>
+            </w:pPr>
+            <w:r>
+              <w:rPr>
+                <w:rFonts w:ascii="Avenir Next LT Pro Light" w:hAnsi="Avenir Next LT Pro Light"/>
+                <w:sz w:val="24"/>
+                <w:szCs w:val="24"/>
+                <w:lang w:val="hu-HU"/>
+              </w:rPr>
+              <w:t>Enemy AI fejlesztése</w:t>
+            </w:r>
+          </w:p>
+        </w:tc>
+        <w:tc>
+          <w:tcPr>
+            <w:tcW w:w="1843" w:type="dxa"/>
+          </w:tcPr>
+          <w:p>
+            <w:pPr>
+              <w:rPr>
+                <w:rFonts w:ascii="Avenir Next LT Pro Light" w:hAnsi="Avenir Next LT Pro Light"/>
+                <w:sz w:val="24"/>
+                <w:szCs w:val="24"/>
+                <w:lang w:val="hu-HU"/>
+              </w:rPr>
+            </w:pPr>
+            <w:r>
+              <w:rPr>
+                <w:rFonts w:ascii="Avenir Next LT Pro Light" w:hAnsi="Avenir Next LT Pro Light"/>
+                <w:sz w:val="24"/>
+                <w:szCs w:val="24"/>
+                <w:lang w:val="hu-HU"/>
+              </w:rPr>
+              <w:t>3 nap</w:t>
+            </w:r>
+          </w:p>
+        </w:tc>
+        <w:tc>
+          <w:tcPr>
+            <w:tcW w:w="1707" w:type="dxa"/>
+          </w:tcPr>
+          <w:p>
+            <w:pPr>
+              <w:jc w:val="center"/>
+              <w:rPr>
+                <w:rFonts w:ascii="Avenir Next LT Pro Light" w:hAnsi="Avenir Next LT Pro Light"/>
+                <w:sz w:val="24"/>
+                <w:szCs w:val="24"/>
+                <w:lang w:val="hu-HU"/>
               </w:rPr>
             </w:pPr>
           </w:p>
@@ -3022,6 +3337,7 @@
                 <w:bCs/>
                 <w:sz w:val="24"/>
                 <w:szCs w:val="24"/>
+                <w:lang w:val="hu-HU"/>
               </w:rPr>
             </w:pPr>
           </w:p>
@@ -3036,6 +3352,7 @@
                 <w:rFonts w:ascii="Avenir Next LT Pro Light" w:hAnsi="Avenir Next LT Pro Light"/>
                 <w:sz w:val="24"/>
                 <w:szCs w:val="24"/>
+                <w:lang w:val="hu-HU"/>
               </w:rPr>
             </w:pPr>
             <w:r>
@@ -3043,24 +3360,9 @@
                 <w:rFonts w:ascii="Avenir Next LT Pro Light" w:hAnsi="Avenir Next LT Pro Light"/>
                 <w:sz w:val="24"/>
                 <w:szCs w:val="24"/>
-              </w:rPr>
-              <w:t xml:space="preserve">Pályaépítés </w:t>
-            </w:r>
-            <w:r>
-              <w:rPr>
-                <w:rFonts w:ascii="Avenir Next LT Pro Light" w:hAnsi="Avenir Next LT Pro Light"/>
-                <w:sz w:val="24"/>
-                <w:szCs w:val="24"/>
-              </w:rPr>
-              <w:t>(Bánya, Kastély</w:t>
-            </w:r>
-            <w:r>
-              <w:rPr>
-                <w:rFonts w:ascii="Avenir Next LT Pro Light" w:hAnsi="Avenir Next LT Pro Light"/>
-                <w:sz w:val="24"/>
-                <w:szCs w:val="24"/>
-              </w:rPr>
-              <w:t>)</w:t>
+                <w:lang w:val="hu-HU"/>
+              </w:rPr>
+              <w:t>Pályaépítés (Bánya, Kastély)</w:t>
             </w:r>
           </w:p>
         </w:tc>
@@ -3074,6 +3376,7 @@
                 <w:rFonts w:ascii="Avenir Next LT Pro Light" w:hAnsi="Avenir Next LT Pro Light"/>
                 <w:sz w:val="24"/>
                 <w:szCs w:val="24"/>
+                <w:lang w:val="hu-HU"/>
               </w:rPr>
             </w:pPr>
             <w:r>
@@ -3081,16 +3384,9 @@
                 <w:rFonts w:ascii="Avenir Next LT Pro Light" w:hAnsi="Avenir Next LT Pro Light"/>
                 <w:sz w:val="24"/>
                 <w:szCs w:val="24"/>
-              </w:rPr>
-              <w:t>6</w:t>
-            </w:r>
-            <w:r>
-              <w:rPr>
-                <w:rFonts w:ascii="Avenir Next LT Pro Light" w:hAnsi="Avenir Next LT Pro Light"/>
-                <w:sz w:val="24"/>
-                <w:szCs w:val="24"/>
-              </w:rPr>
-              <w:t xml:space="preserve"> nap</w:t>
+                <w:lang w:val="hu-HU"/>
+              </w:rPr>
+              <w:t>6 nap</w:t>
             </w:r>
           </w:p>
         </w:tc>
@@ -3105,6 +3401,7 @@
                 <w:rFonts w:ascii="Avenir Next LT Pro Light" w:hAnsi="Avenir Next LT Pro Light"/>
                 <w:sz w:val="24"/>
                 <w:szCs w:val="24"/>
+                <w:lang w:val="hu-HU"/>
               </w:rPr>
             </w:pPr>
           </w:p>
@@ -3132,6 +3429,7 @@
                 <w:bCs/>
                 <w:sz w:val="24"/>
                 <w:szCs w:val="24"/>
+                <w:lang w:val="hu-HU"/>
               </w:rPr>
             </w:pPr>
           </w:p>
@@ -3146,6 +3444,7 @@
                 <w:rFonts w:ascii="Avenir Next LT Pro Light" w:hAnsi="Avenir Next LT Pro Light"/>
                 <w:sz w:val="24"/>
                 <w:szCs w:val="24"/>
+                <w:lang w:val="hu-HU"/>
               </w:rPr>
             </w:pPr>
             <w:r>
@@ -3153,6 +3452,7 @@
                 <w:rFonts w:ascii="Avenir Next LT Pro Light" w:hAnsi="Avenir Next LT Pro Light"/>
                 <w:sz w:val="24"/>
                 <w:szCs w:val="24"/>
+                <w:lang w:val="hu-HU"/>
               </w:rPr>
               <w:t>Boss fight</w:t>
             </w:r>
@@ -3168,6 +3468,7 @@
                 <w:rFonts w:ascii="Avenir Next LT Pro Light" w:hAnsi="Avenir Next LT Pro Light"/>
                 <w:sz w:val="24"/>
                 <w:szCs w:val="24"/>
+                <w:lang w:val="hu-HU"/>
               </w:rPr>
             </w:pPr>
             <w:r>
@@ -3175,6 +3476,7 @@
                 <w:rFonts w:ascii="Avenir Next LT Pro Light" w:hAnsi="Avenir Next LT Pro Light"/>
                 <w:sz w:val="24"/>
                 <w:szCs w:val="24"/>
+                <w:lang w:val="hu-HU"/>
               </w:rPr>
               <w:t>5-7 nap</w:t>
             </w:r>
@@ -3191,6 +3493,7 @@
                 <w:rFonts w:ascii="Avenir Next LT Pro Light" w:hAnsi="Avenir Next LT Pro Light"/>
                 <w:sz w:val="24"/>
                 <w:szCs w:val="24"/>
+                <w:lang w:val="hu-HU"/>
               </w:rPr>
             </w:pPr>
           </w:p>
@@ -3218,6 +3521,7 @@
                 <w:bCs/>
                 <w:sz w:val="24"/>
                 <w:szCs w:val="24"/>
+                <w:lang w:val="hu-HU"/>
               </w:rPr>
             </w:pPr>
           </w:p>
@@ -3232,6 +3536,7 @@
                 <w:rFonts w:ascii="Avenir Next LT Pro Light" w:hAnsi="Avenir Next LT Pro Light"/>
                 <w:sz w:val="24"/>
                 <w:szCs w:val="24"/>
+                <w:lang w:val="hu-HU"/>
               </w:rPr>
             </w:pPr>
             <w:r>
@@ -3239,16 +3544,9 @@
                 <w:rFonts w:ascii="Avenir Next LT Pro Light" w:hAnsi="Avenir Next LT Pro Light"/>
                 <w:sz w:val="24"/>
                 <w:szCs w:val="24"/>
-              </w:rPr>
-              <w:t>Opening c</w:t>
-            </w:r>
-            <w:r>
-              <w:rPr>
-                <w:rFonts w:ascii="Avenir Next LT Pro Light" w:hAnsi="Avenir Next LT Pro Light"/>
-                <w:sz w:val="24"/>
-                <w:szCs w:val="24"/>
-              </w:rPr>
-              <w:t>utscene</w:t>
+                <w:lang w:val="hu-HU"/>
+              </w:rPr>
+              <w:t>Opening cutscene</w:t>
             </w:r>
           </w:p>
         </w:tc>
@@ -3262,6 +3560,7 @@
                 <w:rFonts w:ascii="Avenir Next LT Pro Light" w:hAnsi="Avenir Next LT Pro Light"/>
                 <w:sz w:val="24"/>
                 <w:szCs w:val="24"/>
+                <w:lang w:val="hu-HU"/>
               </w:rPr>
             </w:pPr>
             <w:r>
@@ -3269,6 +3568,7 @@
                 <w:rFonts w:ascii="Avenir Next LT Pro Light" w:hAnsi="Avenir Next LT Pro Light"/>
                 <w:sz w:val="24"/>
                 <w:szCs w:val="24"/>
+                <w:lang w:val="hu-HU"/>
               </w:rPr>
               <w:t>2-3 nap</w:t>
             </w:r>
@@ -3285,6 +3585,7 @@
                 <w:rFonts w:ascii="Avenir Next LT Pro Light" w:hAnsi="Avenir Next LT Pro Light"/>
                 <w:sz w:val="24"/>
                 <w:szCs w:val="24"/>
+                <w:lang w:val="hu-HU"/>
               </w:rPr>
             </w:pPr>
           </w:p>
@@ -3312,6 +3613,7 @@
                 <w:bCs/>
                 <w:sz w:val="24"/>
                 <w:szCs w:val="24"/>
+                <w:lang w:val="hu-HU"/>
               </w:rPr>
             </w:pPr>
           </w:p>
@@ -3326,6 +3628,7 @@
                 <w:rFonts w:ascii="Avenir Next LT Pro Light" w:hAnsi="Avenir Next LT Pro Light"/>
                 <w:sz w:val="24"/>
                 <w:szCs w:val="24"/>
+                <w:lang w:val="hu-HU"/>
               </w:rPr>
             </w:pPr>
             <w:r>
@@ -3333,6 +3636,7 @@
                 <w:rFonts w:ascii="Avenir Next LT Pro Light" w:hAnsi="Avenir Next LT Pro Light"/>
                 <w:sz w:val="24"/>
                 <w:szCs w:val="24"/>
+                <w:lang w:val="hu-HU"/>
               </w:rPr>
               <w:t>Hang és zene</w:t>
             </w:r>
@@ -3348,6 +3652,7 @@
                 <w:rFonts w:ascii="Avenir Next LT Pro Light" w:hAnsi="Avenir Next LT Pro Light"/>
                 <w:sz w:val="24"/>
                 <w:szCs w:val="24"/>
+                <w:lang w:val="hu-HU"/>
               </w:rPr>
             </w:pPr>
             <w:r>
@@ -3355,6 +3660,7 @@
                 <w:rFonts w:ascii="Avenir Next LT Pro Light" w:hAnsi="Avenir Next LT Pro Light"/>
                 <w:sz w:val="24"/>
                 <w:szCs w:val="24"/>
+                <w:lang w:val="hu-HU"/>
               </w:rPr>
               <w:t>3-4 nap</w:t>
             </w:r>
@@ -3371,6 +3677,7 @@
                 <w:rFonts w:ascii="Avenir Next LT Pro Light" w:hAnsi="Avenir Next LT Pro Light"/>
                 <w:sz w:val="24"/>
                 <w:szCs w:val="24"/>
+                <w:lang w:val="hu-HU"/>
               </w:rPr>
             </w:pPr>
           </w:p>
@@ -3398,6 +3705,7 @@
                 <w:bCs/>
                 <w:sz w:val="24"/>
                 <w:szCs w:val="24"/>
+                <w:lang w:val="hu-HU"/>
               </w:rPr>
             </w:pPr>
           </w:p>
@@ -3412,6 +3720,7 @@
                 <w:rFonts w:ascii="Avenir Next LT Pro Light" w:hAnsi="Avenir Next LT Pro Light"/>
                 <w:sz w:val="24"/>
                 <w:szCs w:val="24"/>
+                <w:lang w:val="hu-HU"/>
               </w:rPr>
             </w:pPr>
             <w:r>
@@ -3419,6 +3728,7 @@
                 <w:rFonts w:ascii="Avenir Next LT Pro Light" w:hAnsi="Avenir Next LT Pro Light"/>
                 <w:sz w:val="24"/>
                 <w:szCs w:val="24"/>
+                <w:lang w:val="hu-HU"/>
               </w:rPr>
               <w:t>Quest UI</w:t>
             </w:r>
@@ -3434,6 +3744,7 @@
                 <w:rFonts w:ascii="Avenir Next LT Pro Light" w:hAnsi="Avenir Next LT Pro Light"/>
                 <w:sz w:val="24"/>
                 <w:szCs w:val="24"/>
+                <w:lang w:val="hu-HU"/>
               </w:rPr>
             </w:pPr>
             <w:r>
@@ -3441,6 +3752,7 @@
                 <w:rFonts w:ascii="Avenir Next LT Pro Light" w:hAnsi="Avenir Next LT Pro Light"/>
                 <w:sz w:val="24"/>
                 <w:szCs w:val="24"/>
+                <w:lang w:val="hu-HU"/>
               </w:rPr>
               <w:t>2-3 nap</w:t>
             </w:r>
@@ -3457,6 +3769,7 @@
                 <w:rFonts w:ascii="Avenir Next LT Pro Light" w:hAnsi="Avenir Next LT Pro Light"/>
                 <w:sz w:val="24"/>
                 <w:szCs w:val="24"/>
+                <w:lang w:val="hu-HU"/>
               </w:rPr>
             </w:pPr>
           </w:p>
@@ -3484,6 +3797,7 @@
                 <w:bCs/>
                 <w:sz w:val="24"/>
                 <w:szCs w:val="24"/>
+                <w:lang w:val="hu-HU"/>
               </w:rPr>
             </w:pPr>
           </w:p>
@@ -3498,6 +3812,7 @@
                 <w:rFonts w:ascii="Avenir Next LT Pro Light" w:hAnsi="Avenir Next LT Pro Light"/>
                 <w:sz w:val="24"/>
                 <w:szCs w:val="24"/>
+                <w:lang w:val="hu-HU"/>
               </w:rPr>
             </w:pPr>
             <w:r>
@@ -3505,6 +3820,7 @@
                 <w:rFonts w:ascii="Avenir Next LT Pro Light" w:hAnsi="Avenir Next LT Pro Light"/>
                 <w:sz w:val="24"/>
                 <w:szCs w:val="24"/>
+                <w:lang w:val="hu-HU"/>
               </w:rPr>
               <w:t>Hub pálya + teleport rendszer</w:t>
             </w:r>
@@ -3520,6 +3836,7 @@
                 <w:rFonts w:ascii="Avenir Next LT Pro Light" w:hAnsi="Avenir Next LT Pro Light"/>
                 <w:sz w:val="24"/>
                 <w:szCs w:val="24"/>
+                <w:lang w:val="hu-HU"/>
               </w:rPr>
             </w:pPr>
             <w:r>
@@ -3527,6 +3844,7 @@
                 <w:rFonts w:ascii="Avenir Next LT Pro Light" w:hAnsi="Avenir Next LT Pro Light"/>
                 <w:sz w:val="24"/>
                 <w:szCs w:val="24"/>
+                <w:lang w:val="hu-HU"/>
               </w:rPr>
               <w:t>3-4 nap</w:t>
             </w:r>
@@ -3543,6 +3861,7 @@
                 <w:rFonts w:ascii="Avenir Next LT Pro Light" w:hAnsi="Avenir Next LT Pro Light"/>
                 <w:sz w:val="24"/>
                 <w:szCs w:val="24"/>
+                <w:lang w:val="hu-HU"/>
               </w:rPr>
             </w:pPr>
           </w:p>
@@ -3570,6 +3889,7 @@
                 <w:bCs/>
                 <w:sz w:val="24"/>
                 <w:szCs w:val="24"/>
+                <w:lang w:val="hu-HU"/>
               </w:rPr>
             </w:pPr>
           </w:p>
@@ -3584,6 +3904,7 @@
                 <w:rFonts w:ascii="Avenir Next LT Pro Light" w:hAnsi="Avenir Next LT Pro Light"/>
                 <w:sz w:val="24"/>
                 <w:szCs w:val="24"/>
+                <w:lang w:val="hu-HU"/>
               </w:rPr>
             </w:pPr>
             <w:r>
@@ -3591,6 +3912,7 @@
                 <w:rFonts w:ascii="Avenir Next LT Pro Light" w:hAnsi="Avenir Next LT Pro Light"/>
                 <w:sz w:val="24"/>
                 <w:szCs w:val="24"/>
+                <w:lang w:val="hu-HU"/>
               </w:rPr>
               <w:t>Finomhangolás, effektek</w:t>
             </w:r>
@@ -3606,6 +3928,7 @@
                 <w:rFonts w:ascii="Avenir Next LT Pro Light" w:hAnsi="Avenir Next LT Pro Light"/>
                 <w:sz w:val="24"/>
                 <w:szCs w:val="24"/>
+                <w:lang w:val="hu-HU"/>
               </w:rPr>
             </w:pPr>
             <w:r>
@@ -3613,6 +3936,7 @@
                 <w:rFonts w:ascii="Avenir Next LT Pro Light" w:hAnsi="Avenir Next LT Pro Light"/>
                 <w:sz w:val="24"/>
                 <w:szCs w:val="24"/>
+                <w:lang w:val="hu-HU"/>
               </w:rPr>
               <w:t>4-5 nap</w:t>
             </w:r>
@@ -3629,6 +3953,7 @@
                 <w:rFonts w:ascii="Avenir Next LT Pro Light" w:hAnsi="Avenir Next LT Pro Light"/>
                 <w:sz w:val="24"/>
                 <w:szCs w:val="24"/>
+                <w:lang w:val="hu-HU"/>
               </w:rPr>
             </w:pPr>
           </w:p>
@@ -3639,6 +3964,7 @@
       <w:pPr>
         <w:rPr>
           <w:rFonts w:ascii="Avenir Next LT Pro Light" w:hAnsi="Avenir Next LT Pro Light"/>
+          <w:lang w:val="hu-HU"/>
         </w:rPr>
       </w:pPr>
     </w:p>

</xml_diff>

<commit_message>
Create tutorial map tilesets
</commit_message>
<xml_diff>
--- a/DarkWoodPlatformer_GDD.docx
+++ b/DarkWoodPlatformer_GDD.docx
@@ -2201,7 +2201,68 @@
           <w:szCs w:val="24"/>
           <w:lang w:val="hu-HU"/>
         </w:rPr>
-        <w:t>ha mentésből betöltjük a játékot akkor a meghalt enemyk is maradjanak halottak</w:t>
+        <w:t>ha mentésből betöltjük a játékot akkor a meghalt enemy</w:t>
+      </w:r>
+      <w:r>
+        <w:rPr>
+          <w:rFonts w:ascii="Avenir Next LT Pro Light" w:hAnsi="Avenir Next LT Pro Light"/>
+          <w:sz w:val="24"/>
+          <w:szCs w:val="24"/>
+          <w:lang w:val="hu-HU"/>
+        </w:rPr>
+        <w:t>-</w:t>
+      </w:r>
+      <w:r>
+        <w:rPr>
+          <w:rFonts w:ascii="Avenir Next LT Pro Light" w:hAnsi="Avenir Next LT Pro Light"/>
+          <w:sz w:val="24"/>
+          <w:szCs w:val="24"/>
+          <w:lang w:val="hu-HU"/>
+        </w:rPr>
+        <w:t>k is maradjanak halottak</w:t>
+      </w:r>
+    </w:p>
+    <w:p>
+      <w:pPr>
+        <w:pStyle w:val="Listaszerbekezds"/>
+        <w:numPr>
+          <w:ilvl w:val="0"/>
+          <w:numId w:val="14"/>
+        </w:numPr>
+        <w:rPr>
+          <w:rFonts w:ascii="Avenir Next LT Pro Light" w:hAnsi="Avenir Next LT Pro Light"/>
+          <w:sz w:val="24"/>
+          <w:szCs w:val="24"/>
+          <w:lang w:val="hu-HU"/>
+        </w:rPr>
+      </w:pPr>
+      <w:r>
+        <w:rPr>
+          <w:rFonts w:ascii="Avenir Next LT Pro Light" w:hAnsi="Avenir Next LT Pro Light"/>
+          <w:sz w:val="24"/>
+          <w:szCs w:val="24"/>
+          <w:lang w:val="hu-HU"/>
+        </w:rPr>
+        <w:t>ha elfogy a nyíl akkor is lejátszódik a lövés animáció</w:t>
+      </w:r>
+    </w:p>
+    <w:p>
+      <w:pPr>
+        <w:rPr>
+          <w:rFonts w:ascii="Avenir Next LT Pro Light" w:hAnsi="Avenir Next LT Pro Light"/>
+          <w:sz w:val="24"/>
+          <w:szCs w:val="24"/>
+          <w:lang w:val="hu-HU"/>
+        </w:rPr>
+      </w:pPr>
+      <w:r>
+        <w:rPr>
+          <w:rFonts w:ascii="Avenir Next LT Pro Light" w:hAnsi="Avenir Next LT Pro Light"/>
+          <w:sz w:val="24"/>
+          <w:szCs w:val="24"/>
+          <w:lang w:val="hu-HU"/>
+        </w:rPr>
+        <w:br w:type="page"/>
       </w:r>
     </w:p>
     <w:p>
@@ -2217,6 +2278,7 @@
           <w:rFonts w:ascii="Avenir Next LT Pro Light" w:hAnsi="Avenir Next LT Pro Light"/>
           <w:lang w:val="hu-HU"/>
         </w:rPr>
+        <w:lastRenderedPageBreak/>
         <w:t>8. Mérföldkövek</w:t>
       </w:r>
     </w:p>
@@ -2421,7 +2483,7 @@
                 <w:szCs w:val="24"/>
                 <w:lang w:val="hu-HU"/>
               </w:rPr>
-              <w:t>1-2 nap</w:t>
+              <w:t>folyamatos</w:t>
             </w:r>
           </w:p>
         </w:tc>
@@ -2760,6 +2822,15 @@
                 <w:lang w:val="hu-HU"/>
               </w:rPr>
             </w:pPr>
+            <w:r>
+              <w:rPr>
+                <w:rFonts w:ascii="Segoe UI Emoji" w:hAnsi="Segoe UI Emoji" w:cs="Segoe UI Emoji"/>
+                <w:sz w:val="24"/>
+                <w:szCs w:val="24"/>
+                <w:lang w:val="hu-HU"/>
+              </w:rPr>
+              <w:t>✅</w:t>
+            </w:r>
           </w:p>
         </w:tc>
       </w:tr>
@@ -2852,6 +2923,15 @@
                 <w:lang w:val="hu-HU"/>
               </w:rPr>
             </w:pPr>
+            <w:r>
+              <w:rPr>
+                <w:rFonts w:ascii="Segoe UI Emoji" w:hAnsi="Segoe UI Emoji" w:cs="Segoe UI Emoji"/>
+                <w:sz w:val="24"/>
+                <w:szCs w:val="24"/>
+                <w:lang w:val="hu-HU"/>
+              </w:rPr>
+              <w:t>✅</w:t>
+            </w:r>
           </w:p>
         </w:tc>
       </w:tr>

</xml_diff>

<commit_message>
Új pályarész, ajtó, kulcs assetek importálása
</commit_message>
<xml_diff>
--- a/DarkWoodPlatformer_GDD.docx
+++ b/DarkWoodPlatformer_GDD.docx
@@ -10,37 +10,12 @@
           <w:lang w:val="hu-HU"/>
         </w:rPr>
       </w:pPr>
-      <w:proofErr w:type="spellStart"/>
       <w:r>
         <w:rPr>
           <w:rFonts w:ascii="Avenir Next LT Pro Light" w:hAnsi="Avenir Next LT Pro Light"/>
           <w:lang w:val="hu-HU"/>
         </w:rPr>
-        <w:t>DarkWoodPlatformer</w:t>
-      </w:r>
-      <w:proofErr w:type="spellEnd"/>
-      <w:r>
-        <w:rPr>
-          <w:rFonts w:ascii="Avenir Next LT Pro Light" w:hAnsi="Avenir Next LT Pro Light"/>
-          <w:lang w:val="hu-HU"/>
-        </w:rPr>
-        <w:t xml:space="preserve"> – Game Design </w:t>
-      </w:r>
-      <w:proofErr w:type="spellStart"/>
-      <w:r>
-        <w:rPr>
-          <w:rFonts w:ascii="Avenir Next LT Pro Light" w:hAnsi="Avenir Next LT Pro Light"/>
-          <w:lang w:val="hu-HU"/>
-        </w:rPr>
-        <w:t>Document</w:t>
-      </w:r>
-      <w:proofErr w:type="spellEnd"/>
-      <w:r>
-        <w:rPr>
-          <w:rFonts w:ascii="Avenir Next LT Pro Light" w:hAnsi="Avenir Next LT Pro Light"/>
-          <w:lang w:val="hu-HU"/>
-        </w:rPr>
-        <w:t xml:space="preserve"> (GDD)</w:t>
+        <w:t>DarkWoodPlatformer – Game Design Document (GDD)</w:t>
       </w:r>
     </w:p>
     <w:p>
@@ -118,47 +93,7 @@
                 <w:szCs w:val="24"/>
                 <w:lang w:val="hu-HU"/>
               </w:rPr>
-              <w:t xml:space="preserve">2D pixel art </w:t>
-            </w:r>
-            <w:proofErr w:type="spellStart"/>
-            <w:r>
-              <w:rPr>
-                <w:rFonts w:ascii="Avenir Next LT Pro Light" w:hAnsi="Avenir Next LT Pro Light"/>
-                <w:sz w:val="24"/>
-                <w:szCs w:val="24"/>
-                <w:lang w:val="hu-HU"/>
-              </w:rPr>
-              <w:t>platformer</w:t>
-            </w:r>
-            <w:proofErr w:type="spellEnd"/>
-            <w:r>
-              <w:rPr>
-                <w:rFonts w:ascii="Avenir Next LT Pro Light" w:hAnsi="Avenir Next LT Pro Light"/>
-                <w:sz w:val="24"/>
-                <w:szCs w:val="24"/>
-                <w:lang w:val="hu-HU"/>
-              </w:rPr>
-              <w:t xml:space="preserve">, </w:t>
-            </w:r>
-            <w:proofErr w:type="spellStart"/>
-            <w:r>
-              <w:rPr>
-                <w:rFonts w:ascii="Avenir Next LT Pro Light" w:hAnsi="Avenir Next LT Pro Light"/>
-                <w:sz w:val="24"/>
-                <w:szCs w:val="24"/>
-                <w:lang w:val="hu-HU"/>
-              </w:rPr>
-              <w:t>soulslike</w:t>
-            </w:r>
-            <w:proofErr w:type="spellEnd"/>
-            <w:r>
-              <w:rPr>
-                <w:rFonts w:ascii="Avenir Next LT Pro Light" w:hAnsi="Avenir Next LT Pro Light"/>
-                <w:sz w:val="24"/>
-                <w:szCs w:val="24"/>
-                <w:lang w:val="hu-HU"/>
-              </w:rPr>
-              <w:t xml:space="preserve"> elemekkel</w:t>
+              <w:t>2D pixel art platformer, soulslike elemekkel</w:t>
             </w:r>
           </w:p>
         </w:tc>
@@ -179,7 +114,6 @@
                 <w:lang w:val="hu-HU"/>
               </w:rPr>
             </w:pPr>
-            <w:proofErr w:type="spellStart"/>
             <w:r>
               <w:rPr>
                 <w:rFonts w:ascii="Avenir Next LT Pro Light" w:hAnsi="Avenir Next LT Pro Light"/>
@@ -191,7 +125,6 @@
               </w:rPr>
               <w:t>Engine</w:t>
             </w:r>
-            <w:proofErr w:type="spellEnd"/>
           </w:p>
         </w:tc>
         <w:tc>
@@ -207,7 +140,6 @@
                 <w:lang w:val="hu-HU"/>
               </w:rPr>
             </w:pPr>
-            <w:proofErr w:type="spellStart"/>
             <w:r>
               <w:rPr>
                 <w:rFonts w:ascii="Avenir Next LT Pro Light" w:hAnsi="Avenir Next LT Pro Light"/>
@@ -217,7 +149,6 @@
               </w:rPr>
               <w:t>Unity</w:t>
             </w:r>
-            <w:proofErr w:type="spellEnd"/>
           </w:p>
         </w:tc>
       </w:tr>
@@ -263,7 +194,6 @@
                 <w:lang w:val="hu-HU"/>
               </w:rPr>
             </w:pPr>
-            <w:proofErr w:type="spellStart"/>
             <w:r>
               <w:rPr>
                 <w:rFonts w:ascii="Avenir Next LT Pro Light" w:hAnsi="Avenir Next LT Pro Light"/>
@@ -271,77 +201,7 @@
                 <w:szCs w:val="24"/>
                 <w:lang w:val="hu-HU"/>
               </w:rPr>
-              <w:t>Dark</w:t>
-            </w:r>
-            <w:proofErr w:type="spellEnd"/>
-            <w:r>
-              <w:rPr>
-                <w:rFonts w:ascii="Avenir Next LT Pro Light" w:hAnsi="Avenir Next LT Pro Light"/>
-                <w:sz w:val="24"/>
-                <w:szCs w:val="24"/>
-                <w:lang w:val="hu-HU"/>
-              </w:rPr>
-              <w:t xml:space="preserve"> </w:t>
-            </w:r>
-            <w:proofErr w:type="spellStart"/>
-            <w:r>
-              <w:rPr>
-                <w:rFonts w:ascii="Avenir Next LT Pro Light" w:hAnsi="Avenir Next LT Pro Light"/>
-                <w:sz w:val="24"/>
-                <w:szCs w:val="24"/>
-                <w:lang w:val="hu-HU"/>
-              </w:rPr>
-              <w:t>fantasy</w:t>
-            </w:r>
-            <w:proofErr w:type="spellEnd"/>
-            <w:r>
-              <w:rPr>
-                <w:rFonts w:ascii="Avenir Next LT Pro Light" w:hAnsi="Avenir Next LT Pro Light"/>
-                <w:sz w:val="24"/>
-                <w:szCs w:val="24"/>
-                <w:lang w:val="hu-HU"/>
-              </w:rPr>
-              <w:t xml:space="preserve">, </w:t>
-            </w:r>
-            <w:proofErr w:type="spellStart"/>
-            <w:r>
-              <w:rPr>
-                <w:rFonts w:ascii="Avenir Next LT Pro Light" w:hAnsi="Avenir Next LT Pro Light"/>
-                <w:sz w:val="24"/>
-                <w:szCs w:val="24"/>
-                <w:lang w:val="hu-HU"/>
-              </w:rPr>
-              <w:t>dark</w:t>
-            </w:r>
-            <w:proofErr w:type="spellEnd"/>
-            <w:r>
-              <w:rPr>
-                <w:rFonts w:ascii="Avenir Next LT Pro Light" w:hAnsi="Avenir Next LT Pro Light"/>
-                <w:sz w:val="24"/>
-                <w:szCs w:val="24"/>
-                <w:lang w:val="hu-HU"/>
-              </w:rPr>
-              <w:t xml:space="preserve"> </w:t>
-            </w:r>
-            <w:proofErr w:type="spellStart"/>
-            <w:r>
-              <w:rPr>
-                <w:rFonts w:ascii="Avenir Next LT Pro Light" w:hAnsi="Avenir Next LT Pro Light"/>
-                <w:sz w:val="24"/>
-                <w:szCs w:val="24"/>
-                <w:lang w:val="hu-HU"/>
-              </w:rPr>
-              <w:t>wood</w:t>
-            </w:r>
-            <w:proofErr w:type="spellEnd"/>
-            <w:r>
-              <w:rPr>
-                <w:rFonts w:ascii="Avenir Next LT Pro Light" w:hAnsi="Avenir Next LT Pro Light"/>
-                <w:sz w:val="24"/>
-                <w:szCs w:val="24"/>
-                <w:lang w:val="hu-HU"/>
-              </w:rPr>
-              <w:t xml:space="preserve"> és középkori hangulat, pixel art</w:t>
+              <w:t>Dark fantasy, dark wood és középkori hangulat, pixel art</w:t>
             </w:r>
           </w:p>
         </w:tc>
@@ -442,7 +302,6 @@
                 <w:lang w:val="hu-HU"/>
               </w:rPr>
             </w:pPr>
-            <w:proofErr w:type="spellStart"/>
             <w:r>
               <w:rPr>
                 <w:rFonts w:ascii="Avenir Next LT Pro Light" w:hAnsi="Avenir Next LT Pro Light"/>
@@ -450,37 +309,7 @@
                 <w:szCs w:val="24"/>
                 <w:lang w:val="hu-HU"/>
               </w:rPr>
-              <w:t>Soulslike</w:t>
-            </w:r>
-            <w:proofErr w:type="spellEnd"/>
-            <w:r>
-              <w:rPr>
-                <w:rFonts w:ascii="Avenir Next LT Pro Light" w:hAnsi="Avenir Next LT Pro Light"/>
-                <w:sz w:val="24"/>
-                <w:szCs w:val="24"/>
-                <w:lang w:val="hu-HU"/>
-              </w:rPr>
-              <w:t xml:space="preserve"> / nehéz </w:t>
-            </w:r>
-            <w:proofErr w:type="spellStart"/>
-            <w:r>
-              <w:rPr>
-                <w:rFonts w:ascii="Avenir Next LT Pro Light" w:hAnsi="Avenir Next LT Pro Light"/>
-                <w:sz w:val="24"/>
-                <w:szCs w:val="24"/>
-                <w:lang w:val="hu-HU"/>
-              </w:rPr>
-              <w:t>platformer</w:t>
-            </w:r>
-            <w:proofErr w:type="spellEnd"/>
-            <w:r>
-              <w:rPr>
-                <w:rFonts w:ascii="Avenir Next LT Pro Light" w:hAnsi="Avenir Next LT Pro Light"/>
-                <w:sz w:val="24"/>
-                <w:szCs w:val="24"/>
-                <w:lang w:val="hu-HU"/>
-              </w:rPr>
-              <w:t xml:space="preserve"> rajongók</w:t>
+              <w:t>Soulslike / nehéz platformer rajongók</w:t>
             </w:r>
           </w:p>
         </w:tc>
@@ -534,47 +363,7 @@
                 <w:szCs w:val="24"/>
                 <w:lang w:val="hu-HU"/>
               </w:rPr>
-              <w:t xml:space="preserve">Egy 4–5 pályás, kihívásokkal teli, </w:t>
-            </w:r>
-            <w:proofErr w:type="spellStart"/>
-            <w:r>
-              <w:rPr>
-                <w:rFonts w:ascii="Avenir Next LT Pro Light" w:hAnsi="Avenir Next LT Pro Light"/>
-                <w:sz w:val="24"/>
-                <w:szCs w:val="24"/>
-                <w:lang w:val="hu-HU"/>
-              </w:rPr>
-              <w:t>boss</w:t>
-            </w:r>
-            <w:proofErr w:type="spellEnd"/>
-            <w:r>
-              <w:rPr>
-                <w:rFonts w:ascii="Avenir Next LT Pro Light" w:hAnsi="Avenir Next LT Pro Light"/>
-                <w:sz w:val="24"/>
-                <w:szCs w:val="24"/>
-                <w:lang w:val="hu-HU"/>
-              </w:rPr>
-              <w:t xml:space="preserve"> </w:t>
-            </w:r>
-            <w:proofErr w:type="spellStart"/>
-            <w:r>
-              <w:rPr>
-                <w:rFonts w:ascii="Avenir Next LT Pro Light" w:hAnsi="Avenir Next LT Pro Light"/>
-                <w:sz w:val="24"/>
-                <w:szCs w:val="24"/>
-                <w:lang w:val="hu-HU"/>
-              </w:rPr>
-              <w:t>fight-tal</w:t>
-            </w:r>
-            <w:proofErr w:type="spellEnd"/>
-            <w:r>
-              <w:rPr>
-                <w:rFonts w:ascii="Avenir Next LT Pro Light" w:hAnsi="Avenir Next LT Pro Light"/>
-                <w:sz w:val="24"/>
-                <w:szCs w:val="24"/>
-                <w:lang w:val="hu-HU"/>
-              </w:rPr>
-              <w:t xml:space="preserve"> záruló történeti játék</w:t>
+              <w:t>Egy 4–5 pályás, kihívásokkal teli, boss fight-tal záruló történeti játék</w:t>
             </w:r>
           </w:p>
         </w:tc>
@@ -628,27 +417,7 @@
                 <w:szCs w:val="24"/>
                 <w:lang w:val="hu-HU"/>
               </w:rPr>
-              <w:t>Oldalnézet (</w:t>
-            </w:r>
-            <w:proofErr w:type="spellStart"/>
-            <w:r>
-              <w:rPr>
-                <w:rFonts w:ascii="Avenir Next LT Pro Light" w:hAnsi="Avenir Next LT Pro Light"/>
-                <w:sz w:val="24"/>
-                <w:szCs w:val="24"/>
-                <w:lang w:val="hu-HU"/>
-              </w:rPr>
-              <w:t>Side-scroller</w:t>
-            </w:r>
-            <w:proofErr w:type="spellEnd"/>
-            <w:r>
-              <w:rPr>
-                <w:rFonts w:ascii="Avenir Next LT Pro Light" w:hAnsi="Avenir Next LT Pro Light"/>
-                <w:sz w:val="24"/>
-                <w:szCs w:val="24"/>
-                <w:lang w:val="hu-HU"/>
-              </w:rPr>
-              <w:t>)</w:t>
+              <w:t>Oldalnézet (Side-scroller)</w:t>
             </w:r>
           </w:p>
         </w:tc>
@@ -708,47 +477,7 @@
           <w:szCs w:val="24"/>
           <w:lang w:val="hu-HU"/>
         </w:rPr>
-        <w:t>A játékos egy elátkozott erdő mélyén ébred, ahol egy sötét varázsló (</w:t>
-      </w:r>
-      <w:proofErr w:type="spellStart"/>
-      <w:r>
-        <w:rPr>
-          <w:rFonts w:ascii="Avenir Next LT Pro Light" w:hAnsi="Avenir Next LT Pro Light"/>
-          <w:sz w:val="24"/>
-          <w:szCs w:val="24"/>
-          <w:lang w:val="hu-HU"/>
-        </w:rPr>
-        <w:t>főboss</w:t>
-      </w:r>
-      <w:proofErr w:type="spellEnd"/>
-      <w:r>
-        <w:rPr>
-          <w:rFonts w:ascii="Avenir Next LT Pro Light" w:hAnsi="Avenir Next LT Pro Light"/>
-          <w:sz w:val="24"/>
-          <w:szCs w:val="24"/>
-          <w:lang w:val="hu-HU"/>
-        </w:rPr>
-        <w:t xml:space="preserve">) tartja fogva a királylányt. A kastélyba vezető út veszélyes – elhagyatott börtönökön, lávával teli bányákon és az erdőn keresztül vezet. Minden </w:t>
-      </w:r>
-      <w:proofErr w:type="spellStart"/>
-      <w:r>
-        <w:rPr>
-          <w:rFonts w:ascii="Avenir Next LT Pro Light" w:hAnsi="Avenir Next LT Pro Light"/>
-          <w:sz w:val="24"/>
-          <w:szCs w:val="24"/>
-          <w:lang w:val="hu-HU"/>
-        </w:rPr>
-        <w:t>checkpoint</w:t>
-      </w:r>
-      <w:proofErr w:type="spellEnd"/>
-      <w:r>
-        <w:rPr>
-          <w:rFonts w:ascii="Avenir Next LT Pro Light" w:hAnsi="Avenir Next LT Pro Light"/>
-          <w:sz w:val="24"/>
-          <w:szCs w:val="24"/>
-          <w:lang w:val="hu-HU"/>
-        </w:rPr>
-        <w:t xml:space="preserve"> felébreszti a környék szörnyeit, a túlélés kulcsa pedig a harc és a fejlődés.</w:t>
+        <w:t>A játékos egy elátkozott erdő mélyén ébred, ahol egy sötét varázsló (főboss) tartja fogva a királylányt. A kastélyba vezető út veszélyes – elhagyatott börtönökön, lávával teli bányákon és az erdőn keresztül vezet. Minden checkpoint felébreszti a környék szörnyeit, a túlélés kulcsa pedig a harc és a fejlődés.</w:t>
       </w:r>
     </w:p>
     <w:p>
@@ -809,27 +538,7 @@
           <w:lang w:val="hu-HU"/>
         </w:rPr>
         <w:br/>
-        <w:t xml:space="preserve">- Lassú, nyomasztó zenei aláfestés az erdőben; intenzív, gyors zene a </w:t>
-      </w:r>
-      <w:proofErr w:type="spellStart"/>
-      <w:r>
-        <w:rPr>
-          <w:rFonts w:ascii="Avenir Next LT Pro Light" w:hAnsi="Avenir Next LT Pro Light"/>
-          <w:sz w:val="24"/>
-          <w:szCs w:val="24"/>
-          <w:lang w:val="hu-HU"/>
-        </w:rPr>
-        <w:t>boss</w:t>
-      </w:r>
-      <w:proofErr w:type="spellEnd"/>
-      <w:r>
-        <w:rPr>
-          <w:rFonts w:ascii="Avenir Next LT Pro Light" w:hAnsi="Avenir Next LT Pro Light"/>
-          <w:sz w:val="24"/>
-          <w:szCs w:val="24"/>
-          <w:lang w:val="hu-HU"/>
-        </w:rPr>
-        <w:t xml:space="preserve"> harcokhoz</w:t>
+        <w:t>- Lassú, nyomasztó zenei aláfestés az erdőben; intenzív, gyors zene a boss harcokhoz</w:t>
       </w:r>
     </w:p>
     <w:p>
@@ -871,27 +580,7 @@
           <w:szCs w:val="24"/>
           <w:lang w:val="hu-HU"/>
         </w:rPr>
-        <w:t>Mozgás: Balra/jobbra mozgás, ugrás, csúszás (</w:t>
-      </w:r>
-      <w:proofErr w:type="spellStart"/>
-      <w:r>
-        <w:rPr>
-          <w:rFonts w:ascii="Avenir Next LT Pro Light" w:hAnsi="Avenir Next LT Pro Light"/>
-          <w:sz w:val="24"/>
-          <w:szCs w:val="24"/>
-          <w:lang w:val="hu-HU"/>
-        </w:rPr>
-        <w:t>slide</w:t>
-      </w:r>
-      <w:proofErr w:type="spellEnd"/>
-      <w:r>
-        <w:rPr>
-          <w:rFonts w:ascii="Avenir Next LT Pro Light" w:hAnsi="Avenir Next LT Pro Light"/>
-          <w:sz w:val="24"/>
-          <w:szCs w:val="24"/>
-          <w:lang w:val="hu-HU"/>
-        </w:rPr>
-        <w:t>), falmászás, felkapaszkodás.</w:t>
+        <w:t>Mozgás: Balra/jobbra mozgás, ugrás, csúszás (slide), falmászás, felkapaszkodás.</w:t>
       </w:r>
     </w:p>
     <w:p>
@@ -926,27 +615,7 @@
           <w:szCs w:val="24"/>
           <w:lang w:val="hu-HU"/>
         </w:rPr>
-        <w:t xml:space="preserve"> és később kapjuk meg és korlátozott </w:t>
-      </w:r>
-      <w:proofErr w:type="spellStart"/>
-      <w:r>
-        <w:rPr>
-          <w:rFonts w:ascii="Avenir Next LT Pro Light" w:hAnsi="Avenir Next LT Pro Light"/>
-          <w:sz w:val="24"/>
-          <w:szCs w:val="24"/>
-          <w:lang w:val="hu-HU"/>
-        </w:rPr>
-        <w:t>ammo</w:t>
-      </w:r>
-      <w:proofErr w:type="spellEnd"/>
-      <w:r>
-        <w:rPr>
-          <w:rFonts w:ascii="Avenir Next LT Pro Light" w:hAnsi="Avenir Next LT Pro Light"/>
-          <w:sz w:val="24"/>
-          <w:szCs w:val="24"/>
-          <w:lang w:val="hu-HU"/>
-        </w:rPr>
-        <w:t xml:space="preserve"> van hozzá</w:t>
+        <w:t xml:space="preserve"> és később kapjuk meg és korlátozott ammo van hozzá</w:t>
       </w:r>
       <w:r>
         <w:rPr>
@@ -981,67 +650,7 @@
           <w:szCs w:val="24"/>
           <w:lang w:val="hu-HU"/>
         </w:rPr>
-        <w:t xml:space="preserve">Fejlődés: XP gyűjtése </w:t>
-      </w:r>
-      <w:proofErr w:type="spellStart"/>
-      <w:r>
-        <w:rPr>
-          <w:rFonts w:ascii="Avenir Next LT Pro Light" w:hAnsi="Avenir Next LT Pro Light"/>
-          <w:sz w:val="24"/>
-          <w:szCs w:val="24"/>
-          <w:lang w:val="hu-HU"/>
-        </w:rPr>
-        <w:t>enemy</w:t>
-      </w:r>
-      <w:proofErr w:type="spellEnd"/>
-      <w:r>
-        <w:rPr>
-          <w:rFonts w:ascii="Avenir Next LT Pro Light" w:hAnsi="Avenir Next LT Pro Light"/>
-          <w:sz w:val="24"/>
-          <w:szCs w:val="24"/>
-          <w:lang w:val="hu-HU"/>
-        </w:rPr>
-        <w:t xml:space="preserve">-k legyőzésével, </w:t>
-      </w:r>
-      <w:proofErr w:type="spellStart"/>
-      <w:r>
-        <w:rPr>
-          <w:rFonts w:ascii="Avenir Next LT Pro Light" w:hAnsi="Avenir Next LT Pro Light"/>
-          <w:sz w:val="24"/>
-          <w:szCs w:val="24"/>
-          <w:lang w:val="hu-HU"/>
-        </w:rPr>
-        <w:t>skill</w:t>
-      </w:r>
-      <w:proofErr w:type="spellEnd"/>
-      <w:r>
-        <w:rPr>
-          <w:rFonts w:ascii="Avenir Next LT Pro Light" w:hAnsi="Avenir Next LT Pro Light"/>
-          <w:sz w:val="24"/>
-          <w:szCs w:val="24"/>
-          <w:lang w:val="hu-HU"/>
-        </w:rPr>
-        <w:t xml:space="preserve"> </w:t>
-      </w:r>
-      <w:proofErr w:type="spellStart"/>
-      <w:r>
-        <w:rPr>
-          <w:rFonts w:ascii="Avenir Next LT Pro Light" w:hAnsi="Avenir Next LT Pro Light"/>
-          <w:sz w:val="24"/>
-          <w:szCs w:val="24"/>
-          <w:lang w:val="hu-HU"/>
-        </w:rPr>
-        <w:t>tree</w:t>
-      </w:r>
-      <w:proofErr w:type="spellEnd"/>
-      <w:r>
-        <w:rPr>
-          <w:rFonts w:ascii="Avenir Next LT Pro Light" w:hAnsi="Avenir Next LT Pro Light"/>
-          <w:sz w:val="24"/>
-          <w:szCs w:val="24"/>
-          <w:lang w:val="hu-HU"/>
-        </w:rPr>
-        <w:t>.</w:t>
+        <w:t>Fejlődés: XP gyűjtése enemy-k legyőzésével, skill tree.</w:t>
       </w:r>
     </w:p>
     <w:p>
@@ -1060,7 +669,6 @@
           <w:lang w:val="hu-HU"/>
         </w:rPr>
       </w:pPr>
-      <w:proofErr w:type="spellStart"/>
       <w:r>
         <w:rPr>
           <w:rFonts w:ascii="Avenir Next LT Pro Light" w:hAnsi="Avenir Next LT Pro Light"/>
@@ -1069,17 +677,7 @@
           <w:lang w:val="hu-HU"/>
         </w:rPr>
         <w:lastRenderedPageBreak/>
-        <w:t>Checkpoint</w:t>
-      </w:r>
-      <w:proofErr w:type="spellEnd"/>
-      <w:r>
-        <w:rPr>
-          <w:rFonts w:ascii="Avenir Next LT Pro Light" w:hAnsi="Avenir Next LT Pro Light"/>
-          <w:sz w:val="24"/>
-          <w:szCs w:val="24"/>
-          <w:lang w:val="hu-HU"/>
-        </w:rPr>
-        <w:t xml:space="preserve"> rendszer: Mentési pontok</w:t>
+        <w:t>Checkpoint rendszer: Mentési pontok</w:t>
       </w:r>
       <w:r>
         <w:rPr>
@@ -1088,19 +686,8 @@
           <w:szCs w:val="24"/>
           <w:lang w:val="hu-HU"/>
         </w:rPr>
-        <w:t xml:space="preserve">, teleportálása </w:t>
+        <w:t>, teleportálása hub-ba</w:t>
       </w:r>
-      <w:proofErr w:type="spellStart"/>
-      <w:r>
-        <w:rPr>
-          <w:rFonts w:ascii="Avenir Next LT Pro Light" w:hAnsi="Avenir Next LT Pro Light"/>
-          <w:sz w:val="24"/>
-          <w:szCs w:val="24"/>
-          <w:lang w:val="hu-HU"/>
-        </w:rPr>
-        <w:t>hub-ba</w:t>
-      </w:r>
-      <w:proofErr w:type="spellEnd"/>
       <w:r>
         <w:rPr>
           <w:rFonts w:ascii="Avenir Next LT Pro Light" w:hAnsi="Avenir Next LT Pro Light"/>
@@ -1143,29 +730,8 @@
           <w:szCs w:val="24"/>
           <w:lang w:val="hu-HU"/>
         </w:rPr>
-        <w:t xml:space="preserve">Health </w:t>
+        <w:t xml:space="preserve">Health potion az </w:t>
       </w:r>
-      <w:proofErr w:type="spellStart"/>
-      <w:r>
-        <w:rPr>
-          <w:rFonts w:ascii="Avenir Next LT Pro Light" w:hAnsi="Avenir Next LT Pro Light"/>
-          <w:sz w:val="24"/>
-          <w:szCs w:val="24"/>
-          <w:lang w:val="hu-HU"/>
-        </w:rPr>
-        <w:t>potion</w:t>
-      </w:r>
-      <w:proofErr w:type="spellEnd"/>
-      <w:r>
-        <w:rPr>
-          <w:rFonts w:ascii="Avenir Next LT Pro Light" w:hAnsi="Avenir Next LT Pro Light"/>
-          <w:sz w:val="24"/>
-          <w:szCs w:val="24"/>
-          <w:lang w:val="hu-HU"/>
-        </w:rPr>
-        <w:t xml:space="preserve"> az </w:t>
-      </w:r>
-      <w:proofErr w:type="spellStart"/>
       <w:r>
         <w:rPr>
           <w:rFonts w:ascii="Avenir Next LT Pro Light" w:hAnsi="Avenir Next LT Pro Light"/>
@@ -1175,7 +741,6 @@
         </w:rPr>
         <w:t>inventory</w:t>
       </w:r>
-      <w:proofErr w:type="spellEnd"/>
       <w:r>
         <w:rPr>
           <w:rFonts w:ascii="Avenir Next LT Pro Light" w:hAnsi="Avenir Next LT Pro Light"/>
@@ -1218,104 +783,7 @@
           <w:szCs w:val="24"/>
           <w:lang w:val="hu-HU"/>
         </w:rPr>
-        <w:t xml:space="preserve">NPC-k: </w:t>
-      </w:r>
-      <w:proofErr w:type="spellStart"/>
-      <w:r>
-        <w:rPr>
-          <w:rFonts w:ascii="Avenir Next LT Pro Light" w:hAnsi="Avenir Next LT Pro Light"/>
-          <w:sz w:val="24"/>
-          <w:szCs w:val="24"/>
-          <w:lang w:val="hu-HU"/>
-        </w:rPr>
-        <w:t>Idle</w:t>
-      </w:r>
-      <w:proofErr w:type="spellEnd"/>
-      <w:r>
-        <w:rPr>
-          <w:rFonts w:ascii="Avenir Next LT Pro Light" w:hAnsi="Avenir Next LT Pro Light"/>
-          <w:sz w:val="24"/>
-          <w:szCs w:val="24"/>
-          <w:lang w:val="hu-HU"/>
-        </w:rPr>
-        <w:t xml:space="preserve"> animáció, játékosra fordulás, párbeszéd UI.</w:t>
-      </w:r>
-    </w:p>
-    <w:p>
-      <w:pPr>
-        <w:pStyle w:val="Listaszerbekezds"/>
-        <w:numPr>
-          <w:ilvl w:val="0"/>
-          <w:numId w:val="10"/>
-        </w:numPr>
-        <w:spacing w:after="120"/>
-        <w:ind w:left="142" w:hanging="218"/>
-        <w:rPr>
-          <w:rFonts w:ascii="Avenir Next LT Pro Light" w:hAnsi="Avenir Next LT Pro Light"/>
-          <w:sz w:val="24"/>
-          <w:szCs w:val="24"/>
-          <w:lang w:val="hu-HU"/>
-        </w:rPr>
-      </w:pPr>
-      <w:proofErr w:type="spellStart"/>
-      <w:r>
-        <w:rPr>
-          <w:rFonts w:ascii="Avenir Next LT Pro Light" w:hAnsi="Avenir Next LT Pro Light"/>
-          <w:sz w:val="24"/>
-          <w:szCs w:val="24"/>
-          <w:lang w:val="hu-HU"/>
-        </w:rPr>
-        <w:t>Boss</w:t>
-      </w:r>
-      <w:proofErr w:type="spellEnd"/>
-      <w:r>
-        <w:rPr>
-          <w:rFonts w:ascii="Avenir Next LT Pro Light" w:hAnsi="Avenir Next LT Pro Light"/>
-          <w:sz w:val="24"/>
-          <w:szCs w:val="24"/>
-          <w:lang w:val="hu-HU"/>
-        </w:rPr>
-        <w:t xml:space="preserve"> </w:t>
-      </w:r>
-      <w:proofErr w:type="spellStart"/>
-      <w:r>
-        <w:rPr>
-          <w:rFonts w:ascii="Avenir Next LT Pro Light" w:hAnsi="Avenir Next LT Pro Light"/>
-          <w:sz w:val="24"/>
-          <w:szCs w:val="24"/>
-          <w:lang w:val="hu-HU"/>
-        </w:rPr>
-        <w:t>fight</w:t>
-      </w:r>
-      <w:proofErr w:type="spellEnd"/>
-      <w:r>
-        <w:rPr>
-          <w:rFonts w:ascii="Avenir Next LT Pro Light" w:hAnsi="Avenir Next LT Pro Light"/>
-          <w:sz w:val="24"/>
-          <w:szCs w:val="24"/>
-          <w:lang w:val="hu-HU"/>
-        </w:rPr>
-        <w:t xml:space="preserve">: Több fázisú </w:t>
-      </w:r>
-      <w:proofErr w:type="spellStart"/>
-      <w:r>
-        <w:rPr>
-          <w:rFonts w:ascii="Avenir Next LT Pro Light" w:hAnsi="Avenir Next LT Pro Light"/>
-          <w:sz w:val="24"/>
-          <w:szCs w:val="24"/>
-          <w:lang w:val="hu-HU"/>
-        </w:rPr>
-        <w:t>főboss</w:t>
-      </w:r>
-      <w:proofErr w:type="spellEnd"/>
-      <w:r>
-        <w:rPr>
-          <w:rFonts w:ascii="Avenir Next LT Pro Light" w:hAnsi="Avenir Next LT Pro Light"/>
-          <w:sz w:val="24"/>
-          <w:szCs w:val="24"/>
-          <w:lang w:val="hu-HU"/>
-        </w:rPr>
-        <w:t>, HP bar felül.</w:t>
+        <w:t>NPC-k: Idle animáció, játékosra fordulás, párbeszéd UI.</w:t>
       </w:r>
     </w:p>
     <w:p>
@@ -1341,27 +809,7 @@
           <w:szCs w:val="24"/>
           <w:lang w:val="hu-HU"/>
         </w:rPr>
-        <w:t xml:space="preserve">Küldetések: Opcionális </w:t>
-      </w:r>
-      <w:proofErr w:type="spellStart"/>
-      <w:r>
-        <w:rPr>
-          <w:rFonts w:ascii="Avenir Next LT Pro Light" w:hAnsi="Avenir Next LT Pro Light"/>
-          <w:sz w:val="24"/>
-          <w:szCs w:val="24"/>
-          <w:lang w:val="hu-HU"/>
-        </w:rPr>
-        <w:t>quest</w:t>
-      </w:r>
-      <w:proofErr w:type="spellEnd"/>
-      <w:r>
-        <w:rPr>
-          <w:rFonts w:ascii="Avenir Next LT Pro Light" w:hAnsi="Avenir Next LT Pro Light"/>
-          <w:sz w:val="24"/>
-          <w:szCs w:val="24"/>
-          <w:lang w:val="hu-HU"/>
-        </w:rPr>
-        <w:t xml:space="preserve"> log UI.</w:t>
+        <w:t>Boss fight: Több fázisú főboss, HP bar felül.</w:t>
       </w:r>
     </w:p>
     <w:p>
@@ -1387,27 +835,7 @@
           <w:szCs w:val="24"/>
           <w:lang w:val="hu-HU"/>
         </w:rPr>
-        <w:t xml:space="preserve">Térkép: Egyszerű minimap </w:t>
-      </w:r>
-      <w:proofErr w:type="spellStart"/>
-      <w:r>
-        <w:rPr>
-          <w:rFonts w:ascii="Avenir Next LT Pro Light" w:hAnsi="Avenir Next LT Pro Light"/>
-          <w:sz w:val="24"/>
-          <w:szCs w:val="24"/>
-          <w:lang w:val="hu-HU"/>
-        </w:rPr>
-        <w:t>player</w:t>
-      </w:r>
-      <w:proofErr w:type="spellEnd"/>
-      <w:r>
-        <w:rPr>
-          <w:rFonts w:ascii="Avenir Next LT Pro Light" w:hAnsi="Avenir Next LT Pro Light"/>
-          <w:sz w:val="24"/>
-          <w:szCs w:val="24"/>
-          <w:lang w:val="hu-HU"/>
-        </w:rPr>
-        <w:t xml:space="preserve"> markerrel.</w:t>
+        <w:t>Küldetések: Opcionális quest log UI.</w:t>
       </w:r>
     </w:p>
     <w:p>
@@ -1426,7 +854,6 @@
           <w:lang w:val="hu-HU"/>
         </w:rPr>
       </w:pPr>
-      <w:proofErr w:type="spellStart"/>
       <w:r>
         <w:rPr>
           <w:rFonts w:ascii="Avenir Next LT Pro Light" w:hAnsi="Avenir Next LT Pro Light"/>
@@ -1434,9 +861,25 @@
           <w:szCs w:val="24"/>
           <w:lang w:val="hu-HU"/>
         </w:rPr>
-        <w:t>Hub</w:t>
+        <w:t>Térkép: Egyszerű minimap player markerrel.</w:t>
       </w:r>
-      <w:proofErr w:type="spellEnd"/>
+    </w:p>
+    <w:p>
+      <w:pPr>
+        <w:pStyle w:val="Listaszerbekezds"/>
+        <w:numPr>
+          <w:ilvl w:val="0"/>
+          <w:numId w:val="10"/>
+        </w:numPr>
+        <w:spacing w:after="120"/>
+        <w:ind w:left="142" w:hanging="218"/>
+        <w:rPr>
+          <w:rFonts w:ascii="Avenir Next LT Pro Light" w:hAnsi="Avenir Next LT Pro Light"/>
+          <w:sz w:val="24"/>
+          <w:szCs w:val="24"/>
+          <w:lang w:val="hu-HU"/>
+        </w:rPr>
+      </w:pPr>
       <w:r>
         <w:rPr>
           <w:rFonts w:ascii="Avenir Next LT Pro Light" w:hAnsi="Avenir Next LT Pro Light"/>
@@ -1444,7 +887,7 @@
           <w:szCs w:val="24"/>
           <w:lang w:val="hu-HU"/>
         </w:rPr>
-        <w:t xml:space="preserve"> rendszer</w:t>
+        <w:t>Hub rendszer</w:t>
       </w:r>
       <w:r>
         <w:rPr>
@@ -1464,27 +907,7 @@
           <w:szCs w:val="24"/>
           <w:lang w:val="hu-HU"/>
         </w:rPr>
-        <w:t xml:space="preserve"> Minden </w:t>
-      </w:r>
-      <w:proofErr w:type="spellStart"/>
-      <w:r>
-        <w:rPr>
-          <w:rFonts w:ascii="Avenir Next LT Pro Light" w:hAnsi="Avenir Next LT Pro Light"/>
-          <w:sz w:val="24"/>
-          <w:szCs w:val="24"/>
-          <w:lang w:val="hu-HU"/>
-        </w:rPr>
-        <w:t>checkpointból</w:t>
-      </w:r>
-      <w:proofErr w:type="spellEnd"/>
-      <w:r>
-        <w:rPr>
-          <w:rFonts w:ascii="Avenir Next LT Pro Light" w:hAnsi="Avenir Next LT Pro Light"/>
-          <w:sz w:val="24"/>
-          <w:szCs w:val="24"/>
-          <w:lang w:val="hu-HU"/>
-        </w:rPr>
-        <w:t xml:space="preserve"> vissza</w:t>
+        <w:t xml:space="preserve"> Minden checkpointból vissza</w:t>
       </w:r>
       <w:r>
         <w:rPr>
@@ -1502,107 +925,7 @@
           <w:szCs w:val="24"/>
           <w:lang w:val="hu-HU"/>
         </w:rPr>
-        <w:t xml:space="preserve">teleportálhatunk egy központi </w:t>
-      </w:r>
-      <w:proofErr w:type="spellStart"/>
-      <w:r>
-        <w:rPr>
-          <w:rFonts w:ascii="Avenir Next LT Pro Light" w:hAnsi="Avenir Next LT Pro Light"/>
-          <w:sz w:val="24"/>
-          <w:szCs w:val="24"/>
-          <w:lang w:val="hu-HU"/>
-        </w:rPr>
-        <w:t>hub</w:t>
-      </w:r>
-      <w:proofErr w:type="spellEnd"/>
-      <w:r>
-        <w:rPr>
-          <w:rFonts w:ascii="Avenir Next LT Pro Light" w:hAnsi="Avenir Next LT Pro Light"/>
-          <w:sz w:val="24"/>
-          <w:szCs w:val="24"/>
-          <w:lang w:val="hu-HU"/>
-        </w:rPr>
-        <w:t xml:space="preserve"> területre, ahol biztonságban vagyunk. Itt találhatóak a fejlesztési lehetőségek (</w:t>
-      </w:r>
-      <w:proofErr w:type="spellStart"/>
-      <w:r>
-        <w:rPr>
-          <w:rFonts w:ascii="Avenir Next LT Pro Light" w:hAnsi="Avenir Next LT Pro Light"/>
-          <w:sz w:val="24"/>
-          <w:szCs w:val="24"/>
-          <w:lang w:val="hu-HU"/>
-        </w:rPr>
-        <w:t>skill</w:t>
-      </w:r>
-      <w:proofErr w:type="spellEnd"/>
-      <w:r>
-        <w:rPr>
-          <w:rFonts w:ascii="Avenir Next LT Pro Light" w:hAnsi="Avenir Next LT Pro Light"/>
-          <w:sz w:val="24"/>
-          <w:szCs w:val="24"/>
-          <w:lang w:val="hu-HU"/>
-        </w:rPr>
-        <w:t xml:space="preserve"> </w:t>
-      </w:r>
-      <w:proofErr w:type="spellStart"/>
-      <w:r>
-        <w:rPr>
-          <w:rFonts w:ascii="Avenir Next LT Pro Light" w:hAnsi="Avenir Next LT Pro Light"/>
-          <w:sz w:val="24"/>
-          <w:szCs w:val="24"/>
-          <w:lang w:val="hu-HU"/>
-        </w:rPr>
-        <w:t>tree</w:t>
-      </w:r>
-      <w:proofErr w:type="spellEnd"/>
-      <w:r>
-        <w:rPr>
-          <w:rFonts w:ascii="Avenir Next LT Pro Light" w:hAnsi="Avenir Next LT Pro Light"/>
-          <w:sz w:val="24"/>
-          <w:szCs w:val="24"/>
-          <w:lang w:val="hu-HU"/>
-        </w:rPr>
-        <w:t xml:space="preserve">, </w:t>
-      </w:r>
-      <w:proofErr w:type="spellStart"/>
-      <w:r>
-        <w:rPr>
-          <w:rFonts w:ascii="Avenir Next LT Pro Light" w:hAnsi="Avenir Next LT Pro Light"/>
-          <w:sz w:val="24"/>
-          <w:szCs w:val="24"/>
-          <w:lang w:val="hu-HU"/>
-        </w:rPr>
-        <w:t>potion</w:t>
-      </w:r>
-      <w:proofErr w:type="spellEnd"/>
-      <w:r>
-        <w:rPr>
-          <w:rFonts w:ascii="Avenir Next LT Pro Light" w:hAnsi="Avenir Next LT Pro Light"/>
-          <w:sz w:val="24"/>
-          <w:szCs w:val="24"/>
-          <w:lang w:val="hu-HU"/>
-        </w:rPr>
-        <w:t xml:space="preserve"> fejlesztés, fegyver upgrade). A </w:t>
-      </w:r>
-      <w:proofErr w:type="spellStart"/>
-      <w:r>
-        <w:rPr>
-          <w:rFonts w:ascii="Avenir Next LT Pro Light" w:hAnsi="Avenir Next LT Pro Light"/>
-          <w:sz w:val="24"/>
-          <w:szCs w:val="24"/>
-          <w:lang w:val="hu-HU"/>
-        </w:rPr>
-        <w:t>hub</w:t>
-      </w:r>
-      <w:proofErr w:type="spellEnd"/>
-      <w:r>
-        <w:rPr>
-          <w:rFonts w:ascii="Avenir Next LT Pro Light" w:hAnsi="Avenir Next LT Pro Light"/>
-          <w:sz w:val="24"/>
-          <w:szCs w:val="24"/>
-          <w:lang w:val="hu-HU"/>
-        </w:rPr>
-        <w:t xml:space="preserve"> a játék fő bázisa, ahonnan visszatérhetünk a kalandhoz.</w:t>
+        <w:t>teleportálhatunk egy központi hub területre, ahol biztonságban vagyunk. Itt találhatóak a fejlesztési lehetőségek (skill tree, potion fejlesztés, fegyver upgrade). A hub a játék fő bázisa, ahonnan visszatérhetünk a kalandhoz.</w:t>
       </w:r>
     </w:p>
     <w:p>
@@ -1945,27 +1268,7 @@
                 <w:szCs w:val="24"/>
                 <w:lang w:val="hu-HU"/>
               </w:rPr>
-              <w:t xml:space="preserve">Használható </w:t>
-            </w:r>
-            <w:proofErr w:type="spellStart"/>
-            <w:r>
-              <w:rPr>
-                <w:rFonts w:ascii="Avenir Next LT Pro Light" w:hAnsi="Avenir Next LT Pro Light"/>
-                <w:sz w:val="24"/>
-                <w:szCs w:val="24"/>
-                <w:lang w:val="hu-HU"/>
-              </w:rPr>
-              <w:t>potion</w:t>
-            </w:r>
-            <w:proofErr w:type="spellEnd"/>
-            <w:r>
-              <w:rPr>
-                <w:rFonts w:ascii="Avenir Next LT Pro Light" w:hAnsi="Avenir Next LT Pro Light"/>
-                <w:sz w:val="24"/>
-                <w:szCs w:val="24"/>
-                <w:lang w:val="hu-HU"/>
-              </w:rPr>
-              <w:t xml:space="preserve"> mennyisége</w:t>
+              <w:t>Használható potion mennyisége</w:t>
             </w:r>
             <w:r>
               <w:rPr>
@@ -1993,7 +1296,6 @@
                 <w:lang w:val="hu-HU"/>
               </w:rPr>
             </w:pPr>
-            <w:proofErr w:type="spellStart"/>
             <w:r>
               <w:rPr>
                 <w:rFonts w:ascii="Avenir Next LT Pro Light" w:hAnsi="Avenir Next LT Pro Light"/>
@@ -2001,17 +1303,7 @@
                 <w:szCs w:val="24"/>
                 <w:lang w:val="hu-HU"/>
               </w:rPr>
-              <w:t>Quest</w:t>
-            </w:r>
-            <w:proofErr w:type="spellEnd"/>
-            <w:r>
-              <w:rPr>
-                <w:rFonts w:ascii="Avenir Next LT Pro Light" w:hAnsi="Avenir Next LT Pro Light"/>
-                <w:sz w:val="24"/>
-                <w:szCs w:val="24"/>
-                <w:lang w:val="hu-HU"/>
-              </w:rPr>
-              <w:t xml:space="preserve"> log</w:t>
+              <w:t>Quest log</w:t>
             </w:r>
           </w:p>
         </w:tc>
@@ -2078,7 +1370,6 @@
                 <w:lang w:val="hu-HU"/>
               </w:rPr>
             </w:pPr>
-            <w:proofErr w:type="spellStart"/>
             <w:r>
               <w:rPr>
                 <w:rFonts w:ascii="Avenir Next LT Pro Light" w:hAnsi="Avenir Next LT Pro Light"/>
@@ -2086,17 +1377,7 @@
                 <w:szCs w:val="24"/>
                 <w:lang w:val="hu-HU"/>
               </w:rPr>
-              <w:t>Boss</w:t>
-            </w:r>
-            <w:proofErr w:type="spellEnd"/>
-            <w:r>
-              <w:rPr>
-                <w:rFonts w:ascii="Avenir Next LT Pro Light" w:hAnsi="Avenir Next LT Pro Light"/>
-                <w:sz w:val="24"/>
-                <w:szCs w:val="24"/>
-                <w:lang w:val="hu-HU"/>
-              </w:rPr>
-              <w:t xml:space="preserve"> HP bar</w:t>
+              <w:t>Boss HP bar</w:t>
             </w:r>
           </w:p>
         </w:tc>
@@ -2137,7 +1418,6 @@
                 <w:lang w:val="hu-HU"/>
               </w:rPr>
             </w:pPr>
-            <w:proofErr w:type="spellStart"/>
             <w:r>
               <w:rPr>
                 <w:rFonts w:ascii="Avenir Next LT Pro Light" w:hAnsi="Avenir Next LT Pro Light"/>
@@ -2145,17 +1425,7 @@
                 <w:szCs w:val="24"/>
                 <w:lang w:val="hu-HU"/>
               </w:rPr>
-              <w:t>Boss</w:t>
-            </w:r>
-            <w:proofErr w:type="spellEnd"/>
-            <w:r>
-              <w:rPr>
-                <w:rFonts w:ascii="Avenir Next LT Pro Light" w:hAnsi="Avenir Next LT Pro Light"/>
-                <w:sz w:val="24"/>
-                <w:szCs w:val="24"/>
-                <w:lang w:val="hu-HU"/>
-              </w:rPr>
-              <w:t xml:space="preserve"> életereje harc közben</w:t>
+              <w:t>Boss életereje harc közben</w:t>
             </w:r>
           </w:p>
         </w:tc>
@@ -2194,67 +1464,7 @@
           <w:szCs w:val="24"/>
           <w:lang w:val="hu-HU"/>
         </w:rPr>
-        <w:t xml:space="preserve">• </w:t>
-      </w:r>
-      <w:proofErr w:type="spellStart"/>
-      <w:r>
-        <w:rPr>
-          <w:rFonts w:ascii="Avenir Next LT Pro Light" w:hAnsi="Avenir Next LT Pro Light"/>
-          <w:sz w:val="24"/>
-          <w:szCs w:val="24"/>
-          <w:lang w:val="hu-HU"/>
-        </w:rPr>
-        <w:t>Slide</w:t>
-      </w:r>
-      <w:proofErr w:type="spellEnd"/>
-      <w:r>
-        <w:rPr>
-          <w:rFonts w:ascii="Avenir Next LT Pro Light" w:hAnsi="Avenir Next LT Pro Light"/>
-          <w:sz w:val="24"/>
-          <w:szCs w:val="24"/>
-          <w:lang w:val="hu-HU"/>
-        </w:rPr>
-        <w:t xml:space="preserve"> </w:t>
-      </w:r>
-      <w:proofErr w:type="spellStart"/>
-      <w:r>
-        <w:rPr>
-          <w:rFonts w:ascii="Avenir Next LT Pro Light" w:hAnsi="Avenir Next LT Pro Light"/>
-          <w:sz w:val="24"/>
-          <w:szCs w:val="24"/>
-          <w:lang w:val="hu-HU"/>
-        </w:rPr>
-        <w:t>invincibility</w:t>
-      </w:r>
-      <w:proofErr w:type="spellEnd"/>
-      <w:r>
-        <w:rPr>
-          <w:rFonts w:ascii="Avenir Next LT Pro Light" w:hAnsi="Avenir Next LT Pro Light"/>
-          <w:sz w:val="24"/>
-          <w:szCs w:val="24"/>
-          <w:lang w:val="hu-HU"/>
-        </w:rPr>
-        <w:t xml:space="preserve">: </w:t>
-      </w:r>
-      <w:proofErr w:type="spellStart"/>
-      <w:r>
-        <w:rPr>
-          <w:rFonts w:ascii="Avenir Next LT Pro Light" w:hAnsi="Avenir Next LT Pro Light"/>
-          <w:sz w:val="24"/>
-          <w:szCs w:val="24"/>
-          <w:lang w:val="hu-HU"/>
-        </w:rPr>
-        <w:t>Slide</w:t>
-      </w:r>
-      <w:proofErr w:type="spellEnd"/>
-      <w:r>
-        <w:rPr>
-          <w:rFonts w:ascii="Avenir Next LT Pro Light" w:hAnsi="Avenir Next LT Pro Light"/>
-          <w:sz w:val="24"/>
-          <w:szCs w:val="24"/>
-          <w:lang w:val="hu-HU"/>
-        </w:rPr>
-        <w:t xml:space="preserve"> közben a játékos sérthetetlen.</w:t>
+        <w:t>• Slide invincibility: Slide közben a játékos sérthetetlen.</w:t>
       </w:r>
     </w:p>
     <w:p>
@@ -2294,47 +1504,7 @@
           <w:szCs w:val="24"/>
           <w:lang w:val="hu-HU"/>
         </w:rPr>
-        <w:t xml:space="preserve">• Íj lövés + </w:t>
-      </w:r>
-      <w:proofErr w:type="spellStart"/>
-      <w:r>
-        <w:rPr>
-          <w:rFonts w:ascii="Avenir Next LT Pro Light" w:hAnsi="Avenir Next LT Pro Light"/>
-          <w:sz w:val="24"/>
-          <w:szCs w:val="24"/>
-          <w:lang w:val="hu-HU"/>
-        </w:rPr>
-        <w:t>projectile</w:t>
-      </w:r>
-      <w:proofErr w:type="spellEnd"/>
-      <w:r>
-        <w:rPr>
-          <w:rFonts w:ascii="Avenir Next LT Pro Light" w:hAnsi="Avenir Next LT Pro Light"/>
-          <w:sz w:val="24"/>
-          <w:szCs w:val="24"/>
-          <w:lang w:val="hu-HU"/>
-        </w:rPr>
-        <w:t xml:space="preserve"> </w:t>
-      </w:r>
-      <w:proofErr w:type="spellStart"/>
-      <w:r>
-        <w:rPr>
-          <w:rFonts w:ascii="Avenir Next LT Pro Light" w:hAnsi="Avenir Next LT Pro Light"/>
-          <w:sz w:val="24"/>
-          <w:szCs w:val="24"/>
-          <w:lang w:val="hu-HU"/>
-        </w:rPr>
-        <w:t>collision</w:t>
-      </w:r>
-      <w:proofErr w:type="spellEnd"/>
-      <w:r>
-        <w:rPr>
-          <w:rFonts w:ascii="Avenir Next LT Pro Light" w:hAnsi="Avenir Next LT Pro Light"/>
-          <w:sz w:val="24"/>
-          <w:szCs w:val="24"/>
-          <w:lang w:val="hu-HU"/>
-        </w:rPr>
-        <w:t>.</w:t>
+        <w:t>• Íj lövés + projectile collision.</w:t>
       </w:r>
     </w:p>
     <w:p>
@@ -2354,87 +1524,7 @@
           <w:szCs w:val="24"/>
           <w:lang w:val="hu-HU"/>
         </w:rPr>
-        <w:t xml:space="preserve">• </w:t>
-      </w:r>
-      <w:proofErr w:type="spellStart"/>
-      <w:r>
-        <w:rPr>
-          <w:rFonts w:ascii="Avenir Next LT Pro Light" w:hAnsi="Avenir Next LT Pro Light"/>
-          <w:sz w:val="24"/>
-          <w:szCs w:val="24"/>
-          <w:lang w:val="hu-HU"/>
-        </w:rPr>
-        <w:t>Skill</w:t>
-      </w:r>
-      <w:proofErr w:type="spellEnd"/>
-      <w:r>
-        <w:rPr>
-          <w:rFonts w:ascii="Avenir Next LT Pro Light" w:hAnsi="Avenir Next LT Pro Light"/>
-          <w:sz w:val="24"/>
-          <w:szCs w:val="24"/>
-          <w:lang w:val="hu-HU"/>
-        </w:rPr>
-        <w:t xml:space="preserve"> </w:t>
-      </w:r>
-      <w:proofErr w:type="spellStart"/>
-      <w:r>
-        <w:rPr>
-          <w:rFonts w:ascii="Avenir Next LT Pro Light" w:hAnsi="Avenir Next LT Pro Light"/>
-          <w:sz w:val="24"/>
-          <w:szCs w:val="24"/>
-          <w:lang w:val="hu-HU"/>
-        </w:rPr>
-        <w:t>tree</w:t>
-      </w:r>
-      <w:proofErr w:type="spellEnd"/>
-      <w:r>
-        <w:rPr>
-          <w:rFonts w:ascii="Avenir Next LT Pro Light" w:hAnsi="Avenir Next LT Pro Light"/>
-          <w:sz w:val="24"/>
-          <w:szCs w:val="24"/>
-          <w:lang w:val="hu-HU"/>
-        </w:rPr>
-        <w:t xml:space="preserve">: </w:t>
-      </w:r>
-      <w:proofErr w:type="spellStart"/>
-      <w:r>
-        <w:rPr>
-          <w:rFonts w:ascii="Avenir Next LT Pro Light" w:hAnsi="Avenir Next LT Pro Light"/>
-          <w:sz w:val="24"/>
-          <w:szCs w:val="24"/>
-          <w:lang w:val="hu-HU"/>
-        </w:rPr>
-        <w:t>potion</w:t>
-      </w:r>
-      <w:proofErr w:type="spellEnd"/>
-      <w:r>
-        <w:rPr>
-          <w:rFonts w:ascii="Avenir Next LT Pro Light" w:hAnsi="Avenir Next LT Pro Light"/>
-          <w:sz w:val="24"/>
-          <w:szCs w:val="24"/>
-          <w:lang w:val="hu-HU"/>
-        </w:rPr>
-        <w:t xml:space="preserve"> mennyiség/</w:t>
-      </w:r>
-      <w:proofErr w:type="spellStart"/>
-      <w:r>
-        <w:rPr>
-          <w:rFonts w:ascii="Avenir Next LT Pro Light" w:hAnsi="Avenir Next LT Pro Light"/>
-          <w:sz w:val="24"/>
-          <w:szCs w:val="24"/>
-          <w:lang w:val="hu-HU"/>
-        </w:rPr>
-        <w:t>heal</w:t>
-      </w:r>
-      <w:proofErr w:type="spellEnd"/>
-      <w:r>
-        <w:rPr>
-          <w:rFonts w:ascii="Avenir Next LT Pro Light" w:hAnsi="Avenir Next LT Pro Light"/>
-          <w:sz w:val="24"/>
-          <w:szCs w:val="24"/>
-          <w:lang w:val="hu-HU"/>
-        </w:rPr>
-        <w:t xml:space="preserve"> növelés, sebzés növelés, HP növelés.</w:t>
+        <w:t>• Skill tree: potion mennyiség/heal növelés, sebzés növelés, HP növelés.</w:t>
       </w:r>
     </w:p>
     <w:p>
@@ -2454,47 +1544,7 @@
           <w:szCs w:val="24"/>
           <w:lang w:val="hu-HU"/>
         </w:rPr>
-        <w:t xml:space="preserve">• </w:t>
-      </w:r>
-      <w:proofErr w:type="spellStart"/>
-      <w:r>
-        <w:rPr>
-          <w:rFonts w:ascii="Avenir Next LT Pro Light" w:hAnsi="Avenir Next LT Pro Light"/>
-          <w:sz w:val="24"/>
-          <w:szCs w:val="24"/>
-          <w:lang w:val="hu-HU"/>
-        </w:rPr>
-        <w:t>Checkpoint</w:t>
-      </w:r>
-      <w:proofErr w:type="spellEnd"/>
-      <w:r>
-        <w:rPr>
-          <w:rFonts w:ascii="Avenir Next LT Pro Light" w:hAnsi="Avenir Next LT Pro Light"/>
-          <w:sz w:val="24"/>
-          <w:szCs w:val="24"/>
-          <w:lang w:val="hu-HU"/>
-        </w:rPr>
-        <w:t xml:space="preserve">/mentés: pozíció, HP, XP, </w:t>
-      </w:r>
-      <w:proofErr w:type="spellStart"/>
-      <w:r>
-        <w:rPr>
-          <w:rFonts w:ascii="Avenir Next LT Pro Light" w:hAnsi="Avenir Next LT Pro Light"/>
-          <w:sz w:val="24"/>
-          <w:szCs w:val="24"/>
-          <w:lang w:val="hu-HU"/>
-        </w:rPr>
-        <w:t>skill</w:t>
-      </w:r>
-      <w:proofErr w:type="spellEnd"/>
-      <w:r>
-        <w:rPr>
-          <w:rFonts w:ascii="Avenir Next LT Pro Light" w:hAnsi="Avenir Next LT Pro Light"/>
-          <w:sz w:val="24"/>
-          <w:szCs w:val="24"/>
-          <w:lang w:val="hu-HU"/>
-        </w:rPr>
-        <w:t xml:space="preserve"> adatok.</w:t>
+        <w:t>• Checkpoint/mentés: pozíció, HP, XP, skill adatok.</w:t>
       </w:r>
     </w:p>
     <w:p>
@@ -2644,7 +1694,6 @@
                 <w:lang w:val="hu-HU"/>
               </w:rPr>
             </w:pPr>
-            <w:proofErr w:type="spellStart"/>
             <w:r>
               <w:rPr>
                 <w:rFonts w:ascii="Avenir Next LT Pro Light" w:hAnsi="Avenir Next LT Pro Light"/>
@@ -2652,17 +1701,7 @@
                 <w:szCs w:val="24"/>
                 <w:lang w:val="hu-HU"/>
               </w:rPr>
-              <w:t>Dark</w:t>
-            </w:r>
-            <w:proofErr w:type="spellEnd"/>
-            <w:r>
-              <w:rPr>
-                <w:rFonts w:ascii="Avenir Next LT Pro Light" w:hAnsi="Avenir Next LT Pro Light"/>
-                <w:sz w:val="24"/>
-                <w:szCs w:val="24"/>
-                <w:lang w:val="hu-HU"/>
-              </w:rPr>
-              <w:t xml:space="preserve"> Wood</w:t>
+              <w:t>Dark Wood</w:t>
             </w:r>
           </w:p>
         </w:tc>
@@ -2710,27 +1749,7 @@
                 <w:szCs w:val="24"/>
                 <w:lang w:val="hu-HU"/>
               </w:rPr>
-              <w:t xml:space="preserve">Gyenge </w:t>
-            </w:r>
-            <w:proofErr w:type="spellStart"/>
-            <w:r>
-              <w:rPr>
-                <w:rFonts w:ascii="Avenir Next LT Pro Light" w:hAnsi="Avenir Next LT Pro Light"/>
-                <w:sz w:val="24"/>
-                <w:szCs w:val="24"/>
-                <w:lang w:val="hu-HU"/>
-              </w:rPr>
-              <w:t>enemy</w:t>
-            </w:r>
-            <w:proofErr w:type="spellEnd"/>
-            <w:r>
-              <w:rPr>
-                <w:rFonts w:ascii="Avenir Next LT Pro Light" w:hAnsi="Avenir Next LT Pro Light"/>
-                <w:sz w:val="24"/>
-                <w:szCs w:val="24"/>
-                <w:lang w:val="hu-HU"/>
-              </w:rPr>
-              <w:t>-k, kevés platform kihívás</w:t>
+              <w:t>Gyenge enemy-k, kevés platform kihívás</w:t>
             </w:r>
           </w:p>
         </w:tc>
@@ -2804,27 +1823,7 @@
                 <w:szCs w:val="24"/>
                 <w:lang w:val="hu-HU"/>
               </w:rPr>
-              <w:t xml:space="preserve">Láncos </w:t>
-            </w:r>
-            <w:proofErr w:type="spellStart"/>
-            <w:r>
-              <w:rPr>
-                <w:rFonts w:ascii="Avenir Next LT Pro Light" w:hAnsi="Avenir Next LT Pro Light"/>
-                <w:sz w:val="24"/>
-                <w:szCs w:val="24"/>
-                <w:lang w:val="hu-HU"/>
-              </w:rPr>
-              <w:t>enemy</w:t>
-            </w:r>
-            <w:proofErr w:type="spellEnd"/>
-            <w:r>
-              <w:rPr>
-                <w:rFonts w:ascii="Avenir Next LT Pro Light" w:hAnsi="Avenir Next LT Pro Light"/>
-                <w:sz w:val="24"/>
-                <w:szCs w:val="24"/>
-                <w:lang w:val="hu-HU"/>
-              </w:rPr>
-              <w:t>-k, kulcsos ajtók</w:t>
+              <w:t>Láncos enemy-k, kulcsos ajtók</w:t>
             </w:r>
           </w:p>
         </w:tc>
@@ -2948,27 +1947,7 @@
                 <w:szCs w:val="24"/>
                 <w:lang w:val="hu-HU"/>
               </w:rPr>
-              <w:t xml:space="preserve">Erősebb </w:t>
-            </w:r>
-            <w:proofErr w:type="spellStart"/>
-            <w:r>
-              <w:rPr>
-                <w:rFonts w:ascii="Avenir Next LT Pro Light" w:hAnsi="Avenir Next LT Pro Light"/>
-                <w:sz w:val="24"/>
-                <w:szCs w:val="24"/>
-                <w:lang w:val="hu-HU"/>
-              </w:rPr>
-              <w:t>enemy</w:t>
-            </w:r>
-            <w:proofErr w:type="spellEnd"/>
-            <w:r>
-              <w:rPr>
-                <w:rFonts w:ascii="Avenir Next LT Pro Light" w:hAnsi="Avenir Next LT Pro Light"/>
-                <w:sz w:val="24"/>
-                <w:szCs w:val="24"/>
-                <w:lang w:val="hu-HU"/>
-              </w:rPr>
-              <w:t>-k</w:t>
+              <w:t>Erősebb enemy-k</w:t>
             </w:r>
           </w:p>
         </w:tc>
@@ -3035,7 +2014,6 @@
                 <w:lang w:val="hu-HU"/>
               </w:rPr>
             </w:pPr>
-            <w:proofErr w:type="spellStart"/>
             <w:r>
               <w:rPr>
                 <w:rFonts w:ascii="Avenir Next LT Pro Light" w:hAnsi="Avenir Next LT Pro Light"/>
@@ -3043,17 +2021,7 @@
                 <w:szCs w:val="24"/>
                 <w:lang w:val="hu-HU"/>
               </w:rPr>
-              <w:t>Főboss</w:t>
-            </w:r>
-            <w:proofErr w:type="spellEnd"/>
-            <w:r>
-              <w:rPr>
-                <w:rFonts w:ascii="Avenir Next LT Pro Light" w:hAnsi="Avenir Next LT Pro Light"/>
-                <w:sz w:val="24"/>
-                <w:szCs w:val="24"/>
-                <w:lang w:val="hu-HU"/>
-              </w:rPr>
-              <w:t xml:space="preserve"> helyszín</w:t>
+              <w:t>Főboss helyszín</w:t>
             </w:r>
           </w:p>
         </w:tc>
@@ -3070,7 +2038,6 @@
                 <w:lang w:val="hu-HU"/>
               </w:rPr>
             </w:pPr>
-            <w:proofErr w:type="spellStart"/>
             <w:r>
               <w:rPr>
                 <w:rFonts w:ascii="Avenir Next LT Pro Light" w:hAnsi="Avenir Next LT Pro Light"/>
@@ -3078,49 +2045,8 @@
                 <w:szCs w:val="24"/>
                 <w:lang w:val="hu-HU"/>
               </w:rPr>
-              <w:t>Boss</w:t>
+              <w:t>Boss arena, cutscene</w:t>
             </w:r>
-            <w:proofErr w:type="spellEnd"/>
-            <w:r>
-              <w:rPr>
-                <w:rFonts w:ascii="Avenir Next LT Pro Light" w:hAnsi="Avenir Next LT Pro Light"/>
-                <w:sz w:val="24"/>
-                <w:szCs w:val="24"/>
-                <w:lang w:val="hu-HU"/>
-              </w:rPr>
-              <w:t xml:space="preserve"> </w:t>
-            </w:r>
-            <w:proofErr w:type="spellStart"/>
-            <w:r>
-              <w:rPr>
-                <w:rFonts w:ascii="Avenir Next LT Pro Light" w:hAnsi="Avenir Next LT Pro Light"/>
-                <w:sz w:val="24"/>
-                <w:szCs w:val="24"/>
-                <w:lang w:val="hu-HU"/>
-              </w:rPr>
-              <w:t>arena</w:t>
-            </w:r>
-            <w:proofErr w:type="spellEnd"/>
-            <w:r>
-              <w:rPr>
-                <w:rFonts w:ascii="Avenir Next LT Pro Light" w:hAnsi="Avenir Next LT Pro Light"/>
-                <w:sz w:val="24"/>
-                <w:szCs w:val="24"/>
-                <w:lang w:val="hu-HU"/>
-              </w:rPr>
-              <w:t xml:space="preserve">, </w:t>
-            </w:r>
-            <w:proofErr w:type="spellStart"/>
-            <w:r>
-              <w:rPr>
-                <w:rFonts w:ascii="Avenir Next LT Pro Light" w:hAnsi="Avenir Next LT Pro Light"/>
-                <w:sz w:val="24"/>
-                <w:szCs w:val="24"/>
-                <w:lang w:val="hu-HU"/>
-              </w:rPr>
-              <w:t>cutscene</w:t>
-            </w:r>
-            <w:proofErr w:type="spellEnd"/>
           </w:p>
         </w:tc>
       </w:tr>
@@ -3138,7 +2064,6 @@
                 <w:lang w:val="hu-HU"/>
               </w:rPr>
             </w:pPr>
-            <w:proofErr w:type="spellStart"/>
             <w:r>
               <w:rPr>
                 <w:rFonts w:ascii="Avenir Next LT Pro Light" w:hAnsi="Avenir Next LT Pro Light"/>
@@ -3146,17 +2071,7 @@
                 <w:szCs w:val="24"/>
                 <w:lang w:val="hu-HU"/>
               </w:rPr>
-              <w:t>Hub</w:t>
-            </w:r>
-            <w:proofErr w:type="spellEnd"/>
-            <w:r>
-              <w:rPr>
-                <w:rFonts w:ascii="Avenir Next LT Pro Light" w:hAnsi="Avenir Next LT Pro Light"/>
-                <w:sz w:val="24"/>
-                <w:szCs w:val="24"/>
-                <w:lang w:val="hu-HU"/>
-              </w:rPr>
-              <w:t xml:space="preserve"> terület</w:t>
+              <w:t>Hub terület</w:t>
             </w:r>
           </w:p>
         </w:tc>
@@ -3258,7 +2173,6 @@
           <w:lang w:val="hu-HU"/>
         </w:rPr>
       </w:pPr>
-      <w:proofErr w:type="spellStart"/>
       <w:r>
         <w:rPr>
           <w:rFonts w:ascii="Avenir Next LT Pro Light" w:hAnsi="Avenir Next LT Pro Light"/>
@@ -3266,17 +2180,7 @@
           <w:szCs w:val="24"/>
           <w:lang w:val="hu-HU"/>
         </w:rPr>
-        <w:t>slide</w:t>
-      </w:r>
-      <w:proofErr w:type="spellEnd"/>
-      <w:r>
-        <w:rPr>
-          <w:rFonts w:ascii="Avenir Next LT Pro Light" w:hAnsi="Avenir Next LT Pro Light"/>
-          <w:sz w:val="24"/>
-          <w:szCs w:val="24"/>
-          <w:lang w:val="hu-HU"/>
-        </w:rPr>
-        <w:t xml:space="preserve"> közben nem sérthetetlen a karakter</w:t>
+        <w:t>slide közben nem sérthetetlen a karakter</w:t>
       </w:r>
     </w:p>
     <w:p>
@@ -3297,19 +2201,8 @@
           <w:szCs w:val="24"/>
           <w:lang w:val="hu-HU"/>
         </w:rPr>
-        <w:t xml:space="preserve">ha mentésből betöltjük a játékot akkor a meghalt </w:t>
+        <w:t>ha mentésből betöltjük a játékot akkor a meghalt enemy</w:t>
       </w:r>
-      <w:proofErr w:type="spellStart"/>
-      <w:r>
-        <w:rPr>
-          <w:rFonts w:ascii="Avenir Next LT Pro Light" w:hAnsi="Avenir Next LT Pro Light"/>
-          <w:sz w:val="24"/>
-          <w:szCs w:val="24"/>
-          <w:lang w:val="hu-HU"/>
-        </w:rPr>
-        <w:t>enemy</w:t>
-      </w:r>
-      <w:proofErr w:type="spellEnd"/>
       <w:r>
         <w:rPr>
           <w:rFonts w:ascii="Avenir Next LT Pro Light" w:hAnsi="Avenir Next LT Pro Light"/>
@@ -3367,7 +2260,6 @@
           <w:lang w:val="hu-HU"/>
         </w:rPr>
       </w:pPr>
-      <w:proofErr w:type="spellStart"/>
       <w:r>
         <w:rPr>
           <w:rFonts w:ascii="Avenir Next LT Pro Light" w:hAnsi="Avenir Next LT Pro Light"/>
@@ -3375,17 +2267,7 @@
           <w:szCs w:val="24"/>
           <w:lang w:val="hu-HU"/>
         </w:rPr>
-        <w:t>enemy</w:t>
-      </w:r>
-      <w:proofErr w:type="spellEnd"/>
-      <w:r>
-        <w:rPr>
-          <w:rFonts w:ascii="Avenir Next LT Pro Light" w:hAnsi="Avenir Next LT Pro Light"/>
-          <w:sz w:val="24"/>
-          <w:szCs w:val="24"/>
-          <w:lang w:val="hu-HU"/>
-        </w:rPr>
-        <w:t xml:space="preserve"> leesik a pálya széléről akkor semmisüljön meg egy idő után</w:t>
+        <w:t>enemy leesik a pálya széléről akkor semmisüljön meg egy idő után</w:t>
       </w:r>
     </w:p>
     <w:p>
@@ -3697,7 +2579,6 @@
                 <w:lang w:val="hu-HU"/>
               </w:rPr>
             </w:pPr>
-            <w:proofErr w:type="spellStart"/>
             <w:r>
               <w:rPr>
                 <w:rFonts w:ascii="Avenir Next LT Pro Light" w:hAnsi="Avenir Next LT Pro Light"/>
@@ -3705,17 +2586,7 @@
                 <w:szCs w:val="24"/>
                 <w:lang w:val="hu-HU"/>
               </w:rPr>
-              <w:t>Checkpoint</w:t>
-            </w:r>
-            <w:proofErr w:type="spellEnd"/>
-            <w:r>
-              <w:rPr>
-                <w:rFonts w:ascii="Avenir Next LT Pro Light" w:hAnsi="Avenir Next LT Pro Light"/>
-                <w:sz w:val="24"/>
-                <w:szCs w:val="24"/>
-                <w:lang w:val="hu-HU"/>
-              </w:rPr>
-              <w:t xml:space="preserve"> </w:t>
+              <w:t xml:space="preserve">Checkpoint </w:t>
             </w:r>
           </w:p>
         </w:tc>
@@ -4238,7 +3109,7 @@
                 <w:szCs w:val="24"/>
                 <w:lang w:val="hu-HU"/>
               </w:rPr>
-              <w:t>NPC rendszer</w:t>
+              <w:t>Tutorial szövegek</w:t>
             </w:r>
           </w:p>
         </w:tc>
@@ -4262,7 +3133,7 @@
                 <w:szCs w:val="24"/>
                 <w:lang w:val="hu-HU"/>
               </w:rPr>
-              <w:t>3-4 nap</w:t>
+              <w:t>1-2 nap</w:t>
             </w:r>
           </w:p>
         </w:tc>
@@ -4323,7 +3194,6 @@
                 <w:lang w:val="hu-HU"/>
               </w:rPr>
             </w:pPr>
-            <w:proofErr w:type="spellStart"/>
             <w:r>
               <w:rPr>
                 <w:rFonts w:ascii="Avenir Next LT Pro Light" w:hAnsi="Avenir Next LT Pro Light"/>
@@ -4331,29 +3201,8 @@
                 <w:szCs w:val="24"/>
                 <w:lang w:val="hu-HU"/>
               </w:rPr>
-              <w:t>Skill</w:t>
+              <w:t>NPC rendszer</w:t>
             </w:r>
-            <w:proofErr w:type="spellEnd"/>
-            <w:r>
-              <w:rPr>
-                <w:rFonts w:ascii="Avenir Next LT Pro Light" w:hAnsi="Avenir Next LT Pro Light"/>
-                <w:sz w:val="24"/>
-                <w:szCs w:val="24"/>
-                <w:lang w:val="hu-HU"/>
-              </w:rPr>
-              <w:t xml:space="preserve"> </w:t>
-            </w:r>
-            <w:proofErr w:type="spellStart"/>
-            <w:r>
-              <w:rPr>
-                <w:rFonts w:ascii="Avenir Next LT Pro Light" w:hAnsi="Avenir Next LT Pro Light"/>
-                <w:sz w:val="24"/>
-                <w:szCs w:val="24"/>
-                <w:lang w:val="hu-HU"/>
-              </w:rPr>
-              <w:t>tree</w:t>
-            </w:r>
-            <w:proofErr w:type="spellEnd"/>
           </w:p>
         </w:tc>
         <w:tc>
@@ -4376,7 +3225,7 @@
                 <w:szCs w:val="24"/>
                 <w:lang w:val="hu-HU"/>
               </w:rPr>
-              <w:t>4-5 nap</w:t>
+              <w:t>3-4 nap</w:t>
             </w:r>
           </w:p>
         </w:tc>
@@ -4444,7 +3293,7 @@
                 <w:szCs w:val="24"/>
                 <w:lang w:val="hu-HU"/>
               </w:rPr>
-              <w:t>Minimap</w:t>
+              <w:t>Skill tree</w:t>
             </w:r>
           </w:p>
         </w:tc>
@@ -4468,7 +3317,7 @@
                 <w:szCs w:val="24"/>
                 <w:lang w:val="hu-HU"/>
               </w:rPr>
-              <w:t>2-3 nap</w:t>
+              <w:t>4-5 nap</w:t>
             </w:r>
           </w:p>
         </w:tc>
@@ -4529,7 +3378,6 @@
                 <w:lang w:val="hu-HU"/>
               </w:rPr>
             </w:pPr>
-            <w:proofErr w:type="spellStart"/>
             <w:r>
               <w:rPr>
                 <w:rFonts w:ascii="Avenir Next LT Pro Light" w:hAnsi="Avenir Next LT Pro Light"/>
@@ -4537,9 +3385,23 @@
                 <w:szCs w:val="24"/>
                 <w:lang w:val="hu-HU"/>
               </w:rPr>
-              <w:t>Enemy</w:t>
+              <w:t>Minimap</w:t>
             </w:r>
-            <w:proofErr w:type="spellEnd"/>
+          </w:p>
+        </w:tc>
+        <w:tc>
+          <w:tcPr>
+            <w:tcW w:w="1843" w:type="dxa"/>
+          </w:tcPr>
+          <w:p>
+            <w:pPr>
+              <w:rPr>
+                <w:rFonts w:ascii="Avenir Next LT Pro Light" w:hAnsi="Avenir Next LT Pro Light"/>
+                <w:sz w:val="24"/>
+                <w:szCs w:val="24"/>
+                <w:lang w:val="hu-HU"/>
+              </w:rPr>
+            </w:pPr>
             <w:r>
               <w:rPr>
                 <w:rFonts w:ascii="Avenir Next LT Pro Light" w:hAnsi="Avenir Next LT Pro Light"/>
@@ -4547,7 +3409,75 @@
                 <w:szCs w:val="24"/>
                 <w:lang w:val="hu-HU"/>
               </w:rPr>
-              <w:t xml:space="preserve"> AI fejlesztése</w:t>
+              <w:t>2-3 nap</w:t>
+            </w:r>
+          </w:p>
+        </w:tc>
+        <w:tc>
+          <w:tcPr>
+            <w:tcW w:w="1707" w:type="dxa"/>
+          </w:tcPr>
+          <w:p>
+            <w:pPr>
+              <w:jc w:val="center"/>
+              <w:rPr>
+                <w:rFonts w:ascii="Avenir Next LT Pro Light" w:hAnsi="Avenir Next LT Pro Light"/>
+                <w:sz w:val="24"/>
+                <w:szCs w:val="24"/>
+                <w:lang w:val="hu-HU"/>
+              </w:rPr>
+            </w:pPr>
+          </w:p>
+        </w:tc>
+      </w:tr>
+      <w:tr>
+        <w:trPr>
+          <w:trHeight w:val="286"/>
+        </w:trPr>
+        <w:tc>
+          <w:tcPr>
+            <w:tcW w:w="888" w:type="dxa"/>
+          </w:tcPr>
+          <w:p>
+            <w:pPr>
+              <w:pStyle w:val="Listaszerbekezds"/>
+              <w:numPr>
+                <w:ilvl w:val="0"/>
+                <w:numId w:val="13"/>
+              </w:numPr>
+              <w:ind w:left="360"/>
+              <w:rPr>
+                <w:rFonts w:ascii="Avenir Next LT Pro Light" w:hAnsi="Avenir Next LT Pro Light"/>
+                <w:b/>
+                <w:bCs/>
+                <w:sz w:val="24"/>
+                <w:szCs w:val="24"/>
+                <w:lang w:val="hu-HU"/>
+              </w:rPr>
+            </w:pPr>
+          </w:p>
+        </w:tc>
+        <w:tc>
+          <w:tcPr>
+            <w:tcW w:w="4980" w:type="dxa"/>
+          </w:tcPr>
+          <w:p>
+            <w:pPr>
+              <w:rPr>
+                <w:rFonts w:ascii="Avenir Next LT Pro Light" w:hAnsi="Avenir Next LT Pro Light"/>
+                <w:sz w:val="24"/>
+                <w:szCs w:val="24"/>
+                <w:lang w:val="hu-HU"/>
+              </w:rPr>
+            </w:pPr>
+            <w:r>
+              <w:rPr>
+                <w:rFonts w:ascii="Avenir Next LT Pro Light" w:hAnsi="Avenir Next LT Pro Light"/>
+                <w:sz w:val="24"/>
+                <w:szCs w:val="24"/>
+                <w:lang w:val="hu-HU"/>
+              </w:rPr>
+              <w:t>Enemy AI fejlesztése</w:t>
             </w:r>
           </w:p>
         </w:tc>
@@ -4724,7 +3654,6 @@
                 <w:lang w:val="hu-HU"/>
               </w:rPr>
             </w:pPr>
-            <w:proofErr w:type="spellStart"/>
             <w:r>
               <w:rPr>
                 <w:rFonts w:ascii="Avenir Next LT Pro Light" w:hAnsi="Avenir Next LT Pro Light"/>
@@ -4732,29 +3661,8 @@
                 <w:szCs w:val="24"/>
                 <w:lang w:val="hu-HU"/>
               </w:rPr>
-              <w:t>Boss</w:t>
+              <w:t>Boss fight</w:t>
             </w:r>
-            <w:proofErr w:type="spellEnd"/>
-            <w:r>
-              <w:rPr>
-                <w:rFonts w:ascii="Avenir Next LT Pro Light" w:hAnsi="Avenir Next LT Pro Light"/>
-                <w:sz w:val="24"/>
-                <w:szCs w:val="24"/>
-                <w:lang w:val="hu-HU"/>
-              </w:rPr>
-              <w:t xml:space="preserve"> </w:t>
-            </w:r>
-            <w:proofErr w:type="spellStart"/>
-            <w:r>
-              <w:rPr>
-                <w:rFonts w:ascii="Avenir Next LT Pro Light" w:hAnsi="Avenir Next LT Pro Light"/>
-                <w:sz w:val="24"/>
-                <w:szCs w:val="24"/>
-                <w:lang w:val="hu-HU"/>
-              </w:rPr>
-              <w:t>fight</w:t>
-            </w:r>
-            <w:proofErr w:type="spellEnd"/>
           </w:p>
         </w:tc>
         <w:tc>
@@ -4845,19 +3753,8 @@
                 <w:szCs w:val="24"/>
                 <w:lang w:val="hu-HU"/>
               </w:rPr>
-              <w:t xml:space="preserve">Opening </w:t>
+              <w:t>Opening cutscene</w:t>
             </w:r>
-            <w:proofErr w:type="spellStart"/>
-            <w:r>
-              <w:rPr>
-                <w:rFonts w:ascii="Avenir Next LT Pro Light" w:hAnsi="Avenir Next LT Pro Light"/>
-                <w:sz w:val="24"/>
-                <w:szCs w:val="24"/>
-                <w:lang w:val="hu-HU"/>
-              </w:rPr>
-              <w:t>cutscene</w:t>
-            </w:r>
-            <w:proofErr w:type="spellEnd"/>
           </w:p>
         </w:tc>
         <w:tc>
@@ -5033,7 +3930,6 @@
                 <w:lang w:val="hu-HU"/>
               </w:rPr>
             </w:pPr>
-            <w:proofErr w:type="spellStart"/>
             <w:r>
               <w:rPr>
                 <w:rFonts w:ascii="Avenir Next LT Pro Light" w:hAnsi="Avenir Next LT Pro Light"/>
@@ -5041,17 +3937,7 @@
                 <w:szCs w:val="24"/>
                 <w:lang w:val="hu-HU"/>
               </w:rPr>
-              <w:t>Quest</w:t>
-            </w:r>
-            <w:proofErr w:type="spellEnd"/>
-            <w:r>
-              <w:rPr>
-                <w:rFonts w:ascii="Avenir Next LT Pro Light" w:hAnsi="Avenir Next LT Pro Light"/>
-                <w:sz w:val="24"/>
-                <w:szCs w:val="24"/>
-                <w:lang w:val="hu-HU"/>
-              </w:rPr>
-              <w:t xml:space="preserve"> UI</w:t>
+              <w:t>Quest UI</w:t>
             </w:r>
           </w:p>
         </w:tc>
@@ -5136,7 +4022,6 @@
                 <w:lang w:val="hu-HU"/>
               </w:rPr>
             </w:pPr>
-            <w:proofErr w:type="spellStart"/>
             <w:r>
               <w:rPr>
                 <w:rFonts w:ascii="Avenir Next LT Pro Light" w:hAnsi="Avenir Next LT Pro Light"/>
@@ -5144,17 +4029,7 @@
                 <w:szCs w:val="24"/>
                 <w:lang w:val="hu-HU"/>
               </w:rPr>
-              <w:t>Hub</w:t>
-            </w:r>
-            <w:proofErr w:type="spellEnd"/>
-            <w:r>
-              <w:rPr>
-                <w:rFonts w:ascii="Avenir Next LT Pro Light" w:hAnsi="Avenir Next LT Pro Light"/>
-                <w:sz w:val="24"/>
-                <w:szCs w:val="24"/>
-                <w:lang w:val="hu-HU"/>
-              </w:rPr>
-              <w:t xml:space="preserve"> pálya + teleport rendszer</w:t>
+              <w:t>Hub pálya + teleport rendszer</w:t>
             </w:r>
           </w:p>
         </w:tc>

</xml_diff>

<commit_message>
teljes Boss létrehozása (nem végleges)
</commit_message>
<xml_diff>
--- a/DarkWoodPlatformer_GDD.docx
+++ b/DarkWoodPlatformer_GDD.docx
@@ -10,12 +10,37 @@
           <w:lang w:val="hu-HU"/>
         </w:rPr>
       </w:pPr>
+      <w:proofErr w:type="spellStart"/>
       <w:r>
         <w:rPr>
           <w:rFonts w:ascii="Avenir Next LT Pro Light" w:hAnsi="Avenir Next LT Pro Light"/>
           <w:lang w:val="hu-HU"/>
         </w:rPr>
-        <w:t>DarkWoodPlatformer – Game Design Document (GDD)</w:t>
+        <w:t>DarkWoodPlatformer</w:t>
+      </w:r>
+      <w:proofErr w:type="spellEnd"/>
+      <w:r>
+        <w:rPr>
+          <w:rFonts w:ascii="Avenir Next LT Pro Light" w:hAnsi="Avenir Next LT Pro Light"/>
+          <w:lang w:val="hu-HU"/>
+        </w:rPr>
+        <w:t xml:space="preserve"> – Game Design </w:t>
+      </w:r>
+      <w:proofErr w:type="spellStart"/>
+      <w:r>
+        <w:rPr>
+          <w:rFonts w:ascii="Avenir Next LT Pro Light" w:hAnsi="Avenir Next LT Pro Light"/>
+          <w:lang w:val="hu-HU"/>
+        </w:rPr>
+        <w:t>Document</w:t>
+      </w:r>
+      <w:proofErr w:type="spellEnd"/>
+      <w:r>
+        <w:rPr>
+          <w:rFonts w:ascii="Avenir Next LT Pro Light" w:hAnsi="Avenir Next LT Pro Light"/>
+          <w:lang w:val="hu-HU"/>
+        </w:rPr>
+        <w:t xml:space="preserve"> (GDD)</w:t>
       </w:r>
     </w:p>
     <w:p>
@@ -93,7 +118,47 @@
                 <w:szCs w:val="24"/>
                 <w:lang w:val="hu-HU"/>
               </w:rPr>
-              <w:t>2D pixel art platformer, soulslike elemekkel</w:t>
+              <w:t xml:space="preserve">2D pixel art </w:t>
+            </w:r>
+            <w:proofErr w:type="spellStart"/>
+            <w:r>
+              <w:rPr>
+                <w:rFonts w:ascii="Avenir Next LT Pro Light" w:hAnsi="Avenir Next LT Pro Light"/>
+                <w:sz w:val="24"/>
+                <w:szCs w:val="24"/>
+                <w:lang w:val="hu-HU"/>
+              </w:rPr>
+              <w:t>platformer</w:t>
+            </w:r>
+            <w:proofErr w:type="spellEnd"/>
+            <w:r>
+              <w:rPr>
+                <w:rFonts w:ascii="Avenir Next LT Pro Light" w:hAnsi="Avenir Next LT Pro Light"/>
+                <w:sz w:val="24"/>
+                <w:szCs w:val="24"/>
+                <w:lang w:val="hu-HU"/>
+              </w:rPr>
+              <w:t xml:space="preserve">, </w:t>
+            </w:r>
+            <w:proofErr w:type="spellStart"/>
+            <w:r>
+              <w:rPr>
+                <w:rFonts w:ascii="Avenir Next LT Pro Light" w:hAnsi="Avenir Next LT Pro Light"/>
+                <w:sz w:val="24"/>
+                <w:szCs w:val="24"/>
+                <w:lang w:val="hu-HU"/>
+              </w:rPr>
+              <w:t>soulslike</w:t>
+            </w:r>
+            <w:proofErr w:type="spellEnd"/>
+            <w:r>
+              <w:rPr>
+                <w:rFonts w:ascii="Avenir Next LT Pro Light" w:hAnsi="Avenir Next LT Pro Light"/>
+                <w:sz w:val="24"/>
+                <w:szCs w:val="24"/>
+                <w:lang w:val="hu-HU"/>
+              </w:rPr>
+              <w:t xml:space="preserve"> elemekkel</w:t>
             </w:r>
           </w:p>
         </w:tc>
@@ -114,6 +179,7 @@
                 <w:lang w:val="hu-HU"/>
               </w:rPr>
             </w:pPr>
+            <w:proofErr w:type="spellStart"/>
             <w:r>
               <w:rPr>
                 <w:rFonts w:ascii="Avenir Next LT Pro Light" w:hAnsi="Avenir Next LT Pro Light"/>
@@ -125,6 +191,7 @@
               </w:rPr>
               <w:t>Engine</w:t>
             </w:r>
+            <w:proofErr w:type="spellEnd"/>
           </w:p>
         </w:tc>
         <w:tc>
@@ -140,6 +207,7 @@
                 <w:lang w:val="hu-HU"/>
               </w:rPr>
             </w:pPr>
+            <w:proofErr w:type="spellStart"/>
             <w:r>
               <w:rPr>
                 <w:rFonts w:ascii="Avenir Next LT Pro Light" w:hAnsi="Avenir Next LT Pro Light"/>
@@ -149,6 +217,7 @@
               </w:rPr>
               <w:t>Unity</w:t>
             </w:r>
+            <w:proofErr w:type="spellEnd"/>
           </w:p>
         </w:tc>
       </w:tr>
@@ -194,6 +263,7 @@
                 <w:lang w:val="hu-HU"/>
               </w:rPr>
             </w:pPr>
+            <w:proofErr w:type="spellStart"/>
             <w:r>
               <w:rPr>
                 <w:rFonts w:ascii="Avenir Next LT Pro Light" w:hAnsi="Avenir Next LT Pro Light"/>
@@ -201,7 +271,77 @@
                 <w:szCs w:val="24"/>
                 <w:lang w:val="hu-HU"/>
               </w:rPr>
-              <w:t>Dark fantasy, dark wood és középkori hangulat, pixel art</w:t>
+              <w:t>Dark</w:t>
+            </w:r>
+            <w:proofErr w:type="spellEnd"/>
+            <w:r>
+              <w:rPr>
+                <w:rFonts w:ascii="Avenir Next LT Pro Light" w:hAnsi="Avenir Next LT Pro Light"/>
+                <w:sz w:val="24"/>
+                <w:szCs w:val="24"/>
+                <w:lang w:val="hu-HU"/>
+              </w:rPr>
+              <w:t xml:space="preserve"> </w:t>
+            </w:r>
+            <w:proofErr w:type="spellStart"/>
+            <w:r>
+              <w:rPr>
+                <w:rFonts w:ascii="Avenir Next LT Pro Light" w:hAnsi="Avenir Next LT Pro Light"/>
+                <w:sz w:val="24"/>
+                <w:szCs w:val="24"/>
+                <w:lang w:val="hu-HU"/>
+              </w:rPr>
+              <w:t>fantasy</w:t>
+            </w:r>
+            <w:proofErr w:type="spellEnd"/>
+            <w:r>
+              <w:rPr>
+                <w:rFonts w:ascii="Avenir Next LT Pro Light" w:hAnsi="Avenir Next LT Pro Light"/>
+                <w:sz w:val="24"/>
+                <w:szCs w:val="24"/>
+                <w:lang w:val="hu-HU"/>
+              </w:rPr>
+              <w:t xml:space="preserve">, </w:t>
+            </w:r>
+            <w:proofErr w:type="spellStart"/>
+            <w:r>
+              <w:rPr>
+                <w:rFonts w:ascii="Avenir Next LT Pro Light" w:hAnsi="Avenir Next LT Pro Light"/>
+                <w:sz w:val="24"/>
+                <w:szCs w:val="24"/>
+                <w:lang w:val="hu-HU"/>
+              </w:rPr>
+              <w:t>dark</w:t>
+            </w:r>
+            <w:proofErr w:type="spellEnd"/>
+            <w:r>
+              <w:rPr>
+                <w:rFonts w:ascii="Avenir Next LT Pro Light" w:hAnsi="Avenir Next LT Pro Light"/>
+                <w:sz w:val="24"/>
+                <w:szCs w:val="24"/>
+                <w:lang w:val="hu-HU"/>
+              </w:rPr>
+              <w:t xml:space="preserve"> </w:t>
+            </w:r>
+            <w:proofErr w:type="spellStart"/>
+            <w:r>
+              <w:rPr>
+                <w:rFonts w:ascii="Avenir Next LT Pro Light" w:hAnsi="Avenir Next LT Pro Light"/>
+                <w:sz w:val="24"/>
+                <w:szCs w:val="24"/>
+                <w:lang w:val="hu-HU"/>
+              </w:rPr>
+              <w:t>wood</w:t>
+            </w:r>
+            <w:proofErr w:type="spellEnd"/>
+            <w:r>
+              <w:rPr>
+                <w:rFonts w:ascii="Avenir Next LT Pro Light" w:hAnsi="Avenir Next LT Pro Light"/>
+                <w:sz w:val="24"/>
+                <w:szCs w:val="24"/>
+                <w:lang w:val="hu-HU"/>
+              </w:rPr>
+              <w:t xml:space="preserve"> és középkori hangulat, pixel art</w:t>
             </w:r>
           </w:p>
         </w:tc>
@@ -302,6 +442,7 @@
                 <w:lang w:val="hu-HU"/>
               </w:rPr>
             </w:pPr>
+            <w:proofErr w:type="spellStart"/>
             <w:r>
               <w:rPr>
                 <w:rFonts w:ascii="Avenir Next LT Pro Light" w:hAnsi="Avenir Next LT Pro Light"/>
@@ -309,7 +450,37 @@
                 <w:szCs w:val="24"/>
                 <w:lang w:val="hu-HU"/>
               </w:rPr>
-              <w:t>Soulslike / nehéz platformer rajongók</w:t>
+              <w:t>Soulslike</w:t>
+            </w:r>
+            <w:proofErr w:type="spellEnd"/>
+            <w:r>
+              <w:rPr>
+                <w:rFonts w:ascii="Avenir Next LT Pro Light" w:hAnsi="Avenir Next LT Pro Light"/>
+                <w:sz w:val="24"/>
+                <w:szCs w:val="24"/>
+                <w:lang w:val="hu-HU"/>
+              </w:rPr>
+              <w:t xml:space="preserve"> / nehéz </w:t>
+            </w:r>
+            <w:proofErr w:type="spellStart"/>
+            <w:r>
+              <w:rPr>
+                <w:rFonts w:ascii="Avenir Next LT Pro Light" w:hAnsi="Avenir Next LT Pro Light"/>
+                <w:sz w:val="24"/>
+                <w:szCs w:val="24"/>
+                <w:lang w:val="hu-HU"/>
+              </w:rPr>
+              <w:t>platformer</w:t>
+            </w:r>
+            <w:proofErr w:type="spellEnd"/>
+            <w:r>
+              <w:rPr>
+                <w:rFonts w:ascii="Avenir Next LT Pro Light" w:hAnsi="Avenir Next LT Pro Light"/>
+                <w:sz w:val="24"/>
+                <w:szCs w:val="24"/>
+                <w:lang w:val="hu-HU"/>
+              </w:rPr>
+              <w:t xml:space="preserve"> rajongók</w:t>
             </w:r>
           </w:p>
         </w:tc>
@@ -363,7 +534,47 @@
                 <w:szCs w:val="24"/>
                 <w:lang w:val="hu-HU"/>
               </w:rPr>
-              <w:t>Egy 4–5 pályás, kihívásokkal teli, boss fight-tal záruló történeti játék</w:t>
+              <w:t xml:space="preserve">Egy 4–5 pályás, kihívásokkal teli, </w:t>
+            </w:r>
+            <w:proofErr w:type="spellStart"/>
+            <w:r>
+              <w:rPr>
+                <w:rFonts w:ascii="Avenir Next LT Pro Light" w:hAnsi="Avenir Next LT Pro Light"/>
+                <w:sz w:val="24"/>
+                <w:szCs w:val="24"/>
+                <w:lang w:val="hu-HU"/>
+              </w:rPr>
+              <w:t>boss</w:t>
+            </w:r>
+            <w:proofErr w:type="spellEnd"/>
+            <w:r>
+              <w:rPr>
+                <w:rFonts w:ascii="Avenir Next LT Pro Light" w:hAnsi="Avenir Next LT Pro Light"/>
+                <w:sz w:val="24"/>
+                <w:szCs w:val="24"/>
+                <w:lang w:val="hu-HU"/>
+              </w:rPr>
+              <w:t xml:space="preserve"> </w:t>
+            </w:r>
+            <w:proofErr w:type="spellStart"/>
+            <w:r>
+              <w:rPr>
+                <w:rFonts w:ascii="Avenir Next LT Pro Light" w:hAnsi="Avenir Next LT Pro Light"/>
+                <w:sz w:val="24"/>
+                <w:szCs w:val="24"/>
+                <w:lang w:val="hu-HU"/>
+              </w:rPr>
+              <w:t>fight-tal</w:t>
+            </w:r>
+            <w:proofErr w:type="spellEnd"/>
+            <w:r>
+              <w:rPr>
+                <w:rFonts w:ascii="Avenir Next LT Pro Light" w:hAnsi="Avenir Next LT Pro Light"/>
+                <w:sz w:val="24"/>
+                <w:szCs w:val="24"/>
+                <w:lang w:val="hu-HU"/>
+              </w:rPr>
+              <w:t xml:space="preserve"> záruló történeti játék</w:t>
             </w:r>
           </w:p>
         </w:tc>
@@ -417,7 +628,27 @@
                 <w:szCs w:val="24"/>
                 <w:lang w:val="hu-HU"/>
               </w:rPr>
-              <w:t>Oldalnézet (Side-scroller)</w:t>
+              <w:t>Oldalnézet (</w:t>
+            </w:r>
+            <w:proofErr w:type="spellStart"/>
+            <w:r>
+              <w:rPr>
+                <w:rFonts w:ascii="Avenir Next LT Pro Light" w:hAnsi="Avenir Next LT Pro Light"/>
+                <w:sz w:val="24"/>
+                <w:szCs w:val="24"/>
+                <w:lang w:val="hu-HU"/>
+              </w:rPr>
+              <w:t>Side-scroller</w:t>
+            </w:r>
+            <w:proofErr w:type="spellEnd"/>
+            <w:r>
+              <w:rPr>
+                <w:rFonts w:ascii="Avenir Next LT Pro Light" w:hAnsi="Avenir Next LT Pro Light"/>
+                <w:sz w:val="24"/>
+                <w:szCs w:val="24"/>
+                <w:lang w:val="hu-HU"/>
+              </w:rPr>
+              <w:t>)</w:t>
             </w:r>
           </w:p>
         </w:tc>
@@ -477,7 +708,47 @@
           <w:szCs w:val="24"/>
           <w:lang w:val="hu-HU"/>
         </w:rPr>
-        <w:t>A játékos egy elátkozott erdő mélyén ébred, ahol egy sötét varázsló (főboss) tartja fogva a királylányt. A kastélyba vezető út veszélyes – elhagyatott börtönökön, lávával teli bányákon és az erdőn keresztül vezet. Minden checkpoint felébreszti a környék szörnyeit, a túlélés kulcsa pedig a harc és a fejlődés.</w:t>
+        <w:t>A játékos egy elátkozott erdő mélyén ébred, ahol egy sötét varázsló (</w:t>
+      </w:r>
+      <w:proofErr w:type="spellStart"/>
+      <w:r>
+        <w:rPr>
+          <w:rFonts w:ascii="Avenir Next LT Pro Light" w:hAnsi="Avenir Next LT Pro Light"/>
+          <w:sz w:val="24"/>
+          <w:szCs w:val="24"/>
+          <w:lang w:val="hu-HU"/>
+        </w:rPr>
+        <w:t>főboss</w:t>
+      </w:r>
+      <w:proofErr w:type="spellEnd"/>
+      <w:r>
+        <w:rPr>
+          <w:rFonts w:ascii="Avenir Next LT Pro Light" w:hAnsi="Avenir Next LT Pro Light"/>
+          <w:sz w:val="24"/>
+          <w:szCs w:val="24"/>
+          <w:lang w:val="hu-HU"/>
+        </w:rPr>
+        <w:t xml:space="preserve">) tartja fogva a királylányt. A kastélyba vezető út veszélyes – elhagyatott börtönökön, lávával teli bányákon és az erdőn keresztül vezet. Minden </w:t>
+      </w:r>
+      <w:proofErr w:type="spellStart"/>
+      <w:r>
+        <w:rPr>
+          <w:rFonts w:ascii="Avenir Next LT Pro Light" w:hAnsi="Avenir Next LT Pro Light"/>
+          <w:sz w:val="24"/>
+          <w:szCs w:val="24"/>
+          <w:lang w:val="hu-HU"/>
+        </w:rPr>
+        <w:t>checkpoint</w:t>
+      </w:r>
+      <w:proofErr w:type="spellEnd"/>
+      <w:r>
+        <w:rPr>
+          <w:rFonts w:ascii="Avenir Next LT Pro Light" w:hAnsi="Avenir Next LT Pro Light"/>
+          <w:sz w:val="24"/>
+          <w:szCs w:val="24"/>
+          <w:lang w:val="hu-HU"/>
+        </w:rPr>
+        <w:t xml:space="preserve"> felébreszti a környék szörnyeit, a túlélés kulcsa pedig a harc és a fejlődés.</w:t>
       </w:r>
     </w:p>
     <w:p>
@@ -538,7 +809,27 @@
           <w:lang w:val="hu-HU"/>
         </w:rPr>
         <w:br/>
-        <w:t>- Lassú, nyomasztó zenei aláfestés az erdőben; intenzív, gyors zene a boss harcokhoz</w:t>
+        <w:t xml:space="preserve">- Lassú, nyomasztó zenei aláfestés az erdőben; intenzív, gyors zene a </w:t>
+      </w:r>
+      <w:proofErr w:type="spellStart"/>
+      <w:r>
+        <w:rPr>
+          <w:rFonts w:ascii="Avenir Next LT Pro Light" w:hAnsi="Avenir Next LT Pro Light"/>
+          <w:sz w:val="24"/>
+          <w:szCs w:val="24"/>
+          <w:lang w:val="hu-HU"/>
+        </w:rPr>
+        <w:t>boss</w:t>
+      </w:r>
+      <w:proofErr w:type="spellEnd"/>
+      <w:r>
+        <w:rPr>
+          <w:rFonts w:ascii="Avenir Next LT Pro Light" w:hAnsi="Avenir Next LT Pro Light"/>
+          <w:sz w:val="24"/>
+          <w:szCs w:val="24"/>
+          <w:lang w:val="hu-HU"/>
+        </w:rPr>
+        <w:t xml:space="preserve"> harcokhoz</w:t>
       </w:r>
     </w:p>
     <w:p>
@@ -580,7 +871,27 @@
           <w:szCs w:val="24"/>
           <w:lang w:val="hu-HU"/>
         </w:rPr>
-        <w:t>Mozgás: Balra/jobbra mozgás, ugrás, csúszás (slide), falmászás, felkapaszkodás.</w:t>
+        <w:t>Mozgás: Balra/jobbra mozgás, ugrás, csúszás (</w:t>
+      </w:r>
+      <w:proofErr w:type="spellStart"/>
+      <w:r>
+        <w:rPr>
+          <w:rFonts w:ascii="Avenir Next LT Pro Light" w:hAnsi="Avenir Next LT Pro Light"/>
+          <w:sz w:val="24"/>
+          <w:szCs w:val="24"/>
+          <w:lang w:val="hu-HU"/>
+        </w:rPr>
+        <w:t>slide</w:t>
+      </w:r>
+      <w:proofErr w:type="spellEnd"/>
+      <w:r>
+        <w:rPr>
+          <w:rFonts w:ascii="Avenir Next LT Pro Light" w:hAnsi="Avenir Next LT Pro Light"/>
+          <w:sz w:val="24"/>
+          <w:szCs w:val="24"/>
+          <w:lang w:val="hu-HU"/>
+        </w:rPr>
+        <w:t>), falmászás, felkapaszkodás.</w:t>
       </w:r>
     </w:p>
     <w:p>
@@ -615,7 +926,27 @@
           <w:szCs w:val="24"/>
           <w:lang w:val="hu-HU"/>
         </w:rPr>
-        <w:t xml:space="preserve"> és később kapjuk meg és korlátozott ammo van hozzá</w:t>
+        <w:t xml:space="preserve"> és később kapjuk meg és korlátozott </w:t>
+      </w:r>
+      <w:proofErr w:type="spellStart"/>
+      <w:r>
+        <w:rPr>
+          <w:rFonts w:ascii="Avenir Next LT Pro Light" w:hAnsi="Avenir Next LT Pro Light"/>
+          <w:sz w:val="24"/>
+          <w:szCs w:val="24"/>
+          <w:lang w:val="hu-HU"/>
+        </w:rPr>
+        <w:t>ammo</w:t>
+      </w:r>
+      <w:proofErr w:type="spellEnd"/>
+      <w:r>
+        <w:rPr>
+          <w:rFonts w:ascii="Avenir Next LT Pro Light" w:hAnsi="Avenir Next LT Pro Light"/>
+          <w:sz w:val="24"/>
+          <w:szCs w:val="24"/>
+          <w:lang w:val="hu-HU"/>
+        </w:rPr>
+        <w:t xml:space="preserve"> van hozzá</w:t>
       </w:r>
       <w:r>
         <w:rPr>
@@ -650,7 +981,67 @@
           <w:szCs w:val="24"/>
           <w:lang w:val="hu-HU"/>
         </w:rPr>
-        <w:t>Fejlődés: XP gyűjtése enemy-k legyőzésével, skill tree.</w:t>
+        <w:t xml:space="preserve">Fejlődés: XP gyűjtése </w:t>
+      </w:r>
+      <w:proofErr w:type="spellStart"/>
+      <w:r>
+        <w:rPr>
+          <w:rFonts w:ascii="Avenir Next LT Pro Light" w:hAnsi="Avenir Next LT Pro Light"/>
+          <w:sz w:val="24"/>
+          <w:szCs w:val="24"/>
+          <w:lang w:val="hu-HU"/>
+        </w:rPr>
+        <w:t>enemy</w:t>
+      </w:r>
+      <w:proofErr w:type="spellEnd"/>
+      <w:r>
+        <w:rPr>
+          <w:rFonts w:ascii="Avenir Next LT Pro Light" w:hAnsi="Avenir Next LT Pro Light"/>
+          <w:sz w:val="24"/>
+          <w:szCs w:val="24"/>
+          <w:lang w:val="hu-HU"/>
+        </w:rPr>
+        <w:t xml:space="preserve">-k legyőzésével, </w:t>
+      </w:r>
+      <w:proofErr w:type="spellStart"/>
+      <w:r>
+        <w:rPr>
+          <w:rFonts w:ascii="Avenir Next LT Pro Light" w:hAnsi="Avenir Next LT Pro Light"/>
+          <w:sz w:val="24"/>
+          <w:szCs w:val="24"/>
+          <w:lang w:val="hu-HU"/>
+        </w:rPr>
+        <w:t>skill</w:t>
+      </w:r>
+      <w:proofErr w:type="spellEnd"/>
+      <w:r>
+        <w:rPr>
+          <w:rFonts w:ascii="Avenir Next LT Pro Light" w:hAnsi="Avenir Next LT Pro Light"/>
+          <w:sz w:val="24"/>
+          <w:szCs w:val="24"/>
+          <w:lang w:val="hu-HU"/>
+        </w:rPr>
+        <w:t xml:space="preserve"> </w:t>
+      </w:r>
+      <w:proofErr w:type="spellStart"/>
+      <w:r>
+        <w:rPr>
+          <w:rFonts w:ascii="Avenir Next LT Pro Light" w:hAnsi="Avenir Next LT Pro Light"/>
+          <w:sz w:val="24"/>
+          <w:szCs w:val="24"/>
+          <w:lang w:val="hu-HU"/>
+        </w:rPr>
+        <w:t>tree</w:t>
+      </w:r>
+      <w:proofErr w:type="spellEnd"/>
+      <w:r>
+        <w:rPr>
+          <w:rFonts w:ascii="Avenir Next LT Pro Light" w:hAnsi="Avenir Next LT Pro Light"/>
+          <w:sz w:val="24"/>
+          <w:szCs w:val="24"/>
+          <w:lang w:val="hu-HU"/>
+        </w:rPr>
+        <w:t>.</w:t>
       </w:r>
     </w:p>
     <w:p>
@@ -669,6 +1060,7 @@
           <w:lang w:val="hu-HU"/>
         </w:rPr>
       </w:pPr>
+      <w:proofErr w:type="spellStart"/>
       <w:r>
         <w:rPr>
           <w:rFonts w:ascii="Avenir Next LT Pro Light" w:hAnsi="Avenir Next LT Pro Light"/>
@@ -677,7 +1069,17 @@
           <w:lang w:val="hu-HU"/>
         </w:rPr>
         <w:lastRenderedPageBreak/>
-        <w:t>Checkpoint rendszer: Mentési pontok</w:t>
+        <w:t>Checkpoint</w:t>
+      </w:r>
+      <w:proofErr w:type="spellEnd"/>
+      <w:r>
+        <w:rPr>
+          <w:rFonts w:ascii="Avenir Next LT Pro Light" w:hAnsi="Avenir Next LT Pro Light"/>
+          <w:sz w:val="24"/>
+          <w:szCs w:val="24"/>
+          <w:lang w:val="hu-HU"/>
+        </w:rPr>
+        <w:t xml:space="preserve"> rendszer: Mentési pontok</w:t>
       </w:r>
       <w:r>
         <w:rPr>
@@ -686,8 +1088,19 @@
           <w:szCs w:val="24"/>
           <w:lang w:val="hu-HU"/>
         </w:rPr>
-        <w:t>, teleportálása hub-ba</w:t>
+        <w:t xml:space="preserve">, teleportálása </w:t>
       </w:r>
+      <w:proofErr w:type="spellStart"/>
+      <w:r>
+        <w:rPr>
+          <w:rFonts w:ascii="Avenir Next LT Pro Light" w:hAnsi="Avenir Next LT Pro Light"/>
+          <w:sz w:val="24"/>
+          <w:szCs w:val="24"/>
+          <w:lang w:val="hu-HU"/>
+        </w:rPr>
+        <w:t>hub-ba</w:t>
+      </w:r>
+      <w:proofErr w:type="spellEnd"/>
       <w:r>
         <w:rPr>
           <w:rFonts w:ascii="Avenir Next LT Pro Light" w:hAnsi="Avenir Next LT Pro Light"/>
@@ -730,8 +1143,29 @@
           <w:szCs w:val="24"/>
           <w:lang w:val="hu-HU"/>
         </w:rPr>
-        <w:t xml:space="preserve">Health potion az </w:t>
+        <w:t xml:space="preserve">Health </w:t>
       </w:r>
+      <w:proofErr w:type="spellStart"/>
+      <w:r>
+        <w:rPr>
+          <w:rFonts w:ascii="Avenir Next LT Pro Light" w:hAnsi="Avenir Next LT Pro Light"/>
+          <w:sz w:val="24"/>
+          <w:szCs w:val="24"/>
+          <w:lang w:val="hu-HU"/>
+        </w:rPr>
+        <w:t>potion</w:t>
+      </w:r>
+      <w:proofErr w:type="spellEnd"/>
+      <w:r>
+        <w:rPr>
+          <w:rFonts w:ascii="Avenir Next LT Pro Light" w:hAnsi="Avenir Next LT Pro Light"/>
+          <w:sz w:val="24"/>
+          <w:szCs w:val="24"/>
+          <w:lang w:val="hu-HU"/>
+        </w:rPr>
+        <w:t xml:space="preserve"> az </w:t>
+      </w:r>
+      <w:proofErr w:type="spellStart"/>
       <w:r>
         <w:rPr>
           <w:rFonts w:ascii="Avenir Next LT Pro Light" w:hAnsi="Avenir Next LT Pro Light"/>
@@ -741,6 +1175,7 @@
         </w:rPr>
         <w:t>inventory</w:t>
       </w:r>
+      <w:proofErr w:type="spellEnd"/>
       <w:r>
         <w:rPr>
           <w:rFonts w:ascii="Avenir Next LT Pro Light" w:hAnsi="Avenir Next LT Pro Light"/>
@@ -783,7 +1218,104 @@
           <w:szCs w:val="24"/>
           <w:lang w:val="hu-HU"/>
         </w:rPr>
-        <w:t>NPC-k: Idle animáció, játékosra fordulás, párbeszéd UI.</w:t>
+        <w:t xml:space="preserve">NPC-k: </w:t>
+      </w:r>
+      <w:proofErr w:type="spellStart"/>
+      <w:r>
+        <w:rPr>
+          <w:rFonts w:ascii="Avenir Next LT Pro Light" w:hAnsi="Avenir Next LT Pro Light"/>
+          <w:sz w:val="24"/>
+          <w:szCs w:val="24"/>
+          <w:lang w:val="hu-HU"/>
+        </w:rPr>
+        <w:t>Idle</w:t>
+      </w:r>
+      <w:proofErr w:type="spellEnd"/>
+      <w:r>
+        <w:rPr>
+          <w:rFonts w:ascii="Avenir Next LT Pro Light" w:hAnsi="Avenir Next LT Pro Light"/>
+          <w:sz w:val="24"/>
+          <w:szCs w:val="24"/>
+          <w:lang w:val="hu-HU"/>
+        </w:rPr>
+        <w:t xml:space="preserve"> animáció, játékosra fordulás, párbeszéd UI.</w:t>
+      </w:r>
+    </w:p>
+    <w:p>
+      <w:pPr>
+        <w:pStyle w:val="Listaszerbekezds"/>
+        <w:numPr>
+          <w:ilvl w:val="0"/>
+          <w:numId w:val="10"/>
+        </w:numPr>
+        <w:spacing w:after="120"/>
+        <w:ind w:left="142" w:hanging="218"/>
+        <w:rPr>
+          <w:rFonts w:ascii="Avenir Next LT Pro Light" w:hAnsi="Avenir Next LT Pro Light"/>
+          <w:sz w:val="24"/>
+          <w:szCs w:val="24"/>
+          <w:lang w:val="hu-HU"/>
+        </w:rPr>
+      </w:pPr>
+      <w:proofErr w:type="spellStart"/>
+      <w:r>
+        <w:rPr>
+          <w:rFonts w:ascii="Avenir Next LT Pro Light" w:hAnsi="Avenir Next LT Pro Light"/>
+          <w:sz w:val="24"/>
+          <w:szCs w:val="24"/>
+          <w:lang w:val="hu-HU"/>
+        </w:rPr>
+        <w:t>Boss</w:t>
+      </w:r>
+      <w:proofErr w:type="spellEnd"/>
+      <w:r>
+        <w:rPr>
+          <w:rFonts w:ascii="Avenir Next LT Pro Light" w:hAnsi="Avenir Next LT Pro Light"/>
+          <w:sz w:val="24"/>
+          <w:szCs w:val="24"/>
+          <w:lang w:val="hu-HU"/>
+        </w:rPr>
+        <w:t xml:space="preserve"> </w:t>
+      </w:r>
+      <w:proofErr w:type="spellStart"/>
+      <w:r>
+        <w:rPr>
+          <w:rFonts w:ascii="Avenir Next LT Pro Light" w:hAnsi="Avenir Next LT Pro Light"/>
+          <w:sz w:val="24"/>
+          <w:szCs w:val="24"/>
+          <w:lang w:val="hu-HU"/>
+        </w:rPr>
+        <w:t>fight</w:t>
+      </w:r>
+      <w:proofErr w:type="spellEnd"/>
+      <w:r>
+        <w:rPr>
+          <w:rFonts w:ascii="Avenir Next LT Pro Light" w:hAnsi="Avenir Next LT Pro Light"/>
+          <w:sz w:val="24"/>
+          <w:szCs w:val="24"/>
+          <w:lang w:val="hu-HU"/>
+        </w:rPr>
+        <w:t xml:space="preserve">: Több fázisú </w:t>
+      </w:r>
+      <w:proofErr w:type="spellStart"/>
+      <w:r>
+        <w:rPr>
+          <w:rFonts w:ascii="Avenir Next LT Pro Light" w:hAnsi="Avenir Next LT Pro Light"/>
+          <w:sz w:val="24"/>
+          <w:szCs w:val="24"/>
+          <w:lang w:val="hu-HU"/>
+        </w:rPr>
+        <w:t>főboss</w:t>
+      </w:r>
+      <w:proofErr w:type="spellEnd"/>
+      <w:r>
+        <w:rPr>
+          <w:rFonts w:ascii="Avenir Next LT Pro Light" w:hAnsi="Avenir Next LT Pro Light"/>
+          <w:sz w:val="24"/>
+          <w:szCs w:val="24"/>
+          <w:lang w:val="hu-HU"/>
+        </w:rPr>
+        <w:t>, HP bar felül.</w:t>
       </w:r>
     </w:p>
     <w:p>
@@ -809,7 +1341,27 @@
           <w:szCs w:val="24"/>
           <w:lang w:val="hu-HU"/>
         </w:rPr>
-        <w:t>Boss fight: Több fázisú főboss, HP bar felül.</w:t>
+        <w:t xml:space="preserve">Küldetések: Opcionális </w:t>
+      </w:r>
+      <w:proofErr w:type="spellStart"/>
+      <w:r>
+        <w:rPr>
+          <w:rFonts w:ascii="Avenir Next LT Pro Light" w:hAnsi="Avenir Next LT Pro Light"/>
+          <w:sz w:val="24"/>
+          <w:szCs w:val="24"/>
+          <w:lang w:val="hu-HU"/>
+        </w:rPr>
+        <w:t>quest</w:t>
+      </w:r>
+      <w:proofErr w:type="spellEnd"/>
+      <w:r>
+        <w:rPr>
+          <w:rFonts w:ascii="Avenir Next LT Pro Light" w:hAnsi="Avenir Next LT Pro Light"/>
+          <w:sz w:val="24"/>
+          <w:szCs w:val="24"/>
+          <w:lang w:val="hu-HU"/>
+        </w:rPr>
+        <w:t xml:space="preserve"> log UI.</w:t>
       </w:r>
     </w:p>
     <w:p>
@@ -835,7 +1387,27 @@
           <w:szCs w:val="24"/>
           <w:lang w:val="hu-HU"/>
         </w:rPr>
-        <w:t>Küldetések: Opcionális quest log UI.</w:t>
+        <w:t xml:space="preserve">Térkép: Egyszerű minimap </w:t>
+      </w:r>
+      <w:proofErr w:type="spellStart"/>
+      <w:r>
+        <w:rPr>
+          <w:rFonts w:ascii="Avenir Next LT Pro Light" w:hAnsi="Avenir Next LT Pro Light"/>
+          <w:sz w:val="24"/>
+          <w:szCs w:val="24"/>
+          <w:lang w:val="hu-HU"/>
+        </w:rPr>
+        <w:t>player</w:t>
+      </w:r>
+      <w:proofErr w:type="spellEnd"/>
+      <w:r>
+        <w:rPr>
+          <w:rFonts w:ascii="Avenir Next LT Pro Light" w:hAnsi="Avenir Next LT Pro Light"/>
+          <w:sz w:val="24"/>
+          <w:szCs w:val="24"/>
+          <w:lang w:val="hu-HU"/>
+        </w:rPr>
+        <w:t xml:space="preserve"> markerrel.</w:t>
       </w:r>
     </w:p>
     <w:p>
@@ -854,6 +1426,7 @@
           <w:lang w:val="hu-HU"/>
         </w:rPr>
       </w:pPr>
+      <w:proofErr w:type="spellStart"/>
       <w:r>
         <w:rPr>
           <w:rFonts w:ascii="Avenir Next LT Pro Light" w:hAnsi="Avenir Next LT Pro Light"/>
@@ -861,25 +1434,9 @@
           <w:szCs w:val="24"/>
           <w:lang w:val="hu-HU"/>
         </w:rPr>
-        <w:t>Térkép: Egyszerű minimap player markerrel.</w:t>
+        <w:t>Hub</w:t>
       </w:r>
-    </w:p>
-    <w:p>
-      <w:pPr>
-        <w:pStyle w:val="Listaszerbekezds"/>
-        <w:numPr>
-          <w:ilvl w:val="0"/>
-          <w:numId w:val="10"/>
-        </w:numPr>
-        <w:spacing w:after="120"/>
-        <w:ind w:left="142" w:hanging="218"/>
-        <w:rPr>
-          <w:rFonts w:ascii="Avenir Next LT Pro Light" w:hAnsi="Avenir Next LT Pro Light"/>
-          <w:sz w:val="24"/>
-          <w:szCs w:val="24"/>
-          <w:lang w:val="hu-HU"/>
-        </w:rPr>
-      </w:pPr>
+      <w:proofErr w:type="spellEnd"/>
       <w:r>
         <w:rPr>
           <w:rFonts w:ascii="Avenir Next LT Pro Light" w:hAnsi="Avenir Next LT Pro Light"/>
@@ -887,7 +1444,7 @@
           <w:szCs w:val="24"/>
           <w:lang w:val="hu-HU"/>
         </w:rPr>
-        <w:t>Hub rendszer</w:t>
+        <w:t xml:space="preserve"> rendszer</w:t>
       </w:r>
       <w:r>
         <w:rPr>
@@ -907,7 +1464,27 @@
           <w:szCs w:val="24"/>
           <w:lang w:val="hu-HU"/>
         </w:rPr>
-        <w:t xml:space="preserve"> Minden checkpointból vissza</w:t>
+        <w:t xml:space="preserve"> Minden </w:t>
+      </w:r>
+      <w:proofErr w:type="spellStart"/>
+      <w:r>
+        <w:rPr>
+          <w:rFonts w:ascii="Avenir Next LT Pro Light" w:hAnsi="Avenir Next LT Pro Light"/>
+          <w:sz w:val="24"/>
+          <w:szCs w:val="24"/>
+          <w:lang w:val="hu-HU"/>
+        </w:rPr>
+        <w:t>checkpointból</w:t>
+      </w:r>
+      <w:proofErr w:type="spellEnd"/>
+      <w:r>
+        <w:rPr>
+          <w:rFonts w:ascii="Avenir Next LT Pro Light" w:hAnsi="Avenir Next LT Pro Light"/>
+          <w:sz w:val="24"/>
+          <w:szCs w:val="24"/>
+          <w:lang w:val="hu-HU"/>
+        </w:rPr>
+        <w:t xml:space="preserve"> vissza</w:t>
       </w:r>
       <w:r>
         <w:rPr>
@@ -925,7 +1502,107 @@
           <w:szCs w:val="24"/>
           <w:lang w:val="hu-HU"/>
         </w:rPr>
-        <w:t>teleportálhatunk egy központi hub területre, ahol biztonságban vagyunk. Itt találhatóak a fejlesztési lehetőségek (skill tree, potion fejlesztés, fegyver upgrade). A hub a játék fő bázisa, ahonnan visszatérhetünk a kalandhoz.</w:t>
+        <w:t xml:space="preserve">teleportálhatunk egy központi </w:t>
+      </w:r>
+      <w:proofErr w:type="spellStart"/>
+      <w:r>
+        <w:rPr>
+          <w:rFonts w:ascii="Avenir Next LT Pro Light" w:hAnsi="Avenir Next LT Pro Light"/>
+          <w:sz w:val="24"/>
+          <w:szCs w:val="24"/>
+          <w:lang w:val="hu-HU"/>
+        </w:rPr>
+        <w:t>hub</w:t>
+      </w:r>
+      <w:proofErr w:type="spellEnd"/>
+      <w:r>
+        <w:rPr>
+          <w:rFonts w:ascii="Avenir Next LT Pro Light" w:hAnsi="Avenir Next LT Pro Light"/>
+          <w:sz w:val="24"/>
+          <w:szCs w:val="24"/>
+          <w:lang w:val="hu-HU"/>
+        </w:rPr>
+        <w:t xml:space="preserve"> területre, ahol biztonságban vagyunk. Itt találhatóak a fejlesztési lehetőségek (</w:t>
+      </w:r>
+      <w:proofErr w:type="spellStart"/>
+      <w:r>
+        <w:rPr>
+          <w:rFonts w:ascii="Avenir Next LT Pro Light" w:hAnsi="Avenir Next LT Pro Light"/>
+          <w:sz w:val="24"/>
+          <w:szCs w:val="24"/>
+          <w:lang w:val="hu-HU"/>
+        </w:rPr>
+        <w:t>skill</w:t>
+      </w:r>
+      <w:proofErr w:type="spellEnd"/>
+      <w:r>
+        <w:rPr>
+          <w:rFonts w:ascii="Avenir Next LT Pro Light" w:hAnsi="Avenir Next LT Pro Light"/>
+          <w:sz w:val="24"/>
+          <w:szCs w:val="24"/>
+          <w:lang w:val="hu-HU"/>
+        </w:rPr>
+        <w:t xml:space="preserve"> </w:t>
+      </w:r>
+      <w:proofErr w:type="spellStart"/>
+      <w:r>
+        <w:rPr>
+          <w:rFonts w:ascii="Avenir Next LT Pro Light" w:hAnsi="Avenir Next LT Pro Light"/>
+          <w:sz w:val="24"/>
+          <w:szCs w:val="24"/>
+          <w:lang w:val="hu-HU"/>
+        </w:rPr>
+        <w:t>tree</w:t>
+      </w:r>
+      <w:proofErr w:type="spellEnd"/>
+      <w:r>
+        <w:rPr>
+          <w:rFonts w:ascii="Avenir Next LT Pro Light" w:hAnsi="Avenir Next LT Pro Light"/>
+          <w:sz w:val="24"/>
+          <w:szCs w:val="24"/>
+          <w:lang w:val="hu-HU"/>
+        </w:rPr>
+        <w:t xml:space="preserve">, </w:t>
+      </w:r>
+      <w:proofErr w:type="spellStart"/>
+      <w:r>
+        <w:rPr>
+          <w:rFonts w:ascii="Avenir Next LT Pro Light" w:hAnsi="Avenir Next LT Pro Light"/>
+          <w:sz w:val="24"/>
+          <w:szCs w:val="24"/>
+          <w:lang w:val="hu-HU"/>
+        </w:rPr>
+        <w:t>potion</w:t>
+      </w:r>
+      <w:proofErr w:type="spellEnd"/>
+      <w:r>
+        <w:rPr>
+          <w:rFonts w:ascii="Avenir Next LT Pro Light" w:hAnsi="Avenir Next LT Pro Light"/>
+          <w:sz w:val="24"/>
+          <w:szCs w:val="24"/>
+          <w:lang w:val="hu-HU"/>
+        </w:rPr>
+        <w:t xml:space="preserve"> fejlesztés, fegyver upgrade). A </w:t>
+      </w:r>
+      <w:proofErr w:type="spellStart"/>
+      <w:r>
+        <w:rPr>
+          <w:rFonts w:ascii="Avenir Next LT Pro Light" w:hAnsi="Avenir Next LT Pro Light"/>
+          <w:sz w:val="24"/>
+          <w:szCs w:val="24"/>
+          <w:lang w:val="hu-HU"/>
+        </w:rPr>
+        <w:t>hub</w:t>
+      </w:r>
+      <w:proofErr w:type="spellEnd"/>
+      <w:r>
+        <w:rPr>
+          <w:rFonts w:ascii="Avenir Next LT Pro Light" w:hAnsi="Avenir Next LT Pro Light"/>
+          <w:sz w:val="24"/>
+          <w:szCs w:val="24"/>
+          <w:lang w:val="hu-HU"/>
+        </w:rPr>
+        <w:t xml:space="preserve"> a játék fő bázisa, ahonnan visszatérhetünk a kalandhoz.</w:t>
       </w:r>
     </w:p>
     <w:p>
@@ -1268,7 +1945,27 @@
                 <w:szCs w:val="24"/>
                 <w:lang w:val="hu-HU"/>
               </w:rPr>
-              <w:t>Használható potion mennyisége</w:t>
+              <w:t xml:space="preserve">Használható </w:t>
+            </w:r>
+            <w:proofErr w:type="spellStart"/>
+            <w:r>
+              <w:rPr>
+                <w:rFonts w:ascii="Avenir Next LT Pro Light" w:hAnsi="Avenir Next LT Pro Light"/>
+                <w:sz w:val="24"/>
+                <w:szCs w:val="24"/>
+                <w:lang w:val="hu-HU"/>
+              </w:rPr>
+              <w:t>potion</w:t>
+            </w:r>
+            <w:proofErr w:type="spellEnd"/>
+            <w:r>
+              <w:rPr>
+                <w:rFonts w:ascii="Avenir Next LT Pro Light" w:hAnsi="Avenir Next LT Pro Light"/>
+                <w:sz w:val="24"/>
+                <w:szCs w:val="24"/>
+                <w:lang w:val="hu-HU"/>
+              </w:rPr>
+              <w:t xml:space="preserve"> mennyisége</w:t>
             </w:r>
             <w:r>
               <w:rPr>
@@ -1296,6 +1993,7 @@
                 <w:lang w:val="hu-HU"/>
               </w:rPr>
             </w:pPr>
+            <w:proofErr w:type="spellStart"/>
             <w:r>
               <w:rPr>
                 <w:rFonts w:ascii="Avenir Next LT Pro Light" w:hAnsi="Avenir Next LT Pro Light"/>
@@ -1303,7 +2001,17 @@
                 <w:szCs w:val="24"/>
                 <w:lang w:val="hu-HU"/>
               </w:rPr>
-              <w:t>Quest log</w:t>
+              <w:t>Quest</w:t>
+            </w:r>
+            <w:proofErr w:type="spellEnd"/>
+            <w:r>
+              <w:rPr>
+                <w:rFonts w:ascii="Avenir Next LT Pro Light" w:hAnsi="Avenir Next LT Pro Light"/>
+                <w:sz w:val="24"/>
+                <w:szCs w:val="24"/>
+                <w:lang w:val="hu-HU"/>
+              </w:rPr>
+              <w:t xml:space="preserve"> log</w:t>
             </w:r>
           </w:p>
         </w:tc>
@@ -1370,6 +2078,7 @@
                 <w:lang w:val="hu-HU"/>
               </w:rPr>
             </w:pPr>
+            <w:proofErr w:type="spellStart"/>
             <w:r>
               <w:rPr>
                 <w:rFonts w:ascii="Avenir Next LT Pro Light" w:hAnsi="Avenir Next LT Pro Light"/>
@@ -1377,7 +2086,17 @@
                 <w:szCs w:val="24"/>
                 <w:lang w:val="hu-HU"/>
               </w:rPr>
-              <w:t>Boss HP bar</w:t>
+              <w:t>Boss</w:t>
+            </w:r>
+            <w:proofErr w:type="spellEnd"/>
+            <w:r>
+              <w:rPr>
+                <w:rFonts w:ascii="Avenir Next LT Pro Light" w:hAnsi="Avenir Next LT Pro Light"/>
+                <w:sz w:val="24"/>
+                <w:szCs w:val="24"/>
+                <w:lang w:val="hu-HU"/>
+              </w:rPr>
+              <w:t xml:space="preserve"> HP bar</w:t>
             </w:r>
           </w:p>
         </w:tc>
@@ -1418,6 +2137,7 @@
                 <w:lang w:val="hu-HU"/>
               </w:rPr>
             </w:pPr>
+            <w:proofErr w:type="spellStart"/>
             <w:r>
               <w:rPr>
                 <w:rFonts w:ascii="Avenir Next LT Pro Light" w:hAnsi="Avenir Next LT Pro Light"/>
@@ -1425,7 +2145,17 @@
                 <w:szCs w:val="24"/>
                 <w:lang w:val="hu-HU"/>
               </w:rPr>
-              <w:t>Boss életereje harc közben</w:t>
+              <w:t>Boss</w:t>
+            </w:r>
+            <w:proofErr w:type="spellEnd"/>
+            <w:r>
+              <w:rPr>
+                <w:rFonts w:ascii="Avenir Next LT Pro Light" w:hAnsi="Avenir Next LT Pro Light"/>
+                <w:sz w:val="24"/>
+                <w:szCs w:val="24"/>
+                <w:lang w:val="hu-HU"/>
+              </w:rPr>
+              <w:t xml:space="preserve"> életereje harc közben</w:t>
             </w:r>
           </w:p>
         </w:tc>
@@ -1464,7 +2194,67 @@
           <w:szCs w:val="24"/>
           <w:lang w:val="hu-HU"/>
         </w:rPr>
-        <w:t>• Slide invincibility: Slide közben a játékos sérthetetlen.</w:t>
+        <w:t xml:space="preserve">• </w:t>
+      </w:r>
+      <w:proofErr w:type="spellStart"/>
+      <w:r>
+        <w:rPr>
+          <w:rFonts w:ascii="Avenir Next LT Pro Light" w:hAnsi="Avenir Next LT Pro Light"/>
+          <w:sz w:val="24"/>
+          <w:szCs w:val="24"/>
+          <w:lang w:val="hu-HU"/>
+        </w:rPr>
+        <w:t>Slide</w:t>
+      </w:r>
+      <w:proofErr w:type="spellEnd"/>
+      <w:r>
+        <w:rPr>
+          <w:rFonts w:ascii="Avenir Next LT Pro Light" w:hAnsi="Avenir Next LT Pro Light"/>
+          <w:sz w:val="24"/>
+          <w:szCs w:val="24"/>
+          <w:lang w:val="hu-HU"/>
+        </w:rPr>
+        <w:t xml:space="preserve"> </w:t>
+      </w:r>
+      <w:proofErr w:type="spellStart"/>
+      <w:r>
+        <w:rPr>
+          <w:rFonts w:ascii="Avenir Next LT Pro Light" w:hAnsi="Avenir Next LT Pro Light"/>
+          <w:sz w:val="24"/>
+          <w:szCs w:val="24"/>
+          <w:lang w:val="hu-HU"/>
+        </w:rPr>
+        <w:t>invincibility</w:t>
+      </w:r>
+      <w:proofErr w:type="spellEnd"/>
+      <w:r>
+        <w:rPr>
+          <w:rFonts w:ascii="Avenir Next LT Pro Light" w:hAnsi="Avenir Next LT Pro Light"/>
+          <w:sz w:val="24"/>
+          <w:szCs w:val="24"/>
+          <w:lang w:val="hu-HU"/>
+        </w:rPr>
+        <w:t xml:space="preserve">: </w:t>
+      </w:r>
+      <w:proofErr w:type="spellStart"/>
+      <w:r>
+        <w:rPr>
+          <w:rFonts w:ascii="Avenir Next LT Pro Light" w:hAnsi="Avenir Next LT Pro Light"/>
+          <w:sz w:val="24"/>
+          <w:szCs w:val="24"/>
+          <w:lang w:val="hu-HU"/>
+        </w:rPr>
+        <w:t>Slide</w:t>
+      </w:r>
+      <w:proofErr w:type="spellEnd"/>
+      <w:r>
+        <w:rPr>
+          <w:rFonts w:ascii="Avenir Next LT Pro Light" w:hAnsi="Avenir Next LT Pro Light"/>
+          <w:sz w:val="24"/>
+          <w:szCs w:val="24"/>
+          <w:lang w:val="hu-HU"/>
+        </w:rPr>
+        <w:t xml:space="preserve"> közben a játékos sérthetetlen.</w:t>
       </w:r>
     </w:p>
     <w:p>
@@ -1504,7 +2294,47 @@
           <w:szCs w:val="24"/>
           <w:lang w:val="hu-HU"/>
         </w:rPr>
-        <w:t>• Íj lövés + projectile collision.</w:t>
+        <w:t xml:space="preserve">• Íj lövés + </w:t>
+      </w:r>
+      <w:proofErr w:type="spellStart"/>
+      <w:r>
+        <w:rPr>
+          <w:rFonts w:ascii="Avenir Next LT Pro Light" w:hAnsi="Avenir Next LT Pro Light"/>
+          <w:sz w:val="24"/>
+          <w:szCs w:val="24"/>
+          <w:lang w:val="hu-HU"/>
+        </w:rPr>
+        <w:t>projectile</w:t>
+      </w:r>
+      <w:proofErr w:type="spellEnd"/>
+      <w:r>
+        <w:rPr>
+          <w:rFonts w:ascii="Avenir Next LT Pro Light" w:hAnsi="Avenir Next LT Pro Light"/>
+          <w:sz w:val="24"/>
+          <w:szCs w:val="24"/>
+          <w:lang w:val="hu-HU"/>
+        </w:rPr>
+        <w:t xml:space="preserve"> </w:t>
+      </w:r>
+      <w:proofErr w:type="spellStart"/>
+      <w:r>
+        <w:rPr>
+          <w:rFonts w:ascii="Avenir Next LT Pro Light" w:hAnsi="Avenir Next LT Pro Light"/>
+          <w:sz w:val="24"/>
+          <w:szCs w:val="24"/>
+          <w:lang w:val="hu-HU"/>
+        </w:rPr>
+        <w:t>collision</w:t>
+      </w:r>
+      <w:proofErr w:type="spellEnd"/>
+      <w:r>
+        <w:rPr>
+          <w:rFonts w:ascii="Avenir Next LT Pro Light" w:hAnsi="Avenir Next LT Pro Light"/>
+          <w:sz w:val="24"/>
+          <w:szCs w:val="24"/>
+          <w:lang w:val="hu-HU"/>
+        </w:rPr>
+        <w:t>.</w:t>
       </w:r>
     </w:p>
     <w:p>
@@ -1524,7 +2354,87 @@
           <w:szCs w:val="24"/>
           <w:lang w:val="hu-HU"/>
         </w:rPr>
-        <w:t>• Skill tree: potion mennyiség/heal növelés, sebzés növelés, HP növelés.</w:t>
+        <w:t xml:space="preserve">• </w:t>
+      </w:r>
+      <w:proofErr w:type="spellStart"/>
+      <w:r>
+        <w:rPr>
+          <w:rFonts w:ascii="Avenir Next LT Pro Light" w:hAnsi="Avenir Next LT Pro Light"/>
+          <w:sz w:val="24"/>
+          <w:szCs w:val="24"/>
+          <w:lang w:val="hu-HU"/>
+        </w:rPr>
+        <w:t>Skill</w:t>
+      </w:r>
+      <w:proofErr w:type="spellEnd"/>
+      <w:r>
+        <w:rPr>
+          <w:rFonts w:ascii="Avenir Next LT Pro Light" w:hAnsi="Avenir Next LT Pro Light"/>
+          <w:sz w:val="24"/>
+          <w:szCs w:val="24"/>
+          <w:lang w:val="hu-HU"/>
+        </w:rPr>
+        <w:t xml:space="preserve"> </w:t>
+      </w:r>
+      <w:proofErr w:type="spellStart"/>
+      <w:r>
+        <w:rPr>
+          <w:rFonts w:ascii="Avenir Next LT Pro Light" w:hAnsi="Avenir Next LT Pro Light"/>
+          <w:sz w:val="24"/>
+          <w:szCs w:val="24"/>
+          <w:lang w:val="hu-HU"/>
+        </w:rPr>
+        <w:t>tree</w:t>
+      </w:r>
+      <w:proofErr w:type="spellEnd"/>
+      <w:r>
+        <w:rPr>
+          <w:rFonts w:ascii="Avenir Next LT Pro Light" w:hAnsi="Avenir Next LT Pro Light"/>
+          <w:sz w:val="24"/>
+          <w:szCs w:val="24"/>
+          <w:lang w:val="hu-HU"/>
+        </w:rPr>
+        <w:t xml:space="preserve">: </w:t>
+      </w:r>
+      <w:proofErr w:type="spellStart"/>
+      <w:r>
+        <w:rPr>
+          <w:rFonts w:ascii="Avenir Next LT Pro Light" w:hAnsi="Avenir Next LT Pro Light"/>
+          <w:sz w:val="24"/>
+          <w:szCs w:val="24"/>
+          <w:lang w:val="hu-HU"/>
+        </w:rPr>
+        <w:t>potion</w:t>
+      </w:r>
+      <w:proofErr w:type="spellEnd"/>
+      <w:r>
+        <w:rPr>
+          <w:rFonts w:ascii="Avenir Next LT Pro Light" w:hAnsi="Avenir Next LT Pro Light"/>
+          <w:sz w:val="24"/>
+          <w:szCs w:val="24"/>
+          <w:lang w:val="hu-HU"/>
+        </w:rPr>
+        <w:t xml:space="preserve"> mennyiség/</w:t>
+      </w:r>
+      <w:proofErr w:type="spellStart"/>
+      <w:r>
+        <w:rPr>
+          <w:rFonts w:ascii="Avenir Next LT Pro Light" w:hAnsi="Avenir Next LT Pro Light"/>
+          <w:sz w:val="24"/>
+          <w:szCs w:val="24"/>
+          <w:lang w:val="hu-HU"/>
+        </w:rPr>
+        <w:t>heal</w:t>
+      </w:r>
+      <w:proofErr w:type="spellEnd"/>
+      <w:r>
+        <w:rPr>
+          <w:rFonts w:ascii="Avenir Next LT Pro Light" w:hAnsi="Avenir Next LT Pro Light"/>
+          <w:sz w:val="24"/>
+          <w:szCs w:val="24"/>
+          <w:lang w:val="hu-HU"/>
+        </w:rPr>
+        <w:t xml:space="preserve"> növelés, sebzés növelés, HP növelés.</w:t>
       </w:r>
     </w:p>
     <w:p>
@@ -1544,7 +2454,47 @@
           <w:szCs w:val="24"/>
           <w:lang w:val="hu-HU"/>
         </w:rPr>
-        <w:t>• Checkpoint/mentés: pozíció, HP, XP, skill adatok.</w:t>
+        <w:t xml:space="preserve">• </w:t>
+      </w:r>
+      <w:proofErr w:type="spellStart"/>
+      <w:r>
+        <w:rPr>
+          <w:rFonts w:ascii="Avenir Next LT Pro Light" w:hAnsi="Avenir Next LT Pro Light"/>
+          <w:sz w:val="24"/>
+          <w:szCs w:val="24"/>
+          <w:lang w:val="hu-HU"/>
+        </w:rPr>
+        <w:t>Checkpoint</w:t>
+      </w:r>
+      <w:proofErr w:type="spellEnd"/>
+      <w:r>
+        <w:rPr>
+          <w:rFonts w:ascii="Avenir Next LT Pro Light" w:hAnsi="Avenir Next LT Pro Light"/>
+          <w:sz w:val="24"/>
+          <w:szCs w:val="24"/>
+          <w:lang w:val="hu-HU"/>
+        </w:rPr>
+        <w:t xml:space="preserve">/mentés: pozíció, HP, XP, </w:t>
+      </w:r>
+      <w:proofErr w:type="spellStart"/>
+      <w:r>
+        <w:rPr>
+          <w:rFonts w:ascii="Avenir Next LT Pro Light" w:hAnsi="Avenir Next LT Pro Light"/>
+          <w:sz w:val="24"/>
+          <w:szCs w:val="24"/>
+          <w:lang w:val="hu-HU"/>
+        </w:rPr>
+        <w:t>skill</w:t>
+      </w:r>
+      <w:proofErr w:type="spellEnd"/>
+      <w:r>
+        <w:rPr>
+          <w:rFonts w:ascii="Avenir Next LT Pro Light" w:hAnsi="Avenir Next LT Pro Light"/>
+          <w:sz w:val="24"/>
+          <w:szCs w:val="24"/>
+          <w:lang w:val="hu-HU"/>
+        </w:rPr>
+        <w:t xml:space="preserve"> adatok.</w:t>
       </w:r>
     </w:p>
     <w:p>
@@ -1694,6 +2644,7 @@
                 <w:lang w:val="hu-HU"/>
               </w:rPr>
             </w:pPr>
+            <w:proofErr w:type="spellStart"/>
             <w:r>
               <w:rPr>
                 <w:rFonts w:ascii="Avenir Next LT Pro Light" w:hAnsi="Avenir Next LT Pro Light"/>
@@ -1701,7 +2652,17 @@
                 <w:szCs w:val="24"/>
                 <w:lang w:val="hu-HU"/>
               </w:rPr>
-              <w:t>Dark Wood</w:t>
+              <w:t>Dark</w:t>
+            </w:r>
+            <w:proofErr w:type="spellEnd"/>
+            <w:r>
+              <w:rPr>
+                <w:rFonts w:ascii="Avenir Next LT Pro Light" w:hAnsi="Avenir Next LT Pro Light"/>
+                <w:sz w:val="24"/>
+                <w:szCs w:val="24"/>
+                <w:lang w:val="hu-HU"/>
+              </w:rPr>
+              <w:t xml:space="preserve"> Wood</w:t>
             </w:r>
           </w:p>
         </w:tc>
@@ -1749,7 +2710,27 @@
                 <w:szCs w:val="24"/>
                 <w:lang w:val="hu-HU"/>
               </w:rPr>
-              <w:t>Gyenge enemy-k, kevés platform kihívás</w:t>
+              <w:t xml:space="preserve">Gyenge </w:t>
+            </w:r>
+            <w:proofErr w:type="spellStart"/>
+            <w:r>
+              <w:rPr>
+                <w:rFonts w:ascii="Avenir Next LT Pro Light" w:hAnsi="Avenir Next LT Pro Light"/>
+                <w:sz w:val="24"/>
+                <w:szCs w:val="24"/>
+                <w:lang w:val="hu-HU"/>
+              </w:rPr>
+              <w:t>enemy</w:t>
+            </w:r>
+            <w:proofErr w:type="spellEnd"/>
+            <w:r>
+              <w:rPr>
+                <w:rFonts w:ascii="Avenir Next LT Pro Light" w:hAnsi="Avenir Next LT Pro Light"/>
+                <w:sz w:val="24"/>
+                <w:szCs w:val="24"/>
+                <w:lang w:val="hu-HU"/>
+              </w:rPr>
+              <w:t>-k, kevés platform kihívás</w:t>
             </w:r>
           </w:p>
         </w:tc>
@@ -1823,7 +2804,27 @@
                 <w:szCs w:val="24"/>
                 <w:lang w:val="hu-HU"/>
               </w:rPr>
-              <w:t>Láncos enemy-k, kulcsos ajtók</w:t>
+              <w:t xml:space="preserve">Láncos </w:t>
+            </w:r>
+            <w:proofErr w:type="spellStart"/>
+            <w:r>
+              <w:rPr>
+                <w:rFonts w:ascii="Avenir Next LT Pro Light" w:hAnsi="Avenir Next LT Pro Light"/>
+                <w:sz w:val="24"/>
+                <w:szCs w:val="24"/>
+                <w:lang w:val="hu-HU"/>
+              </w:rPr>
+              <w:t>enemy</w:t>
+            </w:r>
+            <w:proofErr w:type="spellEnd"/>
+            <w:r>
+              <w:rPr>
+                <w:rFonts w:ascii="Avenir Next LT Pro Light" w:hAnsi="Avenir Next LT Pro Light"/>
+                <w:sz w:val="24"/>
+                <w:szCs w:val="24"/>
+                <w:lang w:val="hu-HU"/>
+              </w:rPr>
+              <w:t>-k, kulcsos ajtók</w:t>
             </w:r>
           </w:p>
         </w:tc>
@@ -1947,7 +2948,27 @@
                 <w:szCs w:val="24"/>
                 <w:lang w:val="hu-HU"/>
               </w:rPr>
-              <w:t>Erősebb enemy-k</w:t>
+              <w:t xml:space="preserve">Erősebb </w:t>
+            </w:r>
+            <w:proofErr w:type="spellStart"/>
+            <w:r>
+              <w:rPr>
+                <w:rFonts w:ascii="Avenir Next LT Pro Light" w:hAnsi="Avenir Next LT Pro Light"/>
+                <w:sz w:val="24"/>
+                <w:szCs w:val="24"/>
+                <w:lang w:val="hu-HU"/>
+              </w:rPr>
+              <w:t>enemy</w:t>
+            </w:r>
+            <w:proofErr w:type="spellEnd"/>
+            <w:r>
+              <w:rPr>
+                <w:rFonts w:ascii="Avenir Next LT Pro Light" w:hAnsi="Avenir Next LT Pro Light"/>
+                <w:sz w:val="24"/>
+                <w:szCs w:val="24"/>
+                <w:lang w:val="hu-HU"/>
+              </w:rPr>
+              <w:t>-k</w:t>
             </w:r>
           </w:p>
         </w:tc>
@@ -2014,6 +3035,7 @@
                 <w:lang w:val="hu-HU"/>
               </w:rPr>
             </w:pPr>
+            <w:proofErr w:type="spellStart"/>
             <w:r>
               <w:rPr>
                 <w:rFonts w:ascii="Avenir Next LT Pro Light" w:hAnsi="Avenir Next LT Pro Light"/>
@@ -2021,7 +3043,17 @@
                 <w:szCs w:val="24"/>
                 <w:lang w:val="hu-HU"/>
               </w:rPr>
-              <w:t>Főboss helyszín</w:t>
+              <w:t>Főboss</w:t>
+            </w:r>
+            <w:proofErr w:type="spellEnd"/>
+            <w:r>
+              <w:rPr>
+                <w:rFonts w:ascii="Avenir Next LT Pro Light" w:hAnsi="Avenir Next LT Pro Light"/>
+                <w:sz w:val="24"/>
+                <w:szCs w:val="24"/>
+                <w:lang w:val="hu-HU"/>
+              </w:rPr>
+              <w:t xml:space="preserve"> helyszín</w:t>
             </w:r>
           </w:p>
         </w:tc>
@@ -2038,6 +3070,7 @@
                 <w:lang w:val="hu-HU"/>
               </w:rPr>
             </w:pPr>
+            <w:proofErr w:type="spellStart"/>
             <w:r>
               <w:rPr>
                 <w:rFonts w:ascii="Avenir Next LT Pro Light" w:hAnsi="Avenir Next LT Pro Light"/>
@@ -2045,8 +3078,49 @@
                 <w:szCs w:val="24"/>
                 <w:lang w:val="hu-HU"/>
               </w:rPr>
-              <w:t>Boss arena, cutscene</w:t>
+              <w:t>Boss</w:t>
             </w:r>
+            <w:proofErr w:type="spellEnd"/>
+            <w:r>
+              <w:rPr>
+                <w:rFonts w:ascii="Avenir Next LT Pro Light" w:hAnsi="Avenir Next LT Pro Light"/>
+                <w:sz w:val="24"/>
+                <w:szCs w:val="24"/>
+                <w:lang w:val="hu-HU"/>
+              </w:rPr>
+              <w:t xml:space="preserve"> </w:t>
+            </w:r>
+            <w:proofErr w:type="spellStart"/>
+            <w:r>
+              <w:rPr>
+                <w:rFonts w:ascii="Avenir Next LT Pro Light" w:hAnsi="Avenir Next LT Pro Light"/>
+                <w:sz w:val="24"/>
+                <w:szCs w:val="24"/>
+                <w:lang w:val="hu-HU"/>
+              </w:rPr>
+              <w:t>arena</w:t>
+            </w:r>
+            <w:proofErr w:type="spellEnd"/>
+            <w:r>
+              <w:rPr>
+                <w:rFonts w:ascii="Avenir Next LT Pro Light" w:hAnsi="Avenir Next LT Pro Light"/>
+                <w:sz w:val="24"/>
+                <w:szCs w:val="24"/>
+                <w:lang w:val="hu-HU"/>
+              </w:rPr>
+              <w:t xml:space="preserve">, </w:t>
+            </w:r>
+            <w:proofErr w:type="spellStart"/>
+            <w:r>
+              <w:rPr>
+                <w:rFonts w:ascii="Avenir Next LT Pro Light" w:hAnsi="Avenir Next LT Pro Light"/>
+                <w:sz w:val="24"/>
+                <w:szCs w:val="24"/>
+                <w:lang w:val="hu-HU"/>
+              </w:rPr>
+              <w:t>cutscene</w:t>
+            </w:r>
+            <w:proofErr w:type="spellEnd"/>
           </w:p>
         </w:tc>
       </w:tr>
@@ -2064,6 +3138,7 @@
                 <w:lang w:val="hu-HU"/>
               </w:rPr>
             </w:pPr>
+            <w:proofErr w:type="spellStart"/>
             <w:r>
               <w:rPr>
                 <w:rFonts w:ascii="Avenir Next LT Pro Light" w:hAnsi="Avenir Next LT Pro Light"/>
@@ -2071,7 +3146,17 @@
                 <w:szCs w:val="24"/>
                 <w:lang w:val="hu-HU"/>
               </w:rPr>
-              <w:t>Hub terület</w:t>
+              <w:t>Hub</w:t>
+            </w:r>
+            <w:proofErr w:type="spellEnd"/>
+            <w:r>
+              <w:rPr>
+                <w:rFonts w:ascii="Avenir Next LT Pro Light" w:hAnsi="Avenir Next LT Pro Light"/>
+                <w:sz w:val="24"/>
+                <w:szCs w:val="24"/>
+                <w:lang w:val="hu-HU"/>
+              </w:rPr>
+              <w:t xml:space="preserve"> terület</w:t>
             </w:r>
           </w:p>
         </w:tc>
@@ -2173,6 +3258,7 @@
           <w:lang w:val="hu-HU"/>
         </w:rPr>
       </w:pPr>
+      <w:proofErr w:type="spellStart"/>
       <w:r>
         <w:rPr>
           <w:rFonts w:ascii="Avenir Next LT Pro Light" w:hAnsi="Avenir Next LT Pro Light"/>
@@ -2180,7 +3266,17 @@
           <w:szCs w:val="24"/>
           <w:lang w:val="hu-HU"/>
         </w:rPr>
-        <w:t>slide közben nem sérthetetlen a karakter</w:t>
+        <w:t>slide</w:t>
+      </w:r>
+      <w:proofErr w:type="spellEnd"/>
+      <w:r>
+        <w:rPr>
+          <w:rFonts w:ascii="Avenir Next LT Pro Light" w:hAnsi="Avenir Next LT Pro Light"/>
+          <w:sz w:val="24"/>
+          <w:szCs w:val="24"/>
+          <w:lang w:val="hu-HU"/>
+        </w:rPr>
+        <w:t xml:space="preserve"> közben nem sérthetetlen a karakter</w:t>
       </w:r>
     </w:p>
     <w:p>
@@ -2201,8 +3297,19 @@
           <w:szCs w:val="24"/>
           <w:lang w:val="hu-HU"/>
         </w:rPr>
-        <w:t>ha mentésből betöltjük a játékot akkor a meghalt enemy</w:t>
+        <w:t xml:space="preserve">ha mentésből betöltjük a játékot akkor a meghalt </w:t>
       </w:r>
+      <w:proofErr w:type="spellStart"/>
+      <w:r>
+        <w:rPr>
+          <w:rFonts w:ascii="Avenir Next LT Pro Light" w:hAnsi="Avenir Next LT Pro Light"/>
+          <w:sz w:val="24"/>
+          <w:szCs w:val="24"/>
+          <w:lang w:val="hu-HU"/>
+        </w:rPr>
+        <w:t>enemy</w:t>
+      </w:r>
+      <w:proofErr w:type="spellEnd"/>
       <w:r>
         <w:rPr>
           <w:rFonts w:ascii="Avenir Next LT Pro Light" w:hAnsi="Avenir Next LT Pro Light"/>
@@ -2236,6 +3343,7 @@
           <w:lang w:val="hu-HU"/>
         </w:rPr>
       </w:pPr>
+      <w:proofErr w:type="spellStart"/>
       <w:r>
         <w:rPr>
           <w:rFonts w:ascii="Avenir Next LT Pro Light" w:hAnsi="Avenir Next LT Pro Light"/>
@@ -2243,23 +3351,9 @@
           <w:szCs w:val="24"/>
           <w:lang w:val="hu-HU"/>
         </w:rPr>
-        <w:t>ha elfogy a nyíl akkor is lejátszódik a lövés animáció</w:t>
+        <w:t>enemy</w:t>
       </w:r>
-    </w:p>
-    <w:p>
-      <w:pPr>
-        <w:pStyle w:val="Listaszerbekezds"/>
-        <w:numPr>
-          <w:ilvl w:val="0"/>
-          <w:numId w:val="14"/>
-        </w:numPr>
-        <w:rPr>
-          <w:rFonts w:ascii="Avenir Next LT Pro Light" w:hAnsi="Avenir Next LT Pro Light"/>
-          <w:sz w:val="24"/>
-          <w:szCs w:val="24"/>
-          <w:lang w:val="hu-HU"/>
-        </w:rPr>
-      </w:pPr>
+      <w:proofErr w:type="spellEnd"/>
       <w:r>
         <w:rPr>
           <w:rFonts w:ascii="Avenir Next LT Pro Light" w:hAnsi="Avenir Next LT Pro Light"/>
@@ -2267,7 +3361,7 @@
           <w:szCs w:val="24"/>
           <w:lang w:val="hu-HU"/>
         </w:rPr>
-        <w:t>enemy leesik a pálya széléről akkor semmisüljön meg egy idő után</w:t>
+        <w:t xml:space="preserve"> leesik a pálya széléről akkor semmisüljön meg egy idő után</w:t>
       </w:r>
     </w:p>
     <w:p>
@@ -2579,6 +3673,7 @@
                 <w:lang w:val="hu-HU"/>
               </w:rPr>
             </w:pPr>
+            <w:proofErr w:type="spellStart"/>
             <w:r>
               <w:rPr>
                 <w:rFonts w:ascii="Avenir Next LT Pro Light" w:hAnsi="Avenir Next LT Pro Light"/>
@@ -2586,7 +3681,17 @@
                 <w:szCs w:val="24"/>
                 <w:lang w:val="hu-HU"/>
               </w:rPr>
-              <w:t xml:space="preserve">Checkpoint </w:t>
+              <w:t>Checkpoint</w:t>
+            </w:r>
+            <w:proofErr w:type="spellEnd"/>
+            <w:r>
+              <w:rPr>
+                <w:rFonts w:ascii="Avenir Next LT Pro Light" w:hAnsi="Avenir Next LT Pro Light"/>
+                <w:sz w:val="24"/>
+                <w:szCs w:val="24"/>
+                <w:lang w:val="hu-HU"/>
+              </w:rPr>
+              <w:t xml:space="preserve"> </w:t>
             </w:r>
           </w:p>
         </w:tc>
@@ -3059,6 +4164,15 @@
                 <w:lang w:val="hu-HU"/>
               </w:rPr>
             </w:pPr>
+            <w:r>
+              <w:rPr>
+                <w:rFonts w:ascii="Segoe UI Emoji" w:hAnsi="Segoe UI Emoji" w:cs="Segoe UI Emoji"/>
+                <w:sz w:val="24"/>
+                <w:szCs w:val="24"/>
+                <w:lang w:val="hu-HU"/>
+              </w:rPr>
+              <w:t>✅</w:t>
+            </w:r>
           </w:p>
         </w:tc>
       </w:tr>
@@ -3102,6 +4216,7 @@
                 <w:lang w:val="hu-HU"/>
               </w:rPr>
             </w:pPr>
+            <w:proofErr w:type="spellStart"/>
             <w:r>
               <w:rPr>
                 <w:rFonts w:ascii="Avenir Next LT Pro Light" w:hAnsi="Avenir Next LT Pro Light"/>
@@ -3109,7 +4224,17 @@
                 <w:szCs w:val="24"/>
                 <w:lang w:val="hu-HU"/>
               </w:rPr>
-              <w:t>Tutorial szövegek</w:t>
+              <w:t>Tutorial</w:t>
+            </w:r>
+            <w:proofErr w:type="spellEnd"/>
+            <w:r>
+              <w:rPr>
+                <w:rFonts w:ascii="Avenir Next LT Pro Light" w:hAnsi="Avenir Next LT Pro Light"/>
+                <w:sz w:val="24"/>
+                <w:szCs w:val="24"/>
+                <w:lang w:val="hu-HU"/>
+              </w:rPr>
+              <w:t xml:space="preserve"> szövegek</w:t>
             </w:r>
           </w:p>
         </w:tc>
@@ -3243,6 +4368,15 @@
                 <w:lang w:val="hu-HU"/>
               </w:rPr>
             </w:pPr>
+            <w:r>
+              <w:rPr>
+                <w:rFonts w:ascii="Segoe UI Emoji" w:hAnsi="Segoe UI Emoji" w:cs="Segoe UI Emoji"/>
+                <w:sz w:val="24"/>
+                <w:szCs w:val="24"/>
+                <w:lang w:val="hu-HU"/>
+              </w:rPr>
+              <w:t>✅</w:t>
+            </w:r>
           </w:p>
         </w:tc>
       </w:tr>
@@ -3286,6 +4420,7 @@
                 <w:lang w:val="hu-HU"/>
               </w:rPr>
             </w:pPr>
+            <w:proofErr w:type="spellStart"/>
             <w:r>
               <w:rPr>
                 <w:rFonts w:ascii="Avenir Next LT Pro Light" w:hAnsi="Avenir Next LT Pro Light"/>
@@ -3293,7 +4428,129 @@
                 <w:szCs w:val="24"/>
                 <w:lang w:val="hu-HU"/>
               </w:rPr>
-              <w:t>Skill tree</w:t>
+              <w:t>Skill</w:t>
+            </w:r>
+            <w:proofErr w:type="spellEnd"/>
+            <w:r>
+              <w:rPr>
+                <w:rFonts w:ascii="Avenir Next LT Pro Light" w:hAnsi="Avenir Next LT Pro Light"/>
+                <w:sz w:val="24"/>
+                <w:szCs w:val="24"/>
+                <w:lang w:val="hu-HU"/>
+              </w:rPr>
+              <w:t xml:space="preserve"> </w:t>
+            </w:r>
+            <w:proofErr w:type="spellStart"/>
+            <w:r>
+              <w:rPr>
+                <w:rFonts w:ascii="Avenir Next LT Pro Light" w:hAnsi="Avenir Next LT Pro Light"/>
+                <w:sz w:val="24"/>
+                <w:szCs w:val="24"/>
+                <w:lang w:val="hu-HU"/>
+              </w:rPr>
+              <w:t>tree</w:t>
+            </w:r>
+            <w:proofErr w:type="spellEnd"/>
+          </w:p>
+        </w:tc>
+        <w:tc>
+          <w:tcPr>
+            <w:tcW w:w="1843" w:type="dxa"/>
+          </w:tcPr>
+          <w:p>
+            <w:pPr>
+              <w:rPr>
+                <w:rFonts w:ascii="Avenir Next LT Pro Light" w:hAnsi="Avenir Next LT Pro Light"/>
+                <w:sz w:val="24"/>
+                <w:szCs w:val="24"/>
+                <w:lang w:val="hu-HU"/>
+              </w:rPr>
+            </w:pPr>
+            <w:r>
+              <w:rPr>
+                <w:rFonts w:ascii="Avenir Next LT Pro Light" w:hAnsi="Avenir Next LT Pro Light"/>
+                <w:sz w:val="24"/>
+                <w:szCs w:val="24"/>
+                <w:lang w:val="hu-HU"/>
+              </w:rPr>
+              <w:t>4-5 nap</w:t>
+            </w:r>
+          </w:p>
+        </w:tc>
+        <w:tc>
+          <w:tcPr>
+            <w:tcW w:w="1707" w:type="dxa"/>
+          </w:tcPr>
+          <w:p>
+            <w:pPr>
+              <w:jc w:val="center"/>
+              <w:rPr>
+                <w:rFonts w:ascii="Avenir Next LT Pro Light" w:hAnsi="Avenir Next LT Pro Light"/>
+                <w:sz w:val="24"/>
+                <w:szCs w:val="24"/>
+                <w:lang w:val="hu-HU"/>
+              </w:rPr>
+            </w:pPr>
+            <w:r>
+              <w:rPr>
+                <w:rFonts w:ascii="Segoe UI Emoji" w:hAnsi="Segoe UI Emoji" w:cs="Segoe UI Emoji"/>
+                <w:sz w:val="24"/>
+                <w:szCs w:val="24"/>
+                <w:lang w:val="hu-HU"/>
+              </w:rPr>
+              <w:t>✅</w:t>
+            </w:r>
+          </w:p>
+        </w:tc>
+      </w:tr>
+      <w:tr>
+        <w:trPr>
+          <w:trHeight w:val="286"/>
+        </w:trPr>
+        <w:tc>
+          <w:tcPr>
+            <w:tcW w:w="888" w:type="dxa"/>
+          </w:tcPr>
+          <w:p>
+            <w:pPr>
+              <w:pStyle w:val="Listaszerbekezds"/>
+              <w:numPr>
+                <w:ilvl w:val="0"/>
+                <w:numId w:val="13"/>
+              </w:numPr>
+              <w:ind w:left="360"/>
+              <w:rPr>
+                <w:rFonts w:ascii="Avenir Next LT Pro Light" w:hAnsi="Avenir Next LT Pro Light"/>
+                <w:b/>
+                <w:bCs/>
+                <w:sz w:val="24"/>
+                <w:szCs w:val="24"/>
+                <w:lang w:val="hu-HU"/>
+              </w:rPr>
+            </w:pPr>
+          </w:p>
+        </w:tc>
+        <w:tc>
+          <w:tcPr>
+            <w:tcW w:w="4980" w:type="dxa"/>
+          </w:tcPr>
+          <w:p>
+            <w:pPr>
+              <w:rPr>
+                <w:rFonts w:ascii="Avenir Next LT Pro Light" w:hAnsi="Avenir Next LT Pro Light"/>
+                <w:sz w:val="24"/>
+                <w:szCs w:val="24"/>
+                <w:lang w:val="hu-HU"/>
+              </w:rPr>
+            </w:pPr>
+            <w:r>
+              <w:rPr>
+                <w:rFonts w:ascii="Avenir Next LT Pro Light" w:hAnsi="Avenir Next LT Pro Light"/>
+                <w:sz w:val="24"/>
+                <w:szCs w:val="24"/>
+                <w:lang w:val="hu-HU"/>
+              </w:rPr>
+              <w:t>Minimap</w:t>
             </w:r>
           </w:p>
         </w:tc>
@@ -3317,7 +4574,7 @@
                 <w:szCs w:val="24"/>
                 <w:lang w:val="hu-HU"/>
               </w:rPr>
-              <w:t>4-5 nap</w:t>
+              <w:t>2-3 nap</w:t>
             </w:r>
           </w:p>
         </w:tc>
@@ -3378,6 +4635,7 @@
                 <w:lang w:val="hu-HU"/>
               </w:rPr>
             </w:pPr>
+            <w:proofErr w:type="spellStart"/>
             <w:r>
               <w:rPr>
                 <w:rFonts w:ascii="Avenir Next LT Pro Light" w:hAnsi="Avenir Next LT Pro Light"/>
@@ -3385,7 +4643,17 @@
                 <w:szCs w:val="24"/>
                 <w:lang w:val="hu-HU"/>
               </w:rPr>
-              <w:t>Minimap</w:t>
+              <w:t>Enemy</w:t>
+            </w:r>
+            <w:proofErr w:type="spellEnd"/>
+            <w:r>
+              <w:rPr>
+                <w:rFonts w:ascii="Avenir Next LT Pro Light" w:hAnsi="Avenir Next LT Pro Light"/>
+                <w:sz w:val="24"/>
+                <w:szCs w:val="24"/>
+                <w:lang w:val="hu-HU"/>
+              </w:rPr>
+              <w:t xml:space="preserve"> AI fejlesztése</w:t>
             </w:r>
           </w:p>
         </w:tc>
@@ -3409,7 +4677,99 @@
                 <w:szCs w:val="24"/>
                 <w:lang w:val="hu-HU"/>
               </w:rPr>
-              <w:t>2-3 nap</w:t>
+              <w:t>3 nap</w:t>
+            </w:r>
+          </w:p>
+        </w:tc>
+        <w:tc>
+          <w:tcPr>
+            <w:tcW w:w="1707" w:type="dxa"/>
+          </w:tcPr>
+          <w:p>
+            <w:pPr>
+              <w:jc w:val="center"/>
+              <w:rPr>
+                <w:rFonts w:ascii="Avenir Next LT Pro Light" w:hAnsi="Avenir Next LT Pro Light"/>
+                <w:sz w:val="24"/>
+                <w:szCs w:val="24"/>
+                <w:lang w:val="hu-HU"/>
+              </w:rPr>
+            </w:pPr>
+          </w:p>
+        </w:tc>
+      </w:tr>
+      <w:tr>
+        <w:trPr>
+          <w:trHeight w:val="301"/>
+        </w:trPr>
+        <w:tc>
+          <w:tcPr>
+            <w:tcW w:w="888" w:type="dxa"/>
+          </w:tcPr>
+          <w:p>
+            <w:pPr>
+              <w:pStyle w:val="Listaszerbekezds"/>
+              <w:numPr>
+                <w:ilvl w:val="0"/>
+                <w:numId w:val="13"/>
+              </w:numPr>
+              <w:ind w:left="360"/>
+              <w:rPr>
+                <w:rFonts w:ascii="Avenir Next LT Pro Light" w:hAnsi="Avenir Next LT Pro Light"/>
+                <w:b/>
+                <w:bCs/>
+                <w:sz w:val="24"/>
+                <w:szCs w:val="24"/>
+                <w:lang w:val="hu-HU"/>
+              </w:rPr>
+            </w:pPr>
+          </w:p>
+        </w:tc>
+        <w:tc>
+          <w:tcPr>
+            <w:tcW w:w="4980" w:type="dxa"/>
+          </w:tcPr>
+          <w:p>
+            <w:pPr>
+              <w:rPr>
+                <w:rFonts w:ascii="Avenir Next LT Pro Light" w:hAnsi="Avenir Next LT Pro Light"/>
+                <w:sz w:val="24"/>
+                <w:szCs w:val="24"/>
+                <w:lang w:val="hu-HU"/>
+              </w:rPr>
+            </w:pPr>
+            <w:r>
+              <w:rPr>
+                <w:rFonts w:ascii="Avenir Next LT Pro Light" w:hAnsi="Avenir Next LT Pro Light"/>
+                <w:sz w:val="24"/>
+                <w:szCs w:val="24"/>
+                <w:lang w:val="hu-HU"/>
+              </w:rPr>
+              <w:t>Pályaépítés (Bánya, Kastély)</w:t>
+            </w:r>
+          </w:p>
+        </w:tc>
+        <w:tc>
+          <w:tcPr>
+            <w:tcW w:w="1843" w:type="dxa"/>
+          </w:tcPr>
+          <w:p>
+            <w:pPr>
+              <w:rPr>
+                <w:rFonts w:ascii="Avenir Next LT Pro Light" w:hAnsi="Avenir Next LT Pro Light"/>
+                <w:sz w:val="24"/>
+                <w:szCs w:val="24"/>
+                <w:lang w:val="hu-HU"/>
+              </w:rPr>
+            </w:pPr>
+            <w:r>
+              <w:rPr>
+                <w:rFonts w:ascii="Avenir Next LT Pro Light" w:hAnsi="Avenir Next LT Pro Light"/>
+                <w:sz w:val="24"/>
+                <w:szCs w:val="24"/>
+                <w:lang w:val="hu-HU"/>
+              </w:rPr>
+              <w:t>6 nap</w:t>
             </w:r>
           </w:p>
         </w:tc>
@@ -3470,6 +4830,7 @@
                 <w:lang w:val="hu-HU"/>
               </w:rPr>
             </w:pPr>
+            <w:proofErr w:type="spellStart"/>
             <w:r>
               <w:rPr>
                 <w:rFonts w:ascii="Avenir Next LT Pro Light" w:hAnsi="Avenir Next LT Pro Light"/>
@@ -3477,8 +4838,29 @@
                 <w:szCs w:val="24"/>
                 <w:lang w:val="hu-HU"/>
               </w:rPr>
-              <w:t>Enemy AI fejlesztése</w:t>
+              <w:t>Boss</w:t>
             </w:r>
+            <w:proofErr w:type="spellEnd"/>
+            <w:r>
+              <w:rPr>
+                <w:rFonts w:ascii="Avenir Next LT Pro Light" w:hAnsi="Avenir Next LT Pro Light"/>
+                <w:sz w:val="24"/>
+                <w:szCs w:val="24"/>
+                <w:lang w:val="hu-HU"/>
+              </w:rPr>
+              <w:t xml:space="preserve"> </w:t>
+            </w:r>
+            <w:proofErr w:type="spellStart"/>
+            <w:r>
+              <w:rPr>
+                <w:rFonts w:ascii="Avenir Next LT Pro Light" w:hAnsi="Avenir Next LT Pro Light"/>
+                <w:sz w:val="24"/>
+                <w:szCs w:val="24"/>
+                <w:lang w:val="hu-HU"/>
+              </w:rPr>
+              <w:t>fight</w:t>
+            </w:r>
+            <w:proofErr w:type="spellEnd"/>
           </w:p>
         </w:tc>
         <w:tc>
@@ -3501,99 +4883,7 @@
                 <w:szCs w:val="24"/>
                 <w:lang w:val="hu-HU"/>
               </w:rPr>
-              <w:t>3 nap</w:t>
-            </w:r>
-          </w:p>
-        </w:tc>
-        <w:tc>
-          <w:tcPr>
-            <w:tcW w:w="1707" w:type="dxa"/>
-          </w:tcPr>
-          <w:p>
-            <w:pPr>
-              <w:jc w:val="center"/>
-              <w:rPr>
-                <w:rFonts w:ascii="Avenir Next LT Pro Light" w:hAnsi="Avenir Next LT Pro Light"/>
-                <w:sz w:val="24"/>
-                <w:szCs w:val="24"/>
-                <w:lang w:val="hu-HU"/>
-              </w:rPr>
-            </w:pPr>
-          </w:p>
-        </w:tc>
-      </w:tr>
-      <w:tr>
-        <w:trPr>
-          <w:trHeight w:val="301"/>
-        </w:trPr>
-        <w:tc>
-          <w:tcPr>
-            <w:tcW w:w="888" w:type="dxa"/>
-          </w:tcPr>
-          <w:p>
-            <w:pPr>
-              <w:pStyle w:val="Listaszerbekezds"/>
-              <w:numPr>
-                <w:ilvl w:val="0"/>
-                <w:numId w:val="13"/>
-              </w:numPr>
-              <w:ind w:left="360"/>
-              <w:rPr>
-                <w:rFonts w:ascii="Avenir Next LT Pro Light" w:hAnsi="Avenir Next LT Pro Light"/>
-                <w:b/>
-                <w:bCs/>
-                <w:sz w:val="24"/>
-                <w:szCs w:val="24"/>
-                <w:lang w:val="hu-HU"/>
-              </w:rPr>
-            </w:pPr>
-          </w:p>
-        </w:tc>
-        <w:tc>
-          <w:tcPr>
-            <w:tcW w:w="4980" w:type="dxa"/>
-          </w:tcPr>
-          <w:p>
-            <w:pPr>
-              <w:rPr>
-                <w:rFonts w:ascii="Avenir Next LT Pro Light" w:hAnsi="Avenir Next LT Pro Light"/>
-                <w:sz w:val="24"/>
-                <w:szCs w:val="24"/>
-                <w:lang w:val="hu-HU"/>
-              </w:rPr>
-            </w:pPr>
-            <w:r>
-              <w:rPr>
-                <w:rFonts w:ascii="Avenir Next LT Pro Light" w:hAnsi="Avenir Next LT Pro Light"/>
-                <w:sz w:val="24"/>
-                <w:szCs w:val="24"/>
-                <w:lang w:val="hu-HU"/>
-              </w:rPr>
-              <w:t>Pályaépítés (Bánya, Kastély)</w:t>
-            </w:r>
-          </w:p>
-        </w:tc>
-        <w:tc>
-          <w:tcPr>
-            <w:tcW w:w="1843" w:type="dxa"/>
-          </w:tcPr>
-          <w:p>
-            <w:pPr>
-              <w:rPr>
-                <w:rFonts w:ascii="Avenir Next LT Pro Light" w:hAnsi="Avenir Next LT Pro Light"/>
-                <w:sz w:val="24"/>
-                <w:szCs w:val="24"/>
-                <w:lang w:val="hu-HU"/>
-              </w:rPr>
-            </w:pPr>
-            <w:r>
-              <w:rPr>
-                <w:rFonts w:ascii="Avenir Next LT Pro Light" w:hAnsi="Avenir Next LT Pro Light"/>
-                <w:sz w:val="24"/>
-                <w:szCs w:val="24"/>
-                <w:lang w:val="hu-HU"/>
-              </w:rPr>
-              <w:t>6 nap</w:t>
+              <w:t>5-7 nap</w:t>
             </w:r>
           </w:p>
         </w:tc>
@@ -3661,8 +4951,19 @@
                 <w:szCs w:val="24"/>
                 <w:lang w:val="hu-HU"/>
               </w:rPr>
-              <w:t>Boss fight</w:t>
+              <w:t xml:space="preserve">Opening </w:t>
             </w:r>
+            <w:proofErr w:type="spellStart"/>
+            <w:r>
+              <w:rPr>
+                <w:rFonts w:ascii="Avenir Next LT Pro Light" w:hAnsi="Avenir Next LT Pro Light"/>
+                <w:sz w:val="24"/>
+                <w:szCs w:val="24"/>
+                <w:lang w:val="hu-HU"/>
+              </w:rPr>
+              <w:t>cutscene</w:t>
+            </w:r>
+            <w:proofErr w:type="spellEnd"/>
           </w:p>
         </w:tc>
         <w:tc>
@@ -3685,7 +4986,7 @@
                 <w:szCs w:val="24"/>
                 <w:lang w:val="hu-HU"/>
               </w:rPr>
-              <w:t>5-7 nap</w:t>
+              <w:t>2-3 nap</w:t>
             </w:r>
           </w:p>
         </w:tc>
@@ -3753,7 +5054,7 @@
                 <w:szCs w:val="24"/>
                 <w:lang w:val="hu-HU"/>
               </w:rPr>
-              <w:t>Opening cutscene</w:t>
+              <w:t>Hang és zene</w:t>
             </w:r>
           </w:p>
         </w:tc>
@@ -3777,7 +5078,7 @@
                 <w:szCs w:val="24"/>
                 <w:lang w:val="hu-HU"/>
               </w:rPr>
-              <w:t>2-3 nap</w:t>
+              <w:t>3-4 nap</w:t>
             </w:r>
           </w:p>
         </w:tc>
@@ -3838,6 +5139,7 @@
                 <w:lang w:val="hu-HU"/>
               </w:rPr>
             </w:pPr>
+            <w:proofErr w:type="spellStart"/>
             <w:r>
               <w:rPr>
                 <w:rFonts w:ascii="Avenir Next LT Pro Light" w:hAnsi="Avenir Next LT Pro Light"/>
@@ -3845,7 +5147,17 @@
                 <w:szCs w:val="24"/>
                 <w:lang w:val="hu-HU"/>
               </w:rPr>
-              <w:t>Hang és zene</w:t>
+              <w:t>Quest</w:t>
+            </w:r>
+            <w:proofErr w:type="spellEnd"/>
+            <w:r>
+              <w:rPr>
+                <w:rFonts w:ascii="Avenir Next LT Pro Light" w:hAnsi="Avenir Next LT Pro Light"/>
+                <w:sz w:val="24"/>
+                <w:szCs w:val="24"/>
+                <w:lang w:val="hu-HU"/>
+              </w:rPr>
+              <w:t xml:space="preserve"> UI</w:t>
             </w:r>
           </w:p>
         </w:tc>
@@ -3869,7 +5181,7 @@
                 <w:szCs w:val="24"/>
                 <w:lang w:val="hu-HU"/>
               </w:rPr>
-              <w:t>3-4 nap</w:t>
+              <w:t>2-3 nap</w:t>
             </w:r>
           </w:p>
         </w:tc>
@@ -3930,6 +5242,7 @@
                 <w:lang w:val="hu-HU"/>
               </w:rPr>
             </w:pPr>
+            <w:proofErr w:type="spellStart"/>
             <w:r>
               <w:rPr>
                 <w:rFonts w:ascii="Avenir Next LT Pro Light" w:hAnsi="Avenir Next LT Pro Light"/>
@@ -3937,23 +5250,9 @@
                 <w:szCs w:val="24"/>
                 <w:lang w:val="hu-HU"/>
               </w:rPr>
-              <w:t>Quest UI</w:t>
+              <w:t>Hub</w:t>
             </w:r>
-          </w:p>
-        </w:tc>
-        <w:tc>
-          <w:tcPr>
-            <w:tcW w:w="1843" w:type="dxa"/>
-          </w:tcPr>
-          <w:p>
-            <w:pPr>
-              <w:rPr>
-                <w:rFonts w:ascii="Avenir Next LT Pro Light" w:hAnsi="Avenir Next LT Pro Light"/>
-                <w:sz w:val="24"/>
-                <w:szCs w:val="24"/>
-                <w:lang w:val="hu-HU"/>
-              </w:rPr>
-            </w:pPr>
+            <w:proofErr w:type="spellEnd"/>
             <w:r>
               <w:rPr>
                 <w:rFonts w:ascii="Avenir Next LT Pro Light" w:hAnsi="Avenir Next LT Pro Light"/>
@@ -3961,75 +5260,7 @@
                 <w:szCs w:val="24"/>
                 <w:lang w:val="hu-HU"/>
               </w:rPr>
-              <w:t>2-3 nap</w:t>
-            </w:r>
-          </w:p>
-        </w:tc>
-        <w:tc>
-          <w:tcPr>
-            <w:tcW w:w="1707" w:type="dxa"/>
-          </w:tcPr>
-          <w:p>
-            <w:pPr>
-              <w:jc w:val="center"/>
-              <w:rPr>
-                <w:rFonts w:ascii="Avenir Next LT Pro Light" w:hAnsi="Avenir Next LT Pro Light"/>
-                <w:sz w:val="24"/>
-                <w:szCs w:val="24"/>
-                <w:lang w:val="hu-HU"/>
-              </w:rPr>
-            </w:pPr>
-          </w:p>
-        </w:tc>
-      </w:tr>
-      <w:tr>
-        <w:trPr>
-          <w:trHeight w:val="286"/>
-        </w:trPr>
-        <w:tc>
-          <w:tcPr>
-            <w:tcW w:w="888" w:type="dxa"/>
-          </w:tcPr>
-          <w:p>
-            <w:pPr>
-              <w:pStyle w:val="Listaszerbekezds"/>
-              <w:numPr>
-                <w:ilvl w:val="0"/>
-                <w:numId w:val="13"/>
-              </w:numPr>
-              <w:ind w:left="360"/>
-              <w:rPr>
-                <w:rFonts w:ascii="Avenir Next LT Pro Light" w:hAnsi="Avenir Next LT Pro Light"/>
-                <w:b/>
-                <w:bCs/>
-                <w:sz w:val="24"/>
-                <w:szCs w:val="24"/>
-                <w:lang w:val="hu-HU"/>
-              </w:rPr>
-            </w:pPr>
-          </w:p>
-        </w:tc>
-        <w:tc>
-          <w:tcPr>
-            <w:tcW w:w="4980" w:type="dxa"/>
-          </w:tcPr>
-          <w:p>
-            <w:pPr>
-              <w:rPr>
-                <w:rFonts w:ascii="Avenir Next LT Pro Light" w:hAnsi="Avenir Next LT Pro Light"/>
-                <w:sz w:val="24"/>
-                <w:szCs w:val="24"/>
-                <w:lang w:val="hu-HU"/>
-              </w:rPr>
-            </w:pPr>
-            <w:r>
-              <w:rPr>
-                <w:rFonts w:ascii="Avenir Next LT Pro Light" w:hAnsi="Avenir Next LT Pro Light"/>
-                <w:sz w:val="24"/>
-                <w:szCs w:val="24"/>
-                <w:lang w:val="hu-HU"/>
-              </w:rPr>
-              <w:t>Hub pálya + teleport rendszer</w:t>
+              <w:t xml:space="preserve"> pálya + teleport rendszer</w:t>
             </w:r>
           </w:p>
         </w:tc>

</xml_diff>